<commit_message>
Unify tutorial example block styling
</commit_message>
<xml_diff>
--- a/docs/Codex-Document-Standard-使用教程.docx
+++ b/docs/Codex-Document-Standard-使用教程.docx
@@ -820,14 +820,14 @@
         <w:tc>
           <w:tcPr>
             <w:tcW w:type="dxa" w:w="10080"/>
-            <w:shd w:fill="F5F7F9"/>
+            <w:shd w:fill="EEF5F8"/>
             <w:tcBorders>
-              <w:top w:val="single" w:sz="5" w:color="D5DEE5"/>
-              <w:left w:val="single" w:sz="5" w:color="D5DEE5"/>
-              <w:bottom w:val="single" w:sz="5" w:color="D5DEE5"/>
-              <w:right w:val="single" w:sz="5" w:color="D5DEE5"/>
-              <w:insideH w:val="single" w:sz="5" w:color="D5DEE5"/>
-              <w:insideV w:val="single" w:sz="5" w:color="D5DEE5"/>
+              <w:top w:val="single" w:sz="8" w:color="2F75B5"/>
+              <w:left w:val="single" w:sz="8" w:color="2F75B5"/>
+              <w:bottom w:val="single" w:sz="8" w:color="2F75B5"/>
+              <w:right w:val="single" w:sz="8" w:color="2F75B5"/>
+              <w:insideH w:val="single" w:sz="8" w:color="2F75B5"/>
+              <w:insideV w:val="single" w:sz="8" w:color="2F75B5"/>
             </w:tcBorders>
             <w:tcMar>
               <w:top w:w="100" w:type="dxa"/>
@@ -928,14 +928,14 @@
         <w:tc>
           <w:tcPr>
             <w:tcW w:type="dxa" w:w="10080"/>
-            <w:shd w:fill="F5F7F9"/>
+            <w:shd w:fill="EEF5F8"/>
             <w:tcBorders>
-              <w:top w:val="single" w:sz="5" w:color="D5DEE5"/>
-              <w:left w:val="single" w:sz="5" w:color="D5DEE5"/>
-              <w:bottom w:val="single" w:sz="5" w:color="D5DEE5"/>
-              <w:right w:val="single" w:sz="5" w:color="D5DEE5"/>
-              <w:insideH w:val="single" w:sz="5" w:color="D5DEE5"/>
-              <w:insideV w:val="single" w:sz="5" w:color="D5DEE5"/>
+              <w:top w:val="single" w:sz="8" w:color="2F75B5"/>
+              <w:left w:val="single" w:sz="8" w:color="2F75B5"/>
+              <w:bottom w:val="single" w:sz="8" w:color="2F75B5"/>
+              <w:right w:val="single" w:sz="8" w:color="2F75B5"/>
+              <w:insideH w:val="single" w:sz="8" w:color="2F75B5"/>
+              <w:insideV w:val="single" w:sz="8" w:color="2F75B5"/>
             </w:tcBorders>
             <w:tcMar>
               <w:top w:w="100" w:type="dxa"/>
@@ -1001,14 +1001,14 @@
         <w:tc>
           <w:tcPr>
             <w:tcW w:type="dxa" w:w="10080"/>
-            <w:shd w:fill="F5F7F9"/>
+            <w:shd w:fill="EEF5F8"/>
             <w:tcBorders>
-              <w:top w:val="single" w:sz="5" w:color="D5DEE5"/>
-              <w:left w:val="single" w:sz="5" w:color="D5DEE5"/>
-              <w:bottom w:val="single" w:sz="5" w:color="D5DEE5"/>
-              <w:right w:val="single" w:sz="5" w:color="D5DEE5"/>
-              <w:insideH w:val="single" w:sz="5" w:color="D5DEE5"/>
-              <w:insideV w:val="single" w:sz="5" w:color="D5DEE5"/>
+              <w:top w:val="single" w:sz="8" w:color="2F75B5"/>
+              <w:left w:val="single" w:sz="8" w:color="2F75B5"/>
+              <w:bottom w:val="single" w:sz="8" w:color="2F75B5"/>
+              <w:right w:val="single" w:sz="8" w:color="2F75B5"/>
+              <w:insideH w:val="single" w:sz="8" w:color="2F75B5"/>
+              <w:insideV w:val="single" w:sz="8" w:color="2F75B5"/>
             </w:tcBorders>
             <w:tcMar>
               <w:top w:w="100" w:type="dxa"/>
@@ -1172,14 +1172,14 @@
         <w:tc>
           <w:tcPr>
             <w:tcW w:type="dxa" w:w="10080"/>
-            <w:shd w:fill="F5F7F9"/>
+            <w:shd w:fill="EEF5F8"/>
             <w:tcBorders>
-              <w:top w:val="single" w:sz="5" w:color="D5DEE5"/>
-              <w:left w:val="single" w:sz="5" w:color="D5DEE5"/>
-              <w:bottom w:val="single" w:sz="5" w:color="D5DEE5"/>
-              <w:right w:val="single" w:sz="5" w:color="D5DEE5"/>
-              <w:insideH w:val="single" w:sz="5" w:color="D5DEE5"/>
-              <w:insideV w:val="single" w:sz="5" w:color="D5DEE5"/>
+              <w:top w:val="single" w:sz="8" w:color="2F75B5"/>
+              <w:left w:val="single" w:sz="8" w:color="2F75B5"/>
+              <w:bottom w:val="single" w:sz="8" w:color="2F75B5"/>
+              <w:right w:val="single" w:sz="8" w:color="2F75B5"/>
+              <w:insideH w:val="single" w:sz="8" w:color="2F75B5"/>
+              <w:insideV w:val="single" w:sz="8" w:color="2F75B5"/>
             </w:tcBorders>
             <w:tcMar>
               <w:top w:w="100" w:type="dxa"/>
@@ -1406,14 +1406,14 @@
         <w:tc>
           <w:tcPr>
             <w:tcW w:type="dxa" w:w="10080"/>
-            <w:shd w:fill="F5F7F9"/>
+            <w:shd w:fill="EEF5F8"/>
             <w:tcBorders>
-              <w:top w:val="single" w:sz="5" w:color="D5DEE5"/>
-              <w:left w:val="single" w:sz="5" w:color="D5DEE5"/>
-              <w:bottom w:val="single" w:sz="5" w:color="D5DEE5"/>
-              <w:right w:val="single" w:sz="5" w:color="D5DEE5"/>
-              <w:insideH w:val="single" w:sz="5" w:color="D5DEE5"/>
-              <w:insideV w:val="single" w:sz="5" w:color="D5DEE5"/>
+              <w:top w:val="single" w:sz="8" w:color="2F75B5"/>
+              <w:left w:val="single" w:sz="8" w:color="2F75B5"/>
+              <w:bottom w:val="single" w:sz="8" w:color="2F75B5"/>
+              <w:right w:val="single" w:sz="8" w:color="2F75B5"/>
+              <w:insideH w:val="single" w:sz="8" w:color="2F75B5"/>
+              <w:insideV w:val="single" w:sz="8" w:color="2F75B5"/>
             </w:tcBorders>
             <w:tcMar>
               <w:top w:w="100" w:type="dxa"/>
@@ -1481,14 +1481,14 @@
         <w:tc>
           <w:tcPr>
             <w:tcW w:type="dxa" w:w="10080"/>
-            <w:shd w:fill="F5F7F9"/>
+            <w:shd w:fill="EEF5F8"/>
             <w:tcBorders>
-              <w:top w:val="single" w:sz="5" w:color="D5DEE5"/>
-              <w:left w:val="single" w:sz="5" w:color="D5DEE5"/>
-              <w:bottom w:val="single" w:sz="5" w:color="D5DEE5"/>
-              <w:right w:val="single" w:sz="5" w:color="D5DEE5"/>
-              <w:insideH w:val="single" w:sz="5" w:color="D5DEE5"/>
-              <w:insideV w:val="single" w:sz="5" w:color="D5DEE5"/>
+              <w:top w:val="single" w:sz="8" w:color="2F75B5"/>
+              <w:left w:val="single" w:sz="8" w:color="2F75B5"/>
+              <w:bottom w:val="single" w:sz="8" w:color="2F75B5"/>
+              <w:right w:val="single" w:sz="8" w:color="2F75B5"/>
+              <w:insideH w:val="single" w:sz="8" w:color="2F75B5"/>
+              <w:insideV w:val="single" w:sz="8" w:color="2F75B5"/>
             </w:tcBorders>
             <w:tcMar>
               <w:top w:w="100" w:type="dxa"/>
@@ -2338,14 +2338,14 @@
         <w:tc>
           <w:tcPr>
             <w:tcW w:type="dxa" w:w="10080"/>
-            <w:shd w:fill="F5F7F9"/>
+            <w:shd w:fill="EEF5F8"/>
             <w:tcBorders>
-              <w:top w:val="single" w:sz="5" w:color="D5DEE5"/>
-              <w:left w:val="single" w:sz="5" w:color="D5DEE5"/>
-              <w:bottom w:val="single" w:sz="5" w:color="D5DEE5"/>
-              <w:right w:val="single" w:sz="5" w:color="D5DEE5"/>
-              <w:insideH w:val="single" w:sz="5" w:color="D5DEE5"/>
-              <w:insideV w:val="single" w:sz="5" w:color="D5DEE5"/>
+              <w:top w:val="single" w:sz="8" w:color="2F75B5"/>
+              <w:left w:val="single" w:sz="8" w:color="2F75B5"/>
+              <w:bottom w:val="single" w:sz="8" w:color="2F75B5"/>
+              <w:right w:val="single" w:sz="8" w:color="2F75B5"/>
+              <w:insideH w:val="single" w:sz="8" w:color="2F75B5"/>
+              <w:insideV w:val="single" w:sz="8" w:color="2F75B5"/>
             </w:tcBorders>
             <w:tcMar>
               <w:top w:w="100" w:type="dxa"/>
@@ -2399,14 +2399,14 @@
         <w:tc>
           <w:tcPr>
             <w:tcW w:type="dxa" w:w="10080"/>
-            <w:shd w:fill="F5F7F9"/>
+            <w:shd w:fill="EEF5F8"/>
             <w:tcBorders>
-              <w:top w:val="single" w:sz="5" w:color="D5DEE5"/>
-              <w:left w:val="single" w:sz="5" w:color="D5DEE5"/>
-              <w:bottom w:val="single" w:sz="5" w:color="D5DEE5"/>
-              <w:right w:val="single" w:sz="5" w:color="D5DEE5"/>
-              <w:insideH w:val="single" w:sz="5" w:color="D5DEE5"/>
-              <w:insideV w:val="single" w:sz="5" w:color="D5DEE5"/>
+              <w:top w:val="single" w:sz="8" w:color="2F75B5"/>
+              <w:left w:val="single" w:sz="8" w:color="2F75B5"/>
+              <w:bottom w:val="single" w:sz="8" w:color="2F75B5"/>
+              <w:right w:val="single" w:sz="8" w:color="2F75B5"/>
+              <w:insideH w:val="single" w:sz="8" w:color="2F75B5"/>
+              <w:insideV w:val="single" w:sz="8" w:color="2F75B5"/>
             </w:tcBorders>
             <w:tcMar>
               <w:top w:w="100" w:type="dxa"/>

</xml_diff>

<commit_message>
Remove tutorial block borders
</commit_message>
<xml_diff>
--- a/docs/Codex-Document-Standard-使用教程.docx
+++ b/docs/Codex-Document-Standard-使用教程.docx
@@ -63,14 +63,6 @@
           <w:tcPr>
             <w:tcW w:type="dxa" w:w="10080"/>
             <w:shd w:fill="EEF5F8"/>
-            <w:tcBorders>
-              <w:top w:val="single" w:sz="8" w:color="2F75B5"/>
-              <w:left w:val="single" w:sz="8" w:color="2F75B5"/>
-              <w:bottom w:val="single" w:sz="8" w:color="2F75B5"/>
-              <w:right w:val="single" w:sz="8" w:color="2F75B5"/>
-              <w:insideH w:val="single" w:sz="8" w:color="2F75B5"/>
-              <w:insideV w:val="single" w:sz="8" w:color="2F75B5"/>
-            </w:tcBorders>
             <w:tcMar>
               <w:top w:w="120" w:type="dxa"/>
               <w:start w:w="150" w:type="dxa"/>
@@ -821,14 +813,6 @@
           <w:tcPr>
             <w:tcW w:type="dxa" w:w="10080"/>
             <w:shd w:fill="EEF5F8"/>
-            <w:tcBorders>
-              <w:top w:val="single" w:sz="8" w:color="2F75B5"/>
-              <w:left w:val="single" w:sz="8" w:color="2F75B5"/>
-              <w:bottom w:val="single" w:sz="8" w:color="2F75B5"/>
-              <w:right w:val="single" w:sz="8" w:color="2F75B5"/>
-              <w:insideH w:val="single" w:sz="8" w:color="2F75B5"/>
-              <w:insideV w:val="single" w:sz="8" w:color="2F75B5"/>
-            </w:tcBorders>
             <w:tcMar>
               <w:top w:w="100" w:type="dxa"/>
               <w:start w:w="140" w:type="dxa"/>
@@ -929,14 +913,6 @@
           <w:tcPr>
             <w:tcW w:type="dxa" w:w="10080"/>
             <w:shd w:fill="EEF5F8"/>
-            <w:tcBorders>
-              <w:top w:val="single" w:sz="8" w:color="2F75B5"/>
-              <w:left w:val="single" w:sz="8" w:color="2F75B5"/>
-              <w:bottom w:val="single" w:sz="8" w:color="2F75B5"/>
-              <w:right w:val="single" w:sz="8" w:color="2F75B5"/>
-              <w:insideH w:val="single" w:sz="8" w:color="2F75B5"/>
-              <w:insideV w:val="single" w:sz="8" w:color="2F75B5"/>
-            </w:tcBorders>
             <w:tcMar>
               <w:top w:w="100" w:type="dxa"/>
               <w:start w:w="140" w:type="dxa"/>
@@ -1002,14 +978,6 @@
           <w:tcPr>
             <w:tcW w:type="dxa" w:w="10080"/>
             <w:shd w:fill="EEF5F8"/>
-            <w:tcBorders>
-              <w:top w:val="single" w:sz="8" w:color="2F75B5"/>
-              <w:left w:val="single" w:sz="8" w:color="2F75B5"/>
-              <w:bottom w:val="single" w:sz="8" w:color="2F75B5"/>
-              <w:right w:val="single" w:sz="8" w:color="2F75B5"/>
-              <w:insideH w:val="single" w:sz="8" w:color="2F75B5"/>
-              <w:insideV w:val="single" w:sz="8" w:color="2F75B5"/>
-            </w:tcBorders>
             <w:tcMar>
               <w:top w:w="100" w:type="dxa"/>
               <w:start w:w="140" w:type="dxa"/>
@@ -1173,14 +1141,6 @@
           <w:tcPr>
             <w:tcW w:type="dxa" w:w="10080"/>
             <w:shd w:fill="EEF5F8"/>
-            <w:tcBorders>
-              <w:top w:val="single" w:sz="8" w:color="2F75B5"/>
-              <w:left w:val="single" w:sz="8" w:color="2F75B5"/>
-              <w:bottom w:val="single" w:sz="8" w:color="2F75B5"/>
-              <w:right w:val="single" w:sz="8" w:color="2F75B5"/>
-              <w:insideH w:val="single" w:sz="8" w:color="2F75B5"/>
-              <w:insideV w:val="single" w:sz="8" w:color="2F75B5"/>
-            </w:tcBorders>
             <w:tcMar>
               <w:top w:w="100" w:type="dxa"/>
               <w:start w:w="140" w:type="dxa"/>
@@ -1314,14 +1274,6 @@
           <w:tcPr>
             <w:tcW w:type="dxa" w:w="10080"/>
             <w:shd w:fill="EEF5F8"/>
-            <w:tcBorders>
-              <w:top w:val="single" w:sz="8" w:color="2F75B5"/>
-              <w:left w:val="single" w:sz="8" w:color="2F75B5"/>
-              <w:bottom w:val="single" w:sz="8" w:color="2F75B5"/>
-              <w:right w:val="single" w:sz="8" w:color="2F75B5"/>
-              <w:insideH w:val="single" w:sz="8" w:color="2F75B5"/>
-              <w:insideV w:val="single" w:sz="8" w:color="2F75B5"/>
-            </w:tcBorders>
             <w:tcMar>
               <w:top w:w="120" w:type="dxa"/>
               <w:start w:w="150" w:type="dxa"/>
@@ -1407,14 +1359,6 @@
           <w:tcPr>
             <w:tcW w:type="dxa" w:w="10080"/>
             <w:shd w:fill="EEF5F8"/>
-            <w:tcBorders>
-              <w:top w:val="single" w:sz="8" w:color="2F75B5"/>
-              <w:left w:val="single" w:sz="8" w:color="2F75B5"/>
-              <w:bottom w:val="single" w:sz="8" w:color="2F75B5"/>
-              <w:right w:val="single" w:sz="8" w:color="2F75B5"/>
-              <w:insideH w:val="single" w:sz="8" w:color="2F75B5"/>
-              <w:insideV w:val="single" w:sz="8" w:color="2F75B5"/>
-            </w:tcBorders>
             <w:tcMar>
               <w:top w:w="100" w:type="dxa"/>
               <w:start w:w="140" w:type="dxa"/>
@@ -1482,14 +1426,6 @@
           <w:tcPr>
             <w:tcW w:type="dxa" w:w="10080"/>
             <w:shd w:fill="EEF5F8"/>
-            <w:tcBorders>
-              <w:top w:val="single" w:sz="8" w:color="2F75B5"/>
-              <w:left w:val="single" w:sz="8" w:color="2F75B5"/>
-              <w:bottom w:val="single" w:sz="8" w:color="2F75B5"/>
-              <w:right w:val="single" w:sz="8" w:color="2F75B5"/>
-              <w:insideH w:val="single" w:sz="8" w:color="2F75B5"/>
-              <w:insideV w:val="single" w:sz="8" w:color="2F75B5"/>
-            </w:tcBorders>
             <w:tcMar>
               <w:top w:w="100" w:type="dxa"/>
               <w:start w:w="140" w:type="dxa"/>
@@ -2339,14 +2275,6 @@
           <w:tcPr>
             <w:tcW w:type="dxa" w:w="10080"/>
             <w:shd w:fill="EEF5F8"/>
-            <w:tcBorders>
-              <w:top w:val="single" w:sz="8" w:color="2F75B5"/>
-              <w:left w:val="single" w:sz="8" w:color="2F75B5"/>
-              <w:bottom w:val="single" w:sz="8" w:color="2F75B5"/>
-              <w:right w:val="single" w:sz="8" w:color="2F75B5"/>
-              <w:insideH w:val="single" w:sz="8" w:color="2F75B5"/>
-              <w:insideV w:val="single" w:sz="8" w:color="2F75B5"/>
-            </w:tcBorders>
             <w:tcMar>
               <w:top w:w="100" w:type="dxa"/>
               <w:start w:w="140" w:type="dxa"/>
@@ -2400,14 +2328,6 @@
           <w:tcPr>
             <w:tcW w:type="dxa" w:w="10080"/>
             <w:shd w:fill="EEF5F8"/>
-            <w:tcBorders>
-              <w:top w:val="single" w:sz="8" w:color="2F75B5"/>
-              <w:left w:val="single" w:sz="8" w:color="2F75B5"/>
-              <w:bottom w:val="single" w:sz="8" w:color="2F75B5"/>
-              <w:right w:val="single" w:sz="8" w:color="2F75B5"/>
-              <w:insideH w:val="single" w:sz="8" w:color="2F75B5"/>
-              <w:insideV w:val="single" w:sz="8" w:color="2F75B5"/>
-            </w:tcBorders>
             <w:tcMar>
               <w:top w:w="100" w:type="dxa"/>
               <w:start w:w="140" w:type="dxa"/>

</xml_diff>

<commit_message>
Document public access and borderless notes
</commit_message>
<xml_diff>
--- a/docs/Codex-Document-Standard-使用教程.docx
+++ b/docs/Codex-Document-Standard-使用教程.docx
@@ -768,6 +768,128 @@
     </w:p>
     <w:p>
       <w:pPr>
+        <w:pStyle w:val="Heading2"/>
+        <w:keepNext/>
+      </w:pPr>
+      <w:r>
+        <w:t>2.1 获取仓库和教程</w:t>
+      </w:r>
+    </w:p>
+    <w:p>
+      <w:pPr>
+        <w:spacing w:line="288" w:lineRule="auto" w:before="40" w:after="80"/>
+      </w:pPr>
+      <w:r>
+        <w:rPr>
+          <w:rFonts w:ascii="Aptos" w:hAnsi="Aptos" w:eastAsia="Microsoft YaHei"/>
+          <w:b w:val="0"/>
+          <w:color w:val="000000"/>
+          <w:sz w:val="21"/>
+        </w:rPr>
+        <w:t>本仓库已公开发布。使用者无需登录 GitHub，可以直接查看仓库、下载 Word 教程或使用 Git 克隆。</w:t>
+      </w:r>
+    </w:p>
+    <w:p>
+      <w:pPr>
+        <w:spacing w:line="288" w:lineRule="auto" w:before="40" w:after="80"/>
+      </w:pPr>
+      <w:r>
+        <w:rPr>
+          <w:rFonts w:ascii="Aptos" w:hAnsi="Aptos" w:eastAsia="Microsoft YaHei"/>
+          <w:b/>
+          <w:color w:val="2F75B5"/>
+          <w:sz w:val="21"/>
+        </w:rPr>
+        <w:t>仓库主页：</w:t>
+      </w:r>
+      <w:hyperlink r:id="rId9">
+        <w:r>
+          <w:rPr>
+            <w:color w:val="2F75B5"/>
+            <w:u w:val="single"/>
+          </w:rPr>
+          <w:t>github.com/xiehao9991-cpu/codex-document-standard</w:t>
+        </w:r>
+      </w:hyperlink>
+    </w:p>
+    <w:p>
+      <w:pPr>
+        <w:spacing w:line="288" w:lineRule="auto" w:before="40" w:after="80"/>
+      </w:pPr>
+      <w:r>
+        <w:rPr>
+          <w:rFonts w:ascii="Aptos" w:hAnsi="Aptos" w:eastAsia="Microsoft YaHei"/>
+          <w:b/>
+          <w:color w:val="2F75B5"/>
+          <w:sz w:val="21"/>
+        </w:rPr>
+        <w:t>Word 使用教程：</w:t>
+      </w:r>
+      <w:hyperlink r:id="rId10">
+        <w:r>
+          <w:rPr>
+            <w:color w:val="2F75B5"/>
+            <w:u w:val="single"/>
+          </w:rPr>
+          <w:t>直接下载 DOCX</w:t>
+        </w:r>
+      </w:hyperlink>
+    </w:p>
+    <w:tbl>
+      <w:tblPr>
+        <w:tblW w:type="auto" w:w="0"/>
+        <w:jc w:val="center"/>
+        <w:tblLayout w:type="fixed"/>
+        <w:tblLook w:firstColumn="1" w:firstRow="1" w:lastColumn="0" w:lastRow="0" w:noHBand="0" w:noVBand="1" w:val="04A0"/>
+      </w:tblPr>
+      <w:tblGrid>
+        <w:gridCol w:w="10080"/>
+      </w:tblGrid>
+      <w:tr>
+        <w:tc>
+          <w:tcPr>
+            <w:tcW w:type="dxa" w:w="10080"/>
+            <w:shd w:fill="EEF5F8"/>
+            <w:tcMar>
+              <w:top w:w="120" w:type="dxa"/>
+              <w:start w:w="150" w:type="dxa"/>
+              <w:bottom w:w="120" w:type="dxa"/>
+              <w:end w:w="150" w:type="dxa"/>
+            </w:tcMar>
+          </w:tcPr>
+          <w:p>
+            <w:pPr>
+              <w:spacing w:line="276" w:lineRule="auto" w:before="40" w:after="40"/>
+            </w:pPr>
+            <w:r>
+              <w:rPr>
+                <w:rFonts w:ascii="Aptos" w:hAnsi="Aptos" w:eastAsia="Microsoft YaHei"/>
+                <w:b/>
+                <w:color w:val="2F75B5"/>
+                <w:sz w:val="20"/>
+              </w:rPr>
+              <w:t>分享方式：</w:t>
+            </w:r>
+            <w:r>
+              <w:rPr>
+                <w:rFonts w:ascii="Aptos" w:hAnsi="Aptos" w:eastAsia="Microsoft YaHei"/>
+                <w:b w:val="0"/>
+                <w:color w:val="000000"/>
+                <w:sz w:val="20"/>
+              </w:rPr>
+              <w:t>将仓库主页链接发给其他使用者即可。公开仓库不需要 GitHub 账号或额外权限。</w:t>
+            </w:r>
+          </w:p>
+        </w:tc>
+      </w:tr>
+    </w:tbl>
+    <w:p>
+      <w:pPr>
+        <w:spacing w:after="0"/>
+      </w:pPr>
+    </w:p>
+    <w:p>
+      <w:pPr>
         <w:pStyle w:val="Heading1"/>
         <w:keepNext/>
       </w:pPr>
@@ -931,19 +1053,7 @@
                 <w:color w:val="000000"/>
                 <w:sz w:val="18"/>
               </w:rPr>
-              <w:t>git clone https://github.com/xiehao9991-cpu/codex-document-standard.git \</w:t>
-            </w:r>
-            <w:r>
-              <w:br/>
-            </w:r>
-            <w:r>
-              <w:rPr>
-                <w:rFonts w:ascii="Consolas" w:hAnsi="Consolas" w:eastAsia="Microsoft YaHei"/>
-                <w:b w:val="0"/>
-                <w:color w:val="000000"/>
-                <w:sz w:val="18"/>
-              </w:rPr>
-              <w:t>+~/.codex/skills/codex-document-standard</w:t>
+              <w:t>git clone https://github.com/xiehao9991-cpu/codex-document-standard.git ~/.codex/skills/codex-document-standard</w:t>
             </w:r>
           </w:p>
         </w:tc>
@@ -1919,7 +2029,7 @@
                 <w:color w:val="000000"/>
                 <w:sz w:val="20"/>
               </w:rPr>
-              <w:t>#EEF5F8 背景  #2F75B5 边框  10 pt</w:t>
+              <w:t>#EEF5F8 背景  无外边框  10 pt</w:t>
             </w:r>
           </w:p>
         </w:tc>

</xml_diff>

<commit_message>
Refine table typography and spacing
</commit_message>
<xml_diff>
--- a/docs/Codex-Document-Standard-使用教程.docx
+++ b/docs/Codex-Document-Standard-使用教程.docx
@@ -154,10 +154,10 @@
               <w:insideV w:val="single" w:sz="6" w:color="B8C9D6"/>
             </w:tcBorders>
             <w:tcMar>
-              <w:top w:w="90" w:type="dxa"/>
-              <w:start w:w="110" w:type="dxa"/>
-              <w:bottom w:w="90" w:type="dxa"/>
-              <w:end w:w="110" w:type="dxa"/>
+              <w:top w:w="120" w:type="dxa"/>
+              <w:start w:w="180" w:type="dxa"/>
+              <w:bottom w:w="120" w:type="dxa"/>
+              <w:end w:w="180" w:type="dxa"/>
             </w:tcMar>
           </w:tcPr>
           <w:p>
@@ -170,7 +170,7 @@
                 <w:rFonts w:ascii="Aptos" w:hAnsi="Aptos" w:eastAsia="Microsoft YaHei"/>
                 <w:b/>
                 <w:color w:val="FFFFFF"/>
-                <w:sz w:val="20"/>
+                <w:sz w:val="19"/>
               </w:rPr>
               <w:t>适用</w:t>
             </w:r>
@@ -190,10 +190,10 @@
               <w:insideV w:val="single" w:sz="6" w:color="B8C9D6"/>
             </w:tcBorders>
             <w:tcMar>
-              <w:top w:w="90" w:type="dxa"/>
-              <w:start w:w="110" w:type="dxa"/>
-              <w:bottom w:w="90" w:type="dxa"/>
-              <w:end w:w="110" w:type="dxa"/>
+              <w:top w:w="120" w:type="dxa"/>
+              <w:start w:w="180" w:type="dxa"/>
+              <w:bottom w:w="120" w:type="dxa"/>
+              <w:end w:w="180" w:type="dxa"/>
             </w:tcMar>
           </w:tcPr>
           <w:p>
@@ -206,7 +206,7 @@
                 <w:rFonts w:ascii="Aptos" w:hAnsi="Aptos" w:eastAsia="Microsoft YaHei"/>
                 <w:b/>
                 <w:color w:val="FFFFFF"/>
-                <w:sz w:val="20"/>
+                <w:sz w:val="19"/>
               </w:rPr>
               <w:t>典型内容</w:t>
             </w:r>
@@ -226,10 +226,10 @@
               <w:insideV w:val="single" w:sz="6" w:color="B8C9D6"/>
             </w:tcBorders>
             <w:tcMar>
-              <w:top w:w="90" w:type="dxa"/>
-              <w:start w:w="110" w:type="dxa"/>
-              <w:bottom w:w="90" w:type="dxa"/>
-              <w:end w:w="110" w:type="dxa"/>
+              <w:top w:w="120" w:type="dxa"/>
+              <w:start w:w="180" w:type="dxa"/>
+              <w:bottom w:w="120" w:type="dxa"/>
+              <w:end w:w="180" w:type="dxa"/>
             </w:tcMar>
           </w:tcPr>
           <w:p>
@@ -242,7 +242,7 @@
                 <w:rFonts w:ascii="Aptos" w:hAnsi="Aptos" w:eastAsia="Microsoft YaHei"/>
                 <w:b/>
                 <w:color w:val="FFFFFF"/>
-                <w:sz w:val="20"/>
+                <w:sz w:val="19"/>
               </w:rPr>
               <w:t>默认行为</w:t>
             </w:r>
@@ -263,10 +263,10 @@
               <w:insideV w:val="single" w:sz="6" w:color="B8C9D6"/>
             </w:tcBorders>
             <w:tcMar>
-              <w:top w:w="90" w:type="dxa"/>
-              <w:start w:w="110" w:type="dxa"/>
-              <w:bottom w:w="90" w:type="dxa"/>
-              <w:end w:w="110" w:type="dxa"/>
+              <w:top w:w="120" w:type="dxa"/>
+              <w:start w:w="180" w:type="dxa"/>
+              <w:bottom w:w="120" w:type="dxa"/>
+              <w:end w:w="180" w:type="dxa"/>
             </w:tcMar>
           </w:tcPr>
           <w:p>
@@ -279,7 +279,7 @@
                 <w:rFonts w:ascii="Aptos" w:hAnsi="Aptos" w:eastAsia="Microsoft YaHei"/>
                 <w:b w:val="0"/>
                 <w:color w:val="000000"/>
-                <w:sz w:val="20"/>
+                <w:sz w:val="19"/>
               </w:rPr>
               <w:t>工作报告</w:t>
             </w:r>
@@ -298,10 +298,10 @@
               <w:insideV w:val="single" w:sz="6" w:color="B8C9D6"/>
             </w:tcBorders>
             <w:tcMar>
-              <w:top w:w="90" w:type="dxa"/>
-              <w:start w:w="110" w:type="dxa"/>
-              <w:bottom w:w="90" w:type="dxa"/>
-              <w:end w:w="110" w:type="dxa"/>
+              <w:top w:w="120" w:type="dxa"/>
+              <w:start w:w="180" w:type="dxa"/>
+              <w:bottom w:w="120" w:type="dxa"/>
+              <w:end w:w="180" w:type="dxa"/>
             </w:tcMar>
           </w:tcPr>
           <w:p>
@@ -314,7 +314,7 @@
                 <w:rFonts w:ascii="Aptos" w:hAnsi="Aptos" w:eastAsia="Microsoft YaHei"/>
                 <w:b w:val="0"/>
                 <w:color w:val="000000"/>
-                <w:sz w:val="20"/>
+                <w:sz w:val="19"/>
               </w:rPr>
               <w:t>周报  月报  季度复盘  项目总结</w:t>
             </w:r>
@@ -333,10 +333,10 @@
               <w:insideV w:val="single" w:sz="6" w:color="B8C9D6"/>
             </w:tcBorders>
             <w:tcMar>
-              <w:top w:w="90" w:type="dxa"/>
-              <w:start w:w="110" w:type="dxa"/>
-              <w:bottom w:w="90" w:type="dxa"/>
-              <w:end w:w="110" w:type="dxa"/>
+              <w:top w:w="120" w:type="dxa"/>
+              <w:start w:w="180" w:type="dxa"/>
+              <w:bottom w:w="120" w:type="dxa"/>
+              <w:end w:w="180" w:type="dxa"/>
             </w:tcMar>
           </w:tcPr>
           <w:p>
@@ -349,7 +349,7 @@
                 <w:rFonts w:ascii="Aptos" w:hAnsi="Aptos" w:eastAsia="Microsoft YaHei"/>
                 <w:b w:val="0"/>
                 <w:color w:val="000000"/>
-                <w:sz w:val="20"/>
+                <w:sz w:val="19"/>
               </w:rPr>
               <w:t>统一标题层级和正文排版</w:t>
             </w:r>
@@ -370,10 +370,10 @@
               <w:insideV w:val="single" w:sz="6" w:color="B8C9D6"/>
             </w:tcBorders>
             <w:tcMar>
-              <w:top w:w="90" w:type="dxa"/>
-              <w:start w:w="110" w:type="dxa"/>
-              <w:bottom w:w="90" w:type="dxa"/>
-              <w:end w:w="110" w:type="dxa"/>
+              <w:top w:w="120" w:type="dxa"/>
+              <w:start w:w="180" w:type="dxa"/>
+              <w:bottom w:w="120" w:type="dxa"/>
+              <w:end w:w="180" w:type="dxa"/>
             </w:tcMar>
           </w:tcPr>
           <w:p>
@@ -386,7 +386,7 @@
                 <w:rFonts w:ascii="Aptos" w:hAnsi="Aptos" w:eastAsia="Microsoft YaHei"/>
                 <w:b w:val="0"/>
                 <w:color w:val="000000"/>
-                <w:sz w:val="20"/>
+                <w:sz w:val="19"/>
               </w:rPr>
               <w:t>计划与方案</w:t>
             </w:r>
@@ -405,10 +405,10 @@
               <w:insideV w:val="single" w:sz="6" w:color="B8C9D6"/>
             </w:tcBorders>
             <w:tcMar>
-              <w:top w:w="90" w:type="dxa"/>
-              <w:start w:w="110" w:type="dxa"/>
-              <w:bottom w:w="90" w:type="dxa"/>
-              <w:end w:w="110" w:type="dxa"/>
+              <w:top w:w="120" w:type="dxa"/>
+              <w:start w:w="180" w:type="dxa"/>
+              <w:bottom w:w="120" w:type="dxa"/>
+              <w:end w:w="180" w:type="dxa"/>
             </w:tcMar>
           </w:tcPr>
           <w:p>
@@ -421,7 +421,7 @@
                 <w:rFonts w:ascii="Aptos" w:hAnsi="Aptos" w:eastAsia="Microsoft YaHei"/>
                 <w:b w:val="0"/>
                 <w:color w:val="000000"/>
-                <w:sz w:val="20"/>
+                <w:sz w:val="19"/>
               </w:rPr>
               <w:t>项目计划  执行方案  制度说明</w:t>
             </w:r>
@@ -440,10 +440,10 @@
               <w:insideV w:val="single" w:sz="6" w:color="B8C9D6"/>
             </w:tcBorders>
             <w:tcMar>
-              <w:top w:w="90" w:type="dxa"/>
-              <w:start w:w="110" w:type="dxa"/>
-              <w:bottom w:w="90" w:type="dxa"/>
-              <w:end w:w="110" w:type="dxa"/>
+              <w:top w:w="120" w:type="dxa"/>
+              <w:start w:w="180" w:type="dxa"/>
+              <w:bottom w:w="120" w:type="dxa"/>
+              <w:end w:w="180" w:type="dxa"/>
             </w:tcMar>
           </w:tcPr>
           <w:p>
@@ -456,7 +456,7 @@
                 <w:rFonts w:ascii="Aptos" w:hAnsi="Aptos" w:eastAsia="Microsoft YaHei"/>
                 <w:b w:val="0"/>
                 <w:color w:val="000000"/>
-                <w:sz w:val="20"/>
+                <w:sz w:val="19"/>
               </w:rPr>
               <w:t>突出结论  范围  风险和动作</w:t>
             </w:r>
@@ -477,10 +477,10 @@
               <w:insideV w:val="single" w:sz="6" w:color="B8C9D6"/>
             </w:tcBorders>
             <w:tcMar>
-              <w:top w:w="90" w:type="dxa"/>
-              <w:start w:w="110" w:type="dxa"/>
-              <w:bottom w:w="90" w:type="dxa"/>
-              <w:end w:w="110" w:type="dxa"/>
+              <w:top w:w="120" w:type="dxa"/>
+              <w:start w:w="180" w:type="dxa"/>
+              <w:bottom w:w="120" w:type="dxa"/>
+              <w:end w:w="180" w:type="dxa"/>
             </w:tcMar>
           </w:tcPr>
           <w:p>
@@ -493,7 +493,7 @@
                 <w:rFonts w:ascii="Aptos" w:hAnsi="Aptos" w:eastAsia="Microsoft YaHei"/>
                 <w:b w:val="0"/>
                 <w:color w:val="000000"/>
-                <w:sz w:val="20"/>
+                <w:sz w:val="19"/>
               </w:rPr>
               <w:t>会议文档</w:t>
             </w:r>
@@ -512,10 +512,10 @@
               <w:insideV w:val="single" w:sz="6" w:color="B8C9D6"/>
             </w:tcBorders>
             <w:tcMar>
-              <w:top w:w="90" w:type="dxa"/>
-              <w:start w:w="110" w:type="dxa"/>
-              <w:bottom w:w="90" w:type="dxa"/>
-              <w:end w:w="110" w:type="dxa"/>
+              <w:top w:w="120" w:type="dxa"/>
+              <w:start w:w="180" w:type="dxa"/>
+              <w:bottom w:w="120" w:type="dxa"/>
+              <w:end w:w="180" w:type="dxa"/>
             </w:tcMar>
           </w:tcPr>
           <w:p>
@@ -528,7 +528,7 @@
                 <w:rFonts w:ascii="Aptos" w:hAnsi="Aptos" w:eastAsia="Microsoft YaHei"/>
                 <w:b w:val="0"/>
                 <w:color w:val="000000"/>
-                <w:sz w:val="20"/>
+                <w:sz w:val="19"/>
               </w:rPr>
               <w:t>会议纪要  评审记录  跟进清单</w:t>
             </w:r>
@@ -547,10 +547,10 @@
               <w:insideV w:val="single" w:sz="6" w:color="B8C9D6"/>
             </w:tcBorders>
             <w:tcMar>
-              <w:top w:w="90" w:type="dxa"/>
-              <w:start w:w="110" w:type="dxa"/>
-              <w:bottom w:w="90" w:type="dxa"/>
-              <w:end w:w="110" w:type="dxa"/>
+              <w:top w:w="120" w:type="dxa"/>
+              <w:start w:w="180" w:type="dxa"/>
+              <w:bottom w:w="120" w:type="dxa"/>
+              <w:end w:w="180" w:type="dxa"/>
             </w:tcMar>
           </w:tcPr>
           <w:p>
@@ -563,7 +563,7 @@
                 <w:rFonts w:ascii="Aptos" w:hAnsi="Aptos" w:eastAsia="Microsoft YaHei"/>
                 <w:b w:val="0"/>
                 <w:color w:val="000000"/>
-                <w:sz w:val="20"/>
+                <w:sz w:val="19"/>
               </w:rPr>
               <w:t>统一表格  日期  状态和责任信息</w:t>
             </w:r>
@@ -584,10 +584,10 @@
               <w:insideV w:val="single" w:sz="6" w:color="B8C9D6"/>
             </w:tcBorders>
             <w:tcMar>
-              <w:top w:w="90" w:type="dxa"/>
-              <w:start w:w="110" w:type="dxa"/>
-              <w:bottom w:w="90" w:type="dxa"/>
-              <w:end w:w="110" w:type="dxa"/>
+              <w:top w:w="120" w:type="dxa"/>
+              <w:start w:w="180" w:type="dxa"/>
+              <w:bottom w:w="120" w:type="dxa"/>
+              <w:end w:w="180" w:type="dxa"/>
             </w:tcMar>
           </w:tcPr>
           <w:p>
@@ -600,7 +600,7 @@
                 <w:rFonts w:ascii="Aptos" w:hAnsi="Aptos" w:eastAsia="Microsoft YaHei"/>
                 <w:b w:val="0"/>
                 <w:color w:val="000000"/>
-                <w:sz w:val="20"/>
+                <w:sz w:val="19"/>
               </w:rPr>
               <w:t>钉钉文档</w:t>
             </w:r>
@@ -619,10 +619,10 @@
               <w:insideV w:val="single" w:sz="6" w:color="B8C9D6"/>
             </w:tcBorders>
             <w:tcMar>
-              <w:top w:w="90" w:type="dxa"/>
-              <w:start w:w="110" w:type="dxa"/>
-              <w:bottom w:w="90" w:type="dxa"/>
-              <w:end w:w="110" w:type="dxa"/>
+              <w:top w:w="120" w:type="dxa"/>
+              <w:start w:w="180" w:type="dxa"/>
+              <w:bottom w:w="120" w:type="dxa"/>
+              <w:end w:w="180" w:type="dxa"/>
             </w:tcMar>
           </w:tcPr>
           <w:p>
@@ -635,7 +635,7 @@
                 <w:rFonts w:ascii="Aptos" w:hAnsi="Aptos" w:eastAsia="Microsoft YaHei"/>
                 <w:b w:val="0"/>
                 <w:color w:val="000000"/>
-                <w:sz w:val="20"/>
+                <w:sz w:val="19"/>
               </w:rPr>
               <w:t>工作文档和文档表格</w:t>
             </w:r>
@@ -654,10 +654,10 @@
               <w:insideV w:val="single" w:sz="6" w:color="B8C9D6"/>
             </w:tcBorders>
             <w:tcMar>
-              <w:top w:w="90" w:type="dxa"/>
-              <w:start w:w="110" w:type="dxa"/>
-              <w:bottom w:w="90" w:type="dxa"/>
-              <w:end w:w="110" w:type="dxa"/>
+              <w:top w:w="120" w:type="dxa"/>
+              <w:start w:w="180" w:type="dxa"/>
+              <w:bottom w:w="120" w:type="dxa"/>
+              <w:end w:w="180" w:type="dxa"/>
             </w:tcMar>
           </w:tcPr>
           <w:p>
@@ -670,7 +670,7 @@
                 <w:rFonts w:ascii="Aptos" w:hAnsi="Aptos" w:eastAsia="Microsoft YaHei"/>
                 <w:b w:val="0"/>
                 <w:color w:val="000000"/>
-                <w:sz w:val="20"/>
+                <w:sz w:val="19"/>
               </w:rPr>
               <w:t>按平台能力应用同一视觉语言</w:t>
             </w:r>
@@ -1615,10 +1615,10 @@
               <w:insideV w:val="single" w:sz="6" w:color="B8C9D6"/>
             </w:tcBorders>
             <w:tcMar>
-              <w:top w:w="90" w:type="dxa"/>
-              <w:start w:w="110" w:type="dxa"/>
-              <w:bottom w:w="90" w:type="dxa"/>
-              <w:end w:w="110" w:type="dxa"/>
+              <w:top w:w="120" w:type="dxa"/>
+              <w:start w:w="180" w:type="dxa"/>
+              <w:bottom w:w="120" w:type="dxa"/>
+              <w:end w:w="180" w:type="dxa"/>
             </w:tcMar>
           </w:tcPr>
           <w:p>
@@ -1631,7 +1631,7 @@
                 <w:rFonts w:ascii="Aptos" w:hAnsi="Aptos" w:eastAsia="Microsoft YaHei"/>
                 <w:b/>
                 <w:color w:val="FFFFFF"/>
-                <w:sz w:val="20"/>
+                <w:sz w:val="19"/>
               </w:rPr>
               <w:t>项目</w:t>
             </w:r>
@@ -1651,10 +1651,10 @@
               <w:insideV w:val="single" w:sz="6" w:color="B8C9D6"/>
             </w:tcBorders>
             <w:tcMar>
-              <w:top w:w="90" w:type="dxa"/>
-              <w:start w:w="110" w:type="dxa"/>
-              <w:bottom w:w="90" w:type="dxa"/>
-              <w:end w:w="110" w:type="dxa"/>
+              <w:top w:w="120" w:type="dxa"/>
+              <w:start w:w="180" w:type="dxa"/>
+              <w:bottom w:w="120" w:type="dxa"/>
+              <w:end w:w="180" w:type="dxa"/>
             </w:tcMar>
           </w:tcPr>
           <w:p>
@@ -1667,7 +1667,7 @@
                 <w:rFonts w:ascii="Aptos" w:hAnsi="Aptos" w:eastAsia="Microsoft YaHei"/>
                 <w:b/>
                 <w:color w:val="FFFFFF"/>
-                <w:sz w:val="20"/>
+                <w:sz w:val="19"/>
               </w:rPr>
               <w:t>默认规范</w:t>
             </w:r>
@@ -1688,10 +1688,10 @@
               <w:insideV w:val="single" w:sz="6" w:color="B8C9D6"/>
             </w:tcBorders>
             <w:tcMar>
-              <w:top w:w="90" w:type="dxa"/>
-              <w:start w:w="110" w:type="dxa"/>
-              <w:bottom w:w="90" w:type="dxa"/>
-              <w:end w:w="110" w:type="dxa"/>
+              <w:top w:w="120" w:type="dxa"/>
+              <w:start w:w="180" w:type="dxa"/>
+              <w:bottom w:w="120" w:type="dxa"/>
+              <w:end w:w="180" w:type="dxa"/>
             </w:tcMar>
           </w:tcPr>
           <w:p>
@@ -1704,7 +1704,7 @@
                 <w:rFonts w:ascii="Aptos" w:hAnsi="Aptos" w:eastAsia="Microsoft YaHei"/>
                 <w:b w:val="0"/>
                 <w:color w:val="000000"/>
-                <w:sz w:val="20"/>
+                <w:sz w:val="19"/>
               </w:rPr>
               <w:t>视觉基调</w:t>
             </w:r>
@@ -1723,10 +1723,10 @@
               <w:insideV w:val="single" w:sz="6" w:color="B8C9D6"/>
             </w:tcBorders>
             <w:tcMar>
-              <w:top w:w="90" w:type="dxa"/>
-              <w:start w:w="110" w:type="dxa"/>
-              <w:bottom w:w="90" w:type="dxa"/>
-              <w:end w:w="110" w:type="dxa"/>
+              <w:top w:w="120" w:type="dxa"/>
+              <w:start w:w="180" w:type="dxa"/>
+              <w:bottom w:w="120" w:type="dxa"/>
+              <w:end w:w="180" w:type="dxa"/>
             </w:tcMar>
           </w:tcPr>
           <w:p>
@@ -1739,7 +1739,7 @@
                 <w:rFonts w:ascii="Aptos" w:hAnsi="Aptos" w:eastAsia="Microsoft YaHei"/>
                 <w:b w:val="0"/>
                 <w:color w:val="000000"/>
-                <w:sz w:val="20"/>
+                <w:sz w:val="19"/>
               </w:rPr>
               <w:t>专业  克制  清晰  白色页面背景</w:t>
             </w:r>
@@ -1760,10 +1760,10 @@
               <w:insideV w:val="single" w:sz="6" w:color="B8C9D6"/>
             </w:tcBorders>
             <w:tcMar>
-              <w:top w:w="90" w:type="dxa"/>
-              <w:start w:w="110" w:type="dxa"/>
-              <w:bottom w:w="90" w:type="dxa"/>
-              <w:end w:w="110" w:type="dxa"/>
+              <w:top w:w="120" w:type="dxa"/>
+              <w:start w:w="180" w:type="dxa"/>
+              <w:bottom w:w="120" w:type="dxa"/>
+              <w:end w:w="180" w:type="dxa"/>
             </w:tcMar>
           </w:tcPr>
           <w:p>
@@ -1776,7 +1776,7 @@
                 <w:rFonts w:ascii="Aptos" w:hAnsi="Aptos" w:eastAsia="Microsoft YaHei"/>
                 <w:b w:val="0"/>
                 <w:color w:val="000000"/>
-                <w:sz w:val="20"/>
+                <w:sz w:val="19"/>
               </w:rPr>
               <w:t>主色</w:t>
             </w:r>
@@ -1795,10 +1795,10 @@
               <w:insideV w:val="single" w:sz="6" w:color="B8C9D6"/>
             </w:tcBorders>
             <w:tcMar>
-              <w:top w:w="90" w:type="dxa"/>
-              <w:start w:w="110" w:type="dxa"/>
-              <w:bottom w:w="90" w:type="dxa"/>
-              <w:end w:w="110" w:type="dxa"/>
+              <w:top w:w="120" w:type="dxa"/>
+              <w:start w:w="180" w:type="dxa"/>
+              <w:bottom w:w="120" w:type="dxa"/>
+              <w:end w:w="180" w:type="dxa"/>
             </w:tcMar>
           </w:tcPr>
           <w:p>
@@ -1811,7 +1811,7 @@
                 <w:rFonts w:ascii="Aptos" w:hAnsi="Aptos" w:eastAsia="Microsoft YaHei"/>
                 <w:b w:val="0"/>
                 <w:color w:val="000000"/>
-                <w:sz w:val="20"/>
+                <w:sz w:val="19"/>
               </w:rPr>
               <w:t>#2F75B5</w:t>
             </w:r>
@@ -1832,10 +1832,10 @@
               <w:insideV w:val="single" w:sz="6" w:color="B8C9D6"/>
             </w:tcBorders>
             <w:tcMar>
-              <w:top w:w="90" w:type="dxa"/>
-              <w:start w:w="110" w:type="dxa"/>
-              <w:bottom w:w="90" w:type="dxa"/>
-              <w:end w:w="110" w:type="dxa"/>
+              <w:top w:w="120" w:type="dxa"/>
+              <w:start w:w="180" w:type="dxa"/>
+              <w:bottom w:w="120" w:type="dxa"/>
+              <w:end w:w="180" w:type="dxa"/>
             </w:tcMar>
           </w:tcPr>
           <w:p>
@@ -1848,7 +1848,7 @@
                 <w:rFonts w:ascii="Aptos" w:hAnsi="Aptos" w:eastAsia="Microsoft YaHei"/>
                 <w:b w:val="0"/>
                 <w:color w:val="000000"/>
-                <w:sz w:val="20"/>
+                <w:sz w:val="19"/>
               </w:rPr>
               <w:t>表头</w:t>
             </w:r>
@@ -1867,10 +1867,10 @@
               <w:insideV w:val="single" w:sz="6" w:color="B8C9D6"/>
             </w:tcBorders>
             <w:tcMar>
-              <w:top w:w="90" w:type="dxa"/>
-              <w:start w:w="110" w:type="dxa"/>
-              <w:bottom w:w="90" w:type="dxa"/>
-              <w:end w:w="110" w:type="dxa"/>
+              <w:top w:w="120" w:type="dxa"/>
+              <w:start w:w="180" w:type="dxa"/>
+              <w:bottom w:w="120" w:type="dxa"/>
+              <w:end w:w="180" w:type="dxa"/>
             </w:tcMar>
           </w:tcPr>
           <w:p>
@@ -1883,9 +1883,9 @@
                 <w:rFonts w:ascii="Aptos" w:hAnsi="Aptos" w:eastAsia="Microsoft YaHei"/>
                 <w:b w:val="0"/>
                 <w:color w:val="000000"/>
-                <w:sz w:val="20"/>
+                <w:sz w:val="19"/>
               </w:rPr>
-              <w:t>#005D8D 背景  白色  10 pt  加粗</w:t>
+              <w:t>#005D8D 背景  白色  9.5 pt  加粗</w:t>
             </w:r>
           </w:p>
         </w:tc>
@@ -1904,10 +1904,10 @@
               <w:insideV w:val="single" w:sz="6" w:color="B8C9D6"/>
             </w:tcBorders>
             <w:tcMar>
-              <w:top w:w="90" w:type="dxa"/>
-              <w:start w:w="110" w:type="dxa"/>
-              <w:bottom w:w="90" w:type="dxa"/>
-              <w:end w:w="110" w:type="dxa"/>
+              <w:top w:w="120" w:type="dxa"/>
+              <w:start w:w="180" w:type="dxa"/>
+              <w:bottom w:w="120" w:type="dxa"/>
+              <w:end w:w="180" w:type="dxa"/>
             </w:tcMar>
           </w:tcPr>
           <w:p>
@@ -1920,7 +1920,7 @@
                 <w:rFonts w:ascii="Aptos" w:hAnsi="Aptos" w:eastAsia="Microsoft YaHei"/>
                 <w:b w:val="0"/>
                 <w:color w:val="000000"/>
-                <w:sz w:val="20"/>
+                <w:sz w:val="19"/>
               </w:rPr>
               <w:t>正文</w:t>
             </w:r>
@@ -1939,10 +1939,10 @@
               <w:insideV w:val="single" w:sz="6" w:color="B8C9D6"/>
             </w:tcBorders>
             <w:tcMar>
-              <w:top w:w="90" w:type="dxa"/>
-              <w:start w:w="110" w:type="dxa"/>
-              <w:bottom w:w="90" w:type="dxa"/>
-              <w:end w:w="110" w:type="dxa"/>
+              <w:top w:w="120" w:type="dxa"/>
+              <w:start w:w="180" w:type="dxa"/>
+              <w:bottom w:w="120" w:type="dxa"/>
+              <w:end w:w="180" w:type="dxa"/>
             </w:tcMar>
           </w:tcPr>
           <w:p>
@@ -1955,7 +1955,7 @@
                 <w:rFonts w:ascii="Aptos" w:hAnsi="Aptos" w:eastAsia="Microsoft YaHei"/>
                 <w:b w:val="0"/>
                 <w:color w:val="000000"/>
-                <w:sz w:val="20"/>
+                <w:sz w:val="19"/>
               </w:rPr>
               <w:t>10.5 pt  左对齐  1.2 行距  段前 2  段后 4</w:t>
             </w:r>
@@ -1976,10 +1976,10 @@
               <w:insideV w:val="single" w:sz="6" w:color="B8C9D6"/>
             </w:tcBorders>
             <w:tcMar>
-              <w:top w:w="90" w:type="dxa"/>
-              <w:start w:w="110" w:type="dxa"/>
-              <w:bottom w:w="90" w:type="dxa"/>
-              <w:end w:w="110" w:type="dxa"/>
+              <w:top w:w="120" w:type="dxa"/>
+              <w:start w:w="180" w:type="dxa"/>
+              <w:bottom w:w="120" w:type="dxa"/>
+              <w:end w:w="180" w:type="dxa"/>
             </w:tcMar>
           </w:tcPr>
           <w:p>
@@ -1992,7 +1992,7 @@
                 <w:rFonts w:ascii="Aptos" w:hAnsi="Aptos" w:eastAsia="Microsoft YaHei"/>
                 <w:b w:val="0"/>
                 <w:color w:val="000000"/>
-                <w:sz w:val="20"/>
+                <w:sz w:val="19"/>
               </w:rPr>
               <w:t>说明块</w:t>
             </w:r>
@@ -2011,10 +2011,10 @@
               <w:insideV w:val="single" w:sz="6" w:color="B8C9D6"/>
             </w:tcBorders>
             <w:tcMar>
-              <w:top w:w="90" w:type="dxa"/>
-              <w:start w:w="110" w:type="dxa"/>
-              <w:bottom w:w="90" w:type="dxa"/>
-              <w:end w:w="110" w:type="dxa"/>
+              <w:top w:w="120" w:type="dxa"/>
+              <w:start w:w="180" w:type="dxa"/>
+              <w:bottom w:w="120" w:type="dxa"/>
+              <w:end w:w="180" w:type="dxa"/>
             </w:tcMar>
           </w:tcPr>
           <w:p>
@@ -2027,7 +2027,7 @@
                 <w:rFonts w:ascii="Aptos" w:hAnsi="Aptos" w:eastAsia="Microsoft YaHei"/>
                 <w:b w:val="0"/>
                 <w:color w:val="000000"/>
-                <w:sz w:val="20"/>
+                <w:sz w:val="19"/>
               </w:rPr>
               <w:t>#EEF5F8 背景  无外边框  10 pt</w:t>
             </w:r>
@@ -2048,10 +2048,10 @@
               <w:insideV w:val="single" w:sz="6" w:color="B8C9D6"/>
             </w:tcBorders>
             <w:tcMar>
-              <w:top w:w="90" w:type="dxa"/>
-              <w:start w:w="110" w:type="dxa"/>
-              <w:bottom w:w="90" w:type="dxa"/>
-              <w:end w:w="110" w:type="dxa"/>
+              <w:top w:w="120" w:type="dxa"/>
+              <w:start w:w="180" w:type="dxa"/>
+              <w:bottom w:w="120" w:type="dxa"/>
+              <w:end w:w="180" w:type="dxa"/>
             </w:tcMar>
           </w:tcPr>
           <w:p>
@@ -2064,7 +2064,7 @@
                 <w:rFonts w:ascii="Aptos" w:hAnsi="Aptos" w:eastAsia="Microsoft YaHei"/>
                 <w:b w:val="0"/>
                 <w:color w:val="000000"/>
-                <w:sz w:val="20"/>
+                <w:sz w:val="19"/>
               </w:rPr>
               <w:t>表格对齐</w:t>
             </w:r>
@@ -2083,10 +2083,10 @@
               <w:insideV w:val="single" w:sz="6" w:color="B8C9D6"/>
             </w:tcBorders>
             <w:tcMar>
-              <w:top w:w="90" w:type="dxa"/>
-              <w:start w:w="110" w:type="dxa"/>
-              <w:bottom w:w="90" w:type="dxa"/>
-              <w:end w:w="110" w:type="dxa"/>
+              <w:top w:w="120" w:type="dxa"/>
+              <w:start w:w="180" w:type="dxa"/>
+              <w:bottom w:w="120" w:type="dxa"/>
+              <w:end w:w="180" w:type="dxa"/>
             </w:tcMar>
           </w:tcPr>
           <w:p>
@@ -2099,7 +2099,7 @@
                 <w:rFonts w:ascii="Aptos" w:hAnsi="Aptos" w:eastAsia="Microsoft YaHei"/>
                 <w:b w:val="0"/>
                 <w:color w:val="000000"/>
-                <w:sz w:val="20"/>
+                <w:sz w:val="19"/>
               </w:rPr>
               <w:t>文字左对齐  数字右对齐  日期状态序号居中</w:t>
             </w:r>
@@ -2120,10 +2120,10 @@
               <w:insideV w:val="single" w:sz="6" w:color="B8C9D6"/>
             </w:tcBorders>
             <w:tcMar>
-              <w:top w:w="90" w:type="dxa"/>
-              <w:start w:w="110" w:type="dxa"/>
-              <w:bottom w:w="90" w:type="dxa"/>
-              <w:end w:w="110" w:type="dxa"/>
+              <w:top w:w="120" w:type="dxa"/>
+              <w:start w:w="180" w:type="dxa"/>
+              <w:bottom w:w="120" w:type="dxa"/>
+              <w:end w:w="180" w:type="dxa"/>
             </w:tcMar>
           </w:tcPr>
           <w:p>
@@ -2136,7 +2136,7 @@
                 <w:rFonts w:ascii="Aptos" w:hAnsi="Aptos" w:eastAsia="Microsoft YaHei"/>
                 <w:b w:val="0"/>
                 <w:color w:val="000000"/>
-                <w:sz w:val="20"/>
+                <w:sz w:val="19"/>
               </w:rPr>
               <w:t>空值与日期</w:t>
             </w:r>
@@ -2155,10 +2155,10 @@
               <w:insideV w:val="single" w:sz="6" w:color="B8C9D6"/>
             </w:tcBorders>
             <w:tcMar>
-              <w:top w:w="90" w:type="dxa"/>
-              <w:start w:w="110" w:type="dxa"/>
-              <w:bottom w:w="90" w:type="dxa"/>
-              <w:end w:w="110" w:type="dxa"/>
+              <w:top w:w="120" w:type="dxa"/>
+              <w:start w:w="180" w:type="dxa"/>
+              <w:bottom w:w="120" w:type="dxa"/>
+              <w:end w:w="180" w:type="dxa"/>
             </w:tcMar>
           </w:tcPr>
           <w:p>
@@ -2171,7 +2171,7 @@
                 <w:rFonts w:ascii="Aptos" w:hAnsi="Aptos" w:eastAsia="Microsoft YaHei"/>
                 <w:b w:val="0"/>
                 <w:color w:val="000000"/>
-                <w:sz w:val="20"/>
+                <w:sz w:val="19"/>
               </w:rPr>
               <w:t>空值使用 —  日期使用 YYYY-MM-DD</w:t>
             </w:r>
@@ -2192,10 +2192,10 @@
               <w:insideV w:val="single" w:sz="6" w:color="B8C9D6"/>
             </w:tcBorders>
             <w:tcMar>
-              <w:top w:w="90" w:type="dxa"/>
-              <w:start w:w="110" w:type="dxa"/>
-              <w:bottom w:w="90" w:type="dxa"/>
-              <w:end w:w="110" w:type="dxa"/>
+              <w:top w:w="120" w:type="dxa"/>
+              <w:start w:w="180" w:type="dxa"/>
+              <w:bottom w:w="120" w:type="dxa"/>
+              <w:end w:w="180" w:type="dxa"/>
             </w:tcMar>
           </w:tcPr>
           <w:p>
@@ -2208,7 +2208,7 @@
                 <w:rFonts w:ascii="Aptos" w:hAnsi="Aptos" w:eastAsia="Microsoft YaHei"/>
                 <w:b w:val="0"/>
                 <w:color w:val="000000"/>
-                <w:sz w:val="20"/>
+                <w:sz w:val="19"/>
               </w:rPr>
               <w:t>内容表达</w:t>
             </w:r>
@@ -2227,10 +2227,10 @@
               <w:insideV w:val="single" w:sz="6" w:color="B8C9D6"/>
             </w:tcBorders>
             <w:tcMar>
-              <w:top w:w="90" w:type="dxa"/>
-              <w:start w:w="110" w:type="dxa"/>
-              <w:bottom w:w="90" w:type="dxa"/>
-              <w:end w:w="110" w:type="dxa"/>
+              <w:top w:w="120" w:type="dxa"/>
+              <w:start w:w="180" w:type="dxa"/>
+              <w:bottom w:w="120" w:type="dxa"/>
+              <w:end w:w="180" w:type="dxa"/>
             </w:tcMar>
           </w:tcPr>
           <w:p>
@@ -2243,7 +2243,7 @@
                 <w:rFonts w:ascii="Aptos" w:hAnsi="Aptos" w:eastAsia="Microsoft YaHei"/>
                 <w:b w:val="0"/>
                 <w:color w:val="000000"/>
-                <w:sz w:val="20"/>
+                <w:sz w:val="19"/>
               </w:rPr>
               <w:t>结论先行  事实可验证  链接真实可访问</w:t>
             </w:r>
@@ -2588,10 +2588,10 @@
               <w:insideV w:val="single" w:sz="6" w:color="B8C9D6"/>
             </w:tcBorders>
             <w:tcMar>
-              <w:top w:w="90" w:type="dxa"/>
-              <w:start w:w="110" w:type="dxa"/>
-              <w:bottom w:w="90" w:type="dxa"/>
-              <w:end w:w="110" w:type="dxa"/>
+              <w:top w:w="120" w:type="dxa"/>
+              <w:start w:w="180" w:type="dxa"/>
+              <w:bottom w:w="120" w:type="dxa"/>
+              <w:end w:w="180" w:type="dxa"/>
             </w:tcMar>
           </w:tcPr>
           <w:p>
@@ -2604,7 +2604,7 @@
                 <w:rFonts w:ascii="Aptos" w:hAnsi="Aptos" w:eastAsia="Microsoft YaHei"/>
                 <w:b/>
                 <w:color w:val="FFFFFF"/>
-                <w:sz w:val="20"/>
+                <w:sz w:val="19"/>
               </w:rPr>
               <w:t>问题</w:t>
             </w:r>
@@ -2624,10 +2624,10 @@
               <w:insideV w:val="single" w:sz="6" w:color="B8C9D6"/>
             </w:tcBorders>
             <w:tcMar>
-              <w:top w:w="90" w:type="dxa"/>
-              <w:start w:w="110" w:type="dxa"/>
-              <w:bottom w:w="90" w:type="dxa"/>
-              <w:end w:w="110" w:type="dxa"/>
+              <w:top w:w="120" w:type="dxa"/>
+              <w:start w:w="180" w:type="dxa"/>
+              <w:bottom w:w="120" w:type="dxa"/>
+              <w:end w:w="180" w:type="dxa"/>
             </w:tcMar>
           </w:tcPr>
           <w:p>
@@ -2640,7 +2640,7 @@
                 <w:rFonts w:ascii="Aptos" w:hAnsi="Aptos" w:eastAsia="Microsoft YaHei"/>
                 <w:b/>
                 <w:color w:val="FFFFFF"/>
-                <w:sz w:val="20"/>
+                <w:sz w:val="19"/>
               </w:rPr>
               <w:t>处理方法</w:t>
             </w:r>
@@ -2661,10 +2661,10 @@
               <w:insideV w:val="single" w:sz="6" w:color="B8C9D6"/>
             </w:tcBorders>
             <w:tcMar>
-              <w:top w:w="90" w:type="dxa"/>
-              <w:start w:w="110" w:type="dxa"/>
-              <w:bottom w:w="90" w:type="dxa"/>
-              <w:end w:w="110" w:type="dxa"/>
+              <w:top w:w="120" w:type="dxa"/>
+              <w:start w:w="180" w:type="dxa"/>
+              <w:bottom w:w="120" w:type="dxa"/>
+              <w:end w:w="180" w:type="dxa"/>
             </w:tcMar>
           </w:tcPr>
           <w:p>
@@ -2677,7 +2677,7 @@
                 <w:rFonts w:ascii="Aptos" w:hAnsi="Aptos" w:eastAsia="Microsoft YaHei"/>
                 <w:b w:val="0"/>
                 <w:color w:val="000000"/>
-                <w:sz w:val="20"/>
+                <w:sz w:val="19"/>
               </w:rPr>
               <w:t>Codex 找不到 Skill</w:t>
             </w:r>
@@ -2696,10 +2696,10 @@
               <w:insideV w:val="single" w:sz="6" w:color="B8C9D6"/>
             </w:tcBorders>
             <w:tcMar>
-              <w:top w:w="90" w:type="dxa"/>
-              <w:start w:w="110" w:type="dxa"/>
-              <w:bottom w:w="90" w:type="dxa"/>
-              <w:end w:w="110" w:type="dxa"/>
+              <w:top w:w="120" w:type="dxa"/>
+              <w:start w:w="180" w:type="dxa"/>
+              <w:bottom w:w="120" w:type="dxa"/>
+              <w:end w:w="180" w:type="dxa"/>
             </w:tcMar>
           </w:tcPr>
           <w:p>
@@ -2712,7 +2712,7 @@
                 <w:rFonts w:ascii="Aptos" w:hAnsi="Aptos" w:eastAsia="Microsoft YaHei"/>
                 <w:b w:val="0"/>
                 <w:color w:val="000000"/>
-                <w:sz w:val="20"/>
+                <w:sz w:val="19"/>
               </w:rPr>
               <w:t>检查安装路径和文件夹嵌套层级，然后重新开始一轮对话。</w:t>
             </w:r>
@@ -2733,10 +2733,10 @@
               <w:insideV w:val="single" w:sz="6" w:color="B8C9D6"/>
             </w:tcBorders>
             <w:tcMar>
-              <w:top w:w="90" w:type="dxa"/>
-              <w:start w:w="110" w:type="dxa"/>
-              <w:bottom w:w="90" w:type="dxa"/>
-              <w:end w:w="110" w:type="dxa"/>
+              <w:top w:w="120" w:type="dxa"/>
+              <w:start w:w="180" w:type="dxa"/>
+              <w:bottom w:w="120" w:type="dxa"/>
+              <w:end w:w="180" w:type="dxa"/>
             </w:tcMar>
           </w:tcPr>
           <w:p>
@@ -2749,7 +2749,7 @@
                 <w:rFonts w:ascii="Aptos" w:hAnsi="Aptos" w:eastAsia="Microsoft YaHei"/>
                 <w:b w:val="0"/>
                 <w:color w:val="000000"/>
-                <w:sz w:val="20"/>
+                <w:sz w:val="19"/>
               </w:rPr>
               <w:t>已有公司模板</w:t>
             </w:r>
@@ -2768,10 +2768,10 @@
               <w:insideV w:val="single" w:sz="6" w:color="B8C9D6"/>
             </w:tcBorders>
             <w:tcMar>
-              <w:top w:w="90" w:type="dxa"/>
-              <w:start w:w="110" w:type="dxa"/>
-              <w:bottom w:w="90" w:type="dxa"/>
-              <w:end w:w="110" w:type="dxa"/>
+              <w:top w:w="120" w:type="dxa"/>
+              <w:start w:w="180" w:type="dxa"/>
+              <w:bottom w:w="120" w:type="dxa"/>
+              <w:end w:w="180" w:type="dxa"/>
             </w:tcMar>
           </w:tcPr>
           <w:p>
@@ -2784,7 +2784,7 @@
                 <w:rFonts w:ascii="Aptos" w:hAnsi="Aptos" w:eastAsia="Microsoft YaHei"/>
                 <w:b w:val="0"/>
                 <w:color w:val="000000"/>
-                <w:sz w:val="20"/>
+                <w:sz w:val="19"/>
               </w:rPr>
               <w:t>继续使用公司模板；本 Skill 只补充模板未规定的细节。</w:t>
             </w:r>
@@ -2805,10 +2805,10 @@
               <w:insideV w:val="single" w:sz="6" w:color="B8C9D6"/>
             </w:tcBorders>
             <w:tcMar>
-              <w:top w:w="90" w:type="dxa"/>
-              <w:start w:w="110" w:type="dxa"/>
-              <w:bottom w:w="90" w:type="dxa"/>
-              <w:end w:w="110" w:type="dxa"/>
+              <w:top w:w="120" w:type="dxa"/>
+              <w:start w:w="180" w:type="dxa"/>
+              <w:bottom w:w="120" w:type="dxa"/>
+              <w:end w:w="180" w:type="dxa"/>
             </w:tcMar>
           </w:tcPr>
           <w:p>
@@ -2821,7 +2821,7 @@
                 <w:rFonts w:ascii="Aptos" w:hAnsi="Aptos" w:eastAsia="Microsoft YaHei"/>
                 <w:b w:val="0"/>
                 <w:color w:val="000000"/>
-                <w:sz w:val="20"/>
+                <w:sz w:val="19"/>
               </w:rPr>
               <w:t>只想修改一个表格</w:t>
             </w:r>
@@ -2840,10 +2840,10 @@
               <w:insideV w:val="single" w:sz="6" w:color="B8C9D6"/>
             </w:tcBorders>
             <w:tcMar>
-              <w:top w:w="90" w:type="dxa"/>
-              <w:start w:w="110" w:type="dxa"/>
-              <w:bottom w:w="90" w:type="dxa"/>
-              <w:end w:w="110" w:type="dxa"/>
+              <w:top w:w="120" w:type="dxa"/>
+              <w:start w:w="180" w:type="dxa"/>
+              <w:bottom w:w="120" w:type="dxa"/>
+              <w:end w:w="180" w:type="dxa"/>
             </w:tcMar>
           </w:tcPr>
           <w:p>
@@ -2856,7 +2856,7 @@
                 <w:rFonts w:ascii="Aptos" w:hAnsi="Aptos" w:eastAsia="Microsoft YaHei"/>
                 <w:b w:val="0"/>
                 <w:color w:val="000000"/>
-                <w:sz w:val="20"/>
+                <w:sz w:val="19"/>
               </w:rPr>
               <w:t>明确指定修改范围，Codex 必须保留其他内容和样式。</w:t>
             </w:r>
@@ -2877,10 +2877,10 @@
               <w:insideV w:val="single" w:sz="6" w:color="B8C9D6"/>
             </w:tcBorders>
             <w:tcMar>
-              <w:top w:w="90" w:type="dxa"/>
-              <w:start w:w="110" w:type="dxa"/>
-              <w:bottom w:w="90" w:type="dxa"/>
-              <w:end w:w="110" w:type="dxa"/>
+              <w:top w:w="120" w:type="dxa"/>
+              <w:start w:w="180" w:type="dxa"/>
+              <w:bottom w:w="120" w:type="dxa"/>
+              <w:end w:w="180" w:type="dxa"/>
             </w:tcMar>
           </w:tcPr>
           <w:p>
@@ -2893,7 +2893,7 @@
                 <w:rFonts w:ascii="Aptos" w:hAnsi="Aptos" w:eastAsia="Microsoft YaHei"/>
                 <w:b w:val="0"/>
                 <w:color w:val="000000"/>
-                <w:sz w:val="20"/>
+                <w:sz w:val="19"/>
               </w:rPr>
               <w:t>需要更换品牌色</w:t>
             </w:r>
@@ -2912,10 +2912,10 @@
               <w:insideV w:val="single" w:sz="6" w:color="B8C9D6"/>
             </w:tcBorders>
             <w:tcMar>
-              <w:top w:w="90" w:type="dxa"/>
-              <w:start w:w="110" w:type="dxa"/>
-              <w:bottom w:w="90" w:type="dxa"/>
-              <w:end w:w="110" w:type="dxa"/>
+              <w:top w:w="120" w:type="dxa"/>
+              <w:start w:w="180" w:type="dxa"/>
+              <w:bottom w:w="120" w:type="dxa"/>
+              <w:end w:w="180" w:type="dxa"/>
             </w:tcMar>
           </w:tcPr>
           <w:p>
@@ -2928,7 +2928,7 @@
                 <w:rFonts w:ascii="Aptos" w:hAnsi="Aptos" w:eastAsia="Microsoft YaHei"/>
                 <w:b w:val="0"/>
                 <w:color w:val="000000"/>
-                <w:sz w:val="20"/>
+                <w:sz w:val="19"/>
               </w:rPr>
               <w:t>修改 style-standard.md 中的颜色定义，并保持全篇一致。</w:t>
             </w:r>
@@ -2949,10 +2949,10 @@
               <w:insideV w:val="single" w:sz="6" w:color="B8C9D6"/>
             </w:tcBorders>
             <w:tcMar>
-              <w:top w:w="90" w:type="dxa"/>
-              <w:start w:w="110" w:type="dxa"/>
-              <w:bottom w:w="90" w:type="dxa"/>
-              <w:end w:w="110" w:type="dxa"/>
+              <w:top w:w="120" w:type="dxa"/>
+              <w:start w:w="180" w:type="dxa"/>
+              <w:bottom w:w="120" w:type="dxa"/>
+              <w:end w:w="180" w:type="dxa"/>
             </w:tcMar>
           </w:tcPr>
           <w:p>
@@ -2965,7 +2965,7 @@
                 <w:rFonts w:ascii="Aptos" w:hAnsi="Aptos" w:eastAsia="Microsoft YaHei"/>
                 <w:b w:val="0"/>
                 <w:color w:val="000000"/>
-                <w:sz w:val="20"/>
+                <w:sz w:val="19"/>
               </w:rPr>
               <w:t>Git 更新失败</w:t>
             </w:r>
@@ -2984,10 +2984,10 @@
               <w:insideV w:val="single" w:sz="6" w:color="B8C9D6"/>
             </w:tcBorders>
             <w:tcMar>
-              <w:top w:w="90" w:type="dxa"/>
-              <w:start w:w="110" w:type="dxa"/>
-              <w:bottom w:w="90" w:type="dxa"/>
-              <w:end w:w="110" w:type="dxa"/>
+              <w:top w:w="120" w:type="dxa"/>
+              <w:start w:w="180" w:type="dxa"/>
+              <w:bottom w:w="120" w:type="dxa"/>
+              <w:end w:w="180" w:type="dxa"/>
             </w:tcMar>
           </w:tcPr>
           <w:p>
@@ -3000,7 +3000,7 @@
                 <w:rFonts w:ascii="Aptos" w:hAnsi="Aptos" w:eastAsia="Microsoft YaHei"/>
                 <w:b w:val="0"/>
                 <w:color w:val="000000"/>
-                <w:sz w:val="20"/>
+                <w:sz w:val="19"/>
               </w:rPr>
               <w:t>检查网络、仓库地址和 GitHub 权限；不要把凭据写入 Skill。</w:t>
             </w:r>

</xml_diff>

<commit_message>
Reduce table font and fix cell padding
</commit_message>
<xml_diff>
--- a/docs/Codex-Document-Standard-使用教程.docx
+++ b/docs/Codex-Document-Standard-使用教程.docx
@@ -65,9 +65,9 @@
             <w:shd w:fill="EEF5F8"/>
             <w:tcMar>
               <w:top w:w="120" w:type="dxa"/>
-              <w:start w:w="150" w:type="dxa"/>
+              <w:left w:w="150" w:type="dxa"/>
               <w:bottom w:w="120" w:type="dxa"/>
-              <w:end w:w="150" w:type="dxa"/>
+              <w:right w:w="150" w:type="dxa"/>
             </w:tcMar>
           </w:tcPr>
           <w:p>
@@ -155,9 +155,9 @@
             </w:tcBorders>
             <w:tcMar>
               <w:top w:w="120" w:type="dxa"/>
-              <w:start w:w="180" w:type="dxa"/>
+              <w:left w:w="180" w:type="dxa"/>
               <w:bottom w:w="120" w:type="dxa"/>
-              <w:end w:w="180" w:type="dxa"/>
+              <w:right w:w="180" w:type="dxa"/>
             </w:tcMar>
           </w:tcPr>
           <w:p>
@@ -170,7 +170,7 @@
                 <w:rFonts w:ascii="Aptos" w:hAnsi="Aptos" w:eastAsia="Microsoft YaHei"/>
                 <w:b/>
                 <w:color w:val="FFFFFF"/>
-                <w:sz w:val="19"/>
+                <w:sz w:val="18"/>
               </w:rPr>
               <w:t>适用</w:t>
             </w:r>
@@ -191,9 +191,9 @@
             </w:tcBorders>
             <w:tcMar>
               <w:top w:w="120" w:type="dxa"/>
-              <w:start w:w="180" w:type="dxa"/>
+              <w:left w:w="180" w:type="dxa"/>
               <w:bottom w:w="120" w:type="dxa"/>
-              <w:end w:w="180" w:type="dxa"/>
+              <w:right w:w="180" w:type="dxa"/>
             </w:tcMar>
           </w:tcPr>
           <w:p>
@@ -206,7 +206,7 @@
                 <w:rFonts w:ascii="Aptos" w:hAnsi="Aptos" w:eastAsia="Microsoft YaHei"/>
                 <w:b/>
                 <w:color w:val="FFFFFF"/>
-                <w:sz w:val="19"/>
+                <w:sz w:val="18"/>
               </w:rPr>
               <w:t>典型内容</w:t>
             </w:r>
@@ -227,9 +227,9 @@
             </w:tcBorders>
             <w:tcMar>
               <w:top w:w="120" w:type="dxa"/>
-              <w:start w:w="180" w:type="dxa"/>
+              <w:left w:w="180" w:type="dxa"/>
               <w:bottom w:w="120" w:type="dxa"/>
-              <w:end w:w="180" w:type="dxa"/>
+              <w:right w:w="180" w:type="dxa"/>
             </w:tcMar>
           </w:tcPr>
           <w:p>
@@ -242,7 +242,7 @@
                 <w:rFonts w:ascii="Aptos" w:hAnsi="Aptos" w:eastAsia="Microsoft YaHei"/>
                 <w:b/>
                 <w:color w:val="FFFFFF"/>
-                <w:sz w:val="19"/>
+                <w:sz w:val="18"/>
               </w:rPr>
               <w:t>默认行为</w:t>
             </w:r>
@@ -264,9 +264,9 @@
             </w:tcBorders>
             <w:tcMar>
               <w:top w:w="120" w:type="dxa"/>
-              <w:start w:w="180" w:type="dxa"/>
+              <w:left w:w="180" w:type="dxa"/>
               <w:bottom w:w="120" w:type="dxa"/>
-              <w:end w:w="180" w:type="dxa"/>
+              <w:right w:w="180" w:type="dxa"/>
             </w:tcMar>
           </w:tcPr>
           <w:p>
@@ -279,7 +279,7 @@
                 <w:rFonts w:ascii="Aptos" w:hAnsi="Aptos" w:eastAsia="Microsoft YaHei"/>
                 <w:b w:val="0"/>
                 <w:color w:val="000000"/>
-                <w:sz w:val="19"/>
+                <w:sz w:val="18"/>
               </w:rPr>
               <w:t>工作报告</w:t>
             </w:r>
@@ -299,9 +299,9 @@
             </w:tcBorders>
             <w:tcMar>
               <w:top w:w="120" w:type="dxa"/>
-              <w:start w:w="180" w:type="dxa"/>
+              <w:left w:w="180" w:type="dxa"/>
               <w:bottom w:w="120" w:type="dxa"/>
-              <w:end w:w="180" w:type="dxa"/>
+              <w:right w:w="180" w:type="dxa"/>
             </w:tcMar>
           </w:tcPr>
           <w:p>
@@ -314,7 +314,7 @@
                 <w:rFonts w:ascii="Aptos" w:hAnsi="Aptos" w:eastAsia="Microsoft YaHei"/>
                 <w:b w:val="0"/>
                 <w:color w:val="000000"/>
-                <w:sz w:val="19"/>
+                <w:sz w:val="18"/>
               </w:rPr>
               <w:t>周报  月报  季度复盘  项目总结</w:t>
             </w:r>
@@ -334,9 +334,9 @@
             </w:tcBorders>
             <w:tcMar>
               <w:top w:w="120" w:type="dxa"/>
-              <w:start w:w="180" w:type="dxa"/>
+              <w:left w:w="180" w:type="dxa"/>
               <w:bottom w:w="120" w:type="dxa"/>
-              <w:end w:w="180" w:type="dxa"/>
+              <w:right w:w="180" w:type="dxa"/>
             </w:tcMar>
           </w:tcPr>
           <w:p>
@@ -349,7 +349,7 @@
                 <w:rFonts w:ascii="Aptos" w:hAnsi="Aptos" w:eastAsia="Microsoft YaHei"/>
                 <w:b w:val="0"/>
                 <w:color w:val="000000"/>
-                <w:sz w:val="19"/>
+                <w:sz w:val="18"/>
               </w:rPr>
               <w:t>统一标题层级和正文排版</w:t>
             </w:r>
@@ -371,9 +371,9 @@
             </w:tcBorders>
             <w:tcMar>
               <w:top w:w="120" w:type="dxa"/>
-              <w:start w:w="180" w:type="dxa"/>
+              <w:left w:w="180" w:type="dxa"/>
               <w:bottom w:w="120" w:type="dxa"/>
-              <w:end w:w="180" w:type="dxa"/>
+              <w:right w:w="180" w:type="dxa"/>
             </w:tcMar>
           </w:tcPr>
           <w:p>
@@ -386,7 +386,7 @@
                 <w:rFonts w:ascii="Aptos" w:hAnsi="Aptos" w:eastAsia="Microsoft YaHei"/>
                 <w:b w:val="0"/>
                 <w:color w:val="000000"/>
-                <w:sz w:val="19"/>
+                <w:sz w:val="18"/>
               </w:rPr>
               <w:t>计划与方案</w:t>
             </w:r>
@@ -406,9 +406,9 @@
             </w:tcBorders>
             <w:tcMar>
               <w:top w:w="120" w:type="dxa"/>
-              <w:start w:w="180" w:type="dxa"/>
+              <w:left w:w="180" w:type="dxa"/>
               <w:bottom w:w="120" w:type="dxa"/>
-              <w:end w:w="180" w:type="dxa"/>
+              <w:right w:w="180" w:type="dxa"/>
             </w:tcMar>
           </w:tcPr>
           <w:p>
@@ -421,7 +421,7 @@
                 <w:rFonts w:ascii="Aptos" w:hAnsi="Aptos" w:eastAsia="Microsoft YaHei"/>
                 <w:b w:val="0"/>
                 <w:color w:val="000000"/>
-                <w:sz w:val="19"/>
+                <w:sz w:val="18"/>
               </w:rPr>
               <w:t>项目计划  执行方案  制度说明</w:t>
             </w:r>
@@ -441,9 +441,9 @@
             </w:tcBorders>
             <w:tcMar>
               <w:top w:w="120" w:type="dxa"/>
-              <w:start w:w="180" w:type="dxa"/>
+              <w:left w:w="180" w:type="dxa"/>
               <w:bottom w:w="120" w:type="dxa"/>
-              <w:end w:w="180" w:type="dxa"/>
+              <w:right w:w="180" w:type="dxa"/>
             </w:tcMar>
           </w:tcPr>
           <w:p>
@@ -456,7 +456,7 @@
                 <w:rFonts w:ascii="Aptos" w:hAnsi="Aptos" w:eastAsia="Microsoft YaHei"/>
                 <w:b w:val="0"/>
                 <w:color w:val="000000"/>
-                <w:sz w:val="19"/>
+                <w:sz w:val="18"/>
               </w:rPr>
               <w:t>突出结论  范围  风险和动作</w:t>
             </w:r>
@@ -478,9 +478,9 @@
             </w:tcBorders>
             <w:tcMar>
               <w:top w:w="120" w:type="dxa"/>
-              <w:start w:w="180" w:type="dxa"/>
+              <w:left w:w="180" w:type="dxa"/>
               <w:bottom w:w="120" w:type="dxa"/>
-              <w:end w:w="180" w:type="dxa"/>
+              <w:right w:w="180" w:type="dxa"/>
             </w:tcMar>
           </w:tcPr>
           <w:p>
@@ -493,7 +493,7 @@
                 <w:rFonts w:ascii="Aptos" w:hAnsi="Aptos" w:eastAsia="Microsoft YaHei"/>
                 <w:b w:val="0"/>
                 <w:color w:val="000000"/>
-                <w:sz w:val="19"/>
+                <w:sz w:val="18"/>
               </w:rPr>
               <w:t>会议文档</w:t>
             </w:r>
@@ -513,9 +513,9 @@
             </w:tcBorders>
             <w:tcMar>
               <w:top w:w="120" w:type="dxa"/>
-              <w:start w:w="180" w:type="dxa"/>
+              <w:left w:w="180" w:type="dxa"/>
               <w:bottom w:w="120" w:type="dxa"/>
-              <w:end w:w="180" w:type="dxa"/>
+              <w:right w:w="180" w:type="dxa"/>
             </w:tcMar>
           </w:tcPr>
           <w:p>
@@ -528,7 +528,7 @@
                 <w:rFonts w:ascii="Aptos" w:hAnsi="Aptos" w:eastAsia="Microsoft YaHei"/>
                 <w:b w:val="0"/>
                 <w:color w:val="000000"/>
-                <w:sz w:val="19"/>
+                <w:sz w:val="18"/>
               </w:rPr>
               <w:t>会议纪要  评审记录  跟进清单</w:t>
             </w:r>
@@ -548,9 +548,9 @@
             </w:tcBorders>
             <w:tcMar>
               <w:top w:w="120" w:type="dxa"/>
-              <w:start w:w="180" w:type="dxa"/>
+              <w:left w:w="180" w:type="dxa"/>
               <w:bottom w:w="120" w:type="dxa"/>
-              <w:end w:w="180" w:type="dxa"/>
+              <w:right w:w="180" w:type="dxa"/>
             </w:tcMar>
           </w:tcPr>
           <w:p>
@@ -563,7 +563,7 @@
                 <w:rFonts w:ascii="Aptos" w:hAnsi="Aptos" w:eastAsia="Microsoft YaHei"/>
                 <w:b w:val="0"/>
                 <w:color w:val="000000"/>
-                <w:sz w:val="19"/>
+                <w:sz w:val="18"/>
               </w:rPr>
               <w:t>统一表格  日期  状态和责任信息</w:t>
             </w:r>
@@ -585,9 +585,9 @@
             </w:tcBorders>
             <w:tcMar>
               <w:top w:w="120" w:type="dxa"/>
-              <w:start w:w="180" w:type="dxa"/>
+              <w:left w:w="180" w:type="dxa"/>
               <w:bottom w:w="120" w:type="dxa"/>
-              <w:end w:w="180" w:type="dxa"/>
+              <w:right w:w="180" w:type="dxa"/>
             </w:tcMar>
           </w:tcPr>
           <w:p>
@@ -600,7 +600,7 @@
                 <w:rFonts w:ascii="Aptos" w:hAnsi="Aptos" w:eastAsia="Microsoft YaHei"/>
                 <w:b w:val="0"/>
                 <w:color w:val="000000"/>
-                <w:sz w:val="19"/>
+                <w:sz w:val="18"/>
               </w:rPr>
               <w:t>钉钉文档</w:t>
             </w:r>
@@ -620,9 +620,9 @@
             </w:tcBorders>
             <w:tcMar>
               <w:top w:w="120" w:type="dxa"/>
-              <w:start w:w="180" w:type="dxa"/>
+              <w:left w:w="180" w:type="dxa"/>
               <w:bottom w:w="120" w:type="dxa"/>
-              <w:end w:w="180" w:type="dxa"/>
+              <w:right w:w="180" w:type="dxa"/>
             </w:tcMar>
           </w:tcPr>
           <w:p>
@@ -635,7 +635,7 @@
                 <w:rFonts w:ascii="Aptos" w:hAnsi="Aptos" w:eastAsia="Microsoft YaHei"/>
                 <w:b w:val="0"/>
                 <w:color w:val="000000"/>
-                <w:sz w:val="19"/>
+                <w:sz w:val="18"/>
               </w:rPr>
               <w:t>工作文档和文档表格</w:t>
             </w:r>
@@ -655,9 +655,9 @@
             </w:tcBorders>
             <w:tcMar>
               <w:top w:w="120" w:type="dxa"/>
-              <w:start w:w="180" w:type="dxa"/>
+              <w:left w:w="180" w:type="dxa"/>
               <w:bottom w:w="120" w:type="dxa"/>
-              <w:end w:w="180" w:type="dxa"/>
+              <w:right w:w="180" w:type="dxa"/>
             </w:tcMar>
           </w:tcPr>
           <w:p>
@@ -670,7 +670,7 @@
                 <w:rFonts w:ascii="Aptos" w:hAnsi="Aptos" w:eastAsia="Microsoft YaHei"/>
                 <w:b w:val="0"/>
                 <w:color w:val="000000"/>
-                <w:sz w:val="19"/>
+                <w:sz w:val="18"/>
               </w:rPr>
               <w:t>按平台能力应用同一视觉语言</w:t>
             </w:r>
@@ -852,9 +852,9 @@
             <w:shd w:fill="EEF5F8"/>
             <w:tcMar>
               <w:top w:w="120" w:type="dxa"/>
-              <w:start w:w="150" w:type="dxa"/>
+              <w:left w:w="150" w:type="dxa"/>
               <w:bottom w:w="120" w:type="dxa"/>
-              <w:end w:w="150" w:type="dxa"/>
+              <w:right w:w="150" w:type="dxa"/>
             </w:tcMar>
           </w:tcPr>
           <w:p>
@@ -937,9 +937,9 @@
             <w:shd w:fill="EEF5F8"/>
             <w:tcMar>
               <w:top w:w="100" w:type="dxa"/>
-              <w:start w:w="140" w:type="dxa"/>
+              <w:left w:w="140" w:type="dxa"/>
               <w:bottom w:w="100" w:type="dxa"/>
-              <w:end w:w="140" w:type="dxa"/>
+              <w:right w:w="140" w:type="dxa"/>
             </w:tcMar>
           </w:tcPr>
           <w:p>
@@ -1037,9 +1037,9 @@
             <w:shd w:fill="EEF5F8"/>
             <w:tcMar>
               <w:top w:w="100" w:type="dxa"/>
-              <w:start w:w="140" w:type="dxa"/>
+              <w:left w:w="140" w:type="dxa"/>
               <w:bottom w:w="100" w:type="dxa"/>
-              <w:end w:w="140" w:type="dxa"/>
+              <w:right w:w="140" w:type="dxa"/>
             </w:tcMar>
           </w:tcPr>
           <w:p>
@@ -1090,9 +1090,9 @@
             <w:shd w:fill="EEF5F8"/>
             <w:tcMar>
               <w:top w:w="100" w:type="dxa"/>
-              <w:start w:w="140" w:type="dxa"/>
+              <w:left w:w="140" w:type="dxa"/>
               <w:bottom w:w="100" w:type="dxa"/>
-              <w:end w:w="140" w:type="dxa"/>
+              <w:right w:w="140" w:type="dxa"/>
             </w:tcMar>
           </w:tcPr>
           <w:p>
@@ -1253,9 +1253,9 @@
             <w:shd w:fill="EEF5F8"/>
             <w:tcMar>
               <w:top w:w="100" w:type="dxa"/>
-              <w:start w:w="140" w:type="dxa"/>
+              <w:left w:w="140" w:type="dxa"/>
               <w:bottom w:w="100" w:type="dxa"/>
-              <w:end w:w="140" w:type="dxa"/>
+              <w:right w:w="140" w:type="dxa"/>
             </w:tcMar>
           </w:tcPr>
           <w:p>
@@ -1386,9 +1386,9 @@
             <w:shd w:fill="EEF5F8"/>
             <w:tcMar>
               <w:top w:w="120" w:type="dxa"/>
-              <w:start w:w="150" w:type="dxa"/>
+              <w:left w:w="150" w:type="dxa"/>
               <w:bottom w:w="120" w:type="dxa"/>
-              <w:end w:w="150" w:type="dxa"/>
+              <w:right w:w="150" w:type="dxa"/>
             </w:tcMar>
           </w:tcPr>
           <w:p>
@@ -1471,9 +1471,9 @@
             <w:shd w:fill="EEF5F8"/>
             <w:tcMar>
               <w:top w:w="100" w:type="dxa"/>
-              <w:start w:w="140" w:type="dxa"/>
+              <w:left w:w="140" w:type="dxa"/>
               <w:bottom w:w="100" w:type="dxa"/>
-              <w:end w:w="140" w:type="dxa"/>
+              <w:right w:w="140" w:type="dxa"/>
             </w:tcMar>
           </w:tcPr>
           <w:p>
@@ -1538,9 +1538,9 @@
             <w:shd w:fill="EEF5F8"/>
             <w:tcMar>
               <w:top w:w="100" w:type="dxa"/>
-              <w:start w:w="140" w:type="dxa"/>
+              <w:left w:w="140" w:type="dxa"/>
               <w:bottom w:w="100" w:type="dxa"/>
-              <w:end w:w="140" w:type="dxa"/>
+              <w:right w:w="140" w:type="dxa"/>
             </w:tcMar>
           </w:tcPr>
           <w:p>
@@ -1616,9 +1616,9 @@
             </w:tcBorders>
             <w:tcMar>
               <w:top w:w="120" w:type="dxa"/>
-              <w:start w:w="180" w:type="dxa"/>
+              <w:left w:w="180" w:type="dxa"/>
               <w:bottom w:w="120" w:type="dxa"/>
-              <w:end w:w="180" w:type="dxa"/>
+              <w:right w:w="180" w:type="dxa"/>
             </w:tcMar>
           </w:tcPr>
           <w:p>
@@ -1631,7 +1631,7 @@
                 <w:rFonts w:ascii="Aptos" w:hAnsi="Aptos" w:eastAsia="Microsoft YaHei"/>
                 <w:b/>
                 <w:color w:val="FFFFFF"/>
-                <w:sz w:val="19"/>
+                <w:sz w:val="18"/>
               </w:rPr>
               <w:t>项目</w:t>
             </w:r>
@@ -1652,9 +1652,9 @@
             </w:tcBorders>
             <w:tcMar>
               <w:top w:w="120" w:type="dxa"/>
-              <w:start w:w="180" w:type="dxa"/>
+              <w:left w:w="180" w:type="dxa"/>
               <w:bottom w:w="120" w:type="dxa"/>
-              <w:end w:w="180" w:type="dxa"/>
+              <w:right w:w="180" w:type="dxa"/>
             </w:tcMar>
           </w:tcPr>
           <w:p>
@@ -1667,7 +1667,7 @@
                 <w:rFonts w:ascii="Aptos" w:hAnsi="Aptos" w:eastAsia="Microsoft YaHei"/>
                 <w:b/>
                 <w:color w:val="FFFFFF"/>
-                <w:sz w:val="19"/>
+                <w:sz w:val="18"/>
               </w:rPr>
               <w:t>默认规范</w:t>
             </w:r>
@@ -1689,9 +1689,9 @@
             </w:tcBorders>
             <w:tcMar>
               <w:top w:w="120" w:type="dxa"/>
-              <w:start w:w="180" w:type="dxa"/>
+              <w:left w:w="180" w:type="dxa"/>
               <w:bottom w:w="120" w:type="dxa"/>
-              <w:end w:w="180" w:type="dxa"/>
+              <w:right w:w="180" w:type="dxa"/>
             </w:tcMar>
           </w:tcPr>
           <w:p>
@@ -1704,7 +1704,7 @@
                 <w:rFonts w:ascii="Aptos" w:hAnsi="Aptos" w:eastAsia="Microsoft YaHei"/>
                 <w:b w:val="0"/>
                 <w:color w:val="000000"/>
-                <w:sz w:val="19"/>
+                <w:sz w:val="18"/>
               </w:rPr>
               <w:t>视觉基调</w:t>
             </w:r>
@@ -1724,9 +1724,9 @@
             </w:tcBorders>
             <w:tcMar>
               <w:top w:w="120" w:type="dxa"/>
-              <w:start w:w="180" w:type="dxa"/>
+              <w:left w:w="180" w:type="dxa"/>
               <w:bottom w:w="120" w:type="dxa"/>
-              <w:end w:w="180" w:type="dxa"/>
+              <w:right w:w="180" w:type="dxa"/>
             </w:tcMar>
           </w:tcPr>
           <w:p>
@@ -1739,7 +1739,7 @@
                 <w:rFonts w:ascii="Aptos" w:hAnsi="Aptos" w:eastAsia="Microsoft YaHei"/>
                 <w:b w:val="0"/>
                 <w:color w:val="000000"/>
-                <w:sz w:val="19"/>
+                <w:sz w:val="18"/>
               </w:rPr>
               <w:t>专业  克制  清晰  白色页面背景</w:t>
             </w:r>
@@ -1761,9 +1761,9 @@
             </w:tcBorders>
             <w:tcMar>
               <w:top w:w="120" w:type="dxa"/>
-              <w:start w:w="180" w:type="dxa"/>
+              <w:left w:w="180" w:type="dxa"/>
               <w:bottom w:w="120" w:type="dxa"/>
-              <w:end w:w="180" w:type="dxa"/>
+              <w:right w:w="180" w:type="dxa"/>
             </w:tcMar>
           </w:tcPr>
           <w:p>
@@ -1776,7 +1776,7 @@
                 <w:rFonts w:ascii="Aptos" w:hAnsi="Aptos" w:eastAsia="Microsoft YaHei"/>
                 <w:b w:val="0"/>
                 <w:color w:val="000000"/>
-                <w:sz w:val="19"/>
+                <w:sz w:val="18"/>
               </w:rPr>
               <w:t>主色</w:t>
             </w:r>
@@ -1796,9 +1796,9 @@
             </w:tcBorders>
             <w:tcMar>
               <w:top w:w="120" w:type="dxa"/>
-              <w:start w:w="180" w:type="dxa"/>
+              <w:left w:w="180" w:type="dxa"/>
               <w:bottom w:w="120" w:type="dxa"/>
-              <w:end w:w="180" w:type="dxa"/>
+              <w:right w:w="180" w:type="dxa"/>
             </w:tcMar>
           </w:tcPr>
           <w:p>
@@ -1811,7 +1811,7 @@
                 <w:rFonts w:ascii="Aptos" w:hAnsi="Aptos" w:eastAsia="Microsoft YaHei"/>
                 <w:b w:val="0"/>
                 <w:color w:val="000000"/>
-                <w:sz w:val="19"/>
+                <w:sz w:val="18"/>
               </w:rPr>
               <w:t>#2F75B5</w:t>
             </w:r>
@@ -1833,9 +1833,9 @@
             </w:tcBorders>
             <w:tcMar>
               <w:top w:w="120" w:type="dxa"/>
-              <w:start w:w="180" w:type="dxa"/>
+              <w:left w:w="180" w:type="dxa"/>
               <w:bottom w:w="120" w:type="dxa"/>
-              <w:end w:w="180" w:type="dxa"/>
+              <w:right w:w="180" w:type="dxa"/>
             </w:tcMar>
           </w:tcPr>
           <w:p>
@@ -1848,7 +1848,7 @@
                 <w:rFonts w:ascii="Aptos" w:hAnsi="Aptos" w:eastAsia="Microsoft YaHei"/>
                 <w:b w:val="0"/>
                 <w:color w:val="000000"/>
-                <w:sz w:val="19"/>
+                <w:sz w:val="18"/>
               </w:rPr>
               <w:t>表头</w:t>
             </w:r>
@@ -1868,9 +1868,9 @@
             </w:tcBorders>
             <w:tcMar>
               <w:top w:w="120" w:type="dxa"/>
-              <w:start w:w="180" w:type="dxa"/>
+              <w:left w:w="180" w:type="dxa"/>
               <w:bottom w:w="120" w:type="dxa"/>
-              <w:end w:w="180" w:type="dxa"/>
+              <w:right w:w="180" w:type="dxa"/>
             </w:tcMar>
           </w:tcPr>
           <w:p>
@@ -1883,9 +1883,9 @@
                 <w:rFonts w:ascii="Aptos" w:hAnsi="Aptos" w:eastAsia="Microsoft YaHei"/>
                 <w:b w:val="0"/>
                 <w:color w:val="000000"/>
-                <w:sz w:val="19"/>
+                <w:sz w:val="18"/>
               </w:rPr>
-              <w:t>#005D8D 背景  白色  9.5 pt  加粗</w:t>
+              <w:t>#005D8D 背景  白色  9 pt  加粗</w:t>
             </w:r>
           </w:p>
         </w:tc>
@@ -1905,9 +1905,9 @@
             </w:tcBorders>
             <w:tcMar>
               <w:top w:w="120" w:type="dxa"/>
-              <w:start w:w="180" w:type="dxa"/>
+              <w:left w:w="180" w:type="dxa"/>
               <w:bottom w:w="120" w:type="dxa"/>
-              <w:end w:w="180" w:type="dxa"/>
+              <w:right w:w="180" w:type="dxa"/>
             </w:tcMar>
           </w:tcPr>
           <w:p>
@@ -1920,7 +1920,7 @@
                 <w:rFonts w:ascii="Aptos" w:hAnsi="Aptos" w:eastAsia="Microsoft YaHei"/>
                 <w:b w:val="0"/>
                 <w:color w:val="000000"/>
-                <w:sz w:val="19"/>
+                <w:sz w:val="18"/>
               </w:rPr>
               <w:t>正文</w:t>
             </w:r>
@@ -1940,9 +1940,9 @@
             </w:tcBorders>
             <w:tcMar>
               <w:top w:w="120" w:type="dxa"/>
-              <w:start w:w="180" w:type="dxa"/>
+              <w:left w:w="180" w:type="dxa"/>
               <w:bottom w:w="120" w:type="dxa"/>
-              <w:end w:w="180" w:type="dxa"/>
+              <w:right w:w="180" w:type="dxa"/>
             </w:tcMar>
           </w:tcPr>
           <w:p>
@@ -1955,7 +1955,7 @@
                 <w:rFonts w:ascii="Aptos" w:hAnsi="Aptos" w:eastAsia="Microsoft YaHei"/>
                 <w:b w:val="0"/>
                 <w:color w:val="000000"/>
-                <w:sz w:val="19"/>
+                <w:sz w:val="18"/>
               </w:rPr>
               <w:t>10.5 pt  左对齐  1.2 行距  段前 2  段后 4</w:t>
             </w:r>
@@ -1977,9 +1977,9 @@
             </w:tcBorders>
             <w:tcMar>
               <w:top w:w="120" w:type="dxa"/>
-              <w:start w:w="180" w:type="dxa"/>
+              <w:left w:w="180" w:type="dxa"/>
               <w:bottom w:w="120" w:type="dxa"/>
-              <w:end w:w="180" w:type="dxa"/>
+              <w:right w:w="180" w:type="dxa"/>
             </w:tcMar>
           </w:tcPr>
           <w:p>
@@ -1992,7 +1992,7 @@
                 <w:rFonts w:ascii="Aptos" w:hAnsi="Aptos" w:eastAsia="Microsoft YaHei"/>
                 <w:b w:val="0"/>
                 <w:color w:val="000000"/>
-                <w:sz w:val="19"/>
+                <w:sz w:val="18"/>
               </w:rPr>
               <w:t>说明块</w:t>
             </w:r>
@@ -2012,9 +2012,9 @@
             </w:tcBorders>
             <w:tcMar>
               <w:top w:w="120" w:type="dxa"/>
-              <w:start w:w="180" w:type="dxa"/>
+              <w:left w:w="180" w:type="dxa"/>
               <w:bottom w:w="120" w:type="dxa"/>
-              <w:end w:w="180" w:type="dxa"/>
+              <w:right w:w="180" w:type="dxa"/>
             </w:tcMar>
           </w:tcPr>
           <w:p>
@@ -2027,7 +2027,7 @@
                 <w:rFonts w:ascii="Aptos" w:hAnsi="Aptos" w:eastAsia="Microsoft YaHei"/>
                 <w:b w:val="0"/>
                 <w:color w:val="000000"/>
-                <w:sz w:val="19"/>
+                <w:sz w:val="18"/>
               </w:rPr>
               <w:t>#EEF5F8 背景  无外边框  10 pt</w:t>
             </w:r>
@@ -2049,9 +2049,9 @@
             </w:tcBorders>
             <w:tcMar>
               <w:top w:w="120" w:type="dxa"/>
-              <w:start w:w="180" w:type="dxa"/>
+              <w:left w:w="180" w:type="dxa"/>
               <w:bottom w:w="120" w:type="dxa"/>
-              <w:end w:w="180" w:type="dxa"/>
+              <w:right w:w="180" w:type="dxa"/>
             </w:tcMar>
           </w:tcPr>
           <w:p>
@@ -2064,7 +2064,7 @@
                 <w:rFonts w:ascii="Aptos" w:hAnsi="Aptos" w:eastAsia="Microsoft YaHei"/>
                 <w:b w:val="0"/>
                 <w:color w:val="000000"/>
-                <w:sz w:val="19"/>
+                <w:sz w:val="18"/>
               </w:rPr>
               <w:t>表格对齐</w:t>
             </w:r>
@@ -2084,9 +2084,9 @@
             </w:tcBorders>
             <w:tcMar>
               <w:top w:w="120" w:type="dxa"/>
-              <w:start w:w="180" w:type="dxa"/>
+              <w:left w:w="180" w:type="dxa"/>
               <w:bottom w:w="120" w:type="dxa"/>
-              <w:end w:w="180" w:type="dxa"/>
+              <w:right w:w="180" w:type="dxa"/>
             </w:tcMar>
           </w:tcPr>
           <w:p>
@@ -2099,7 +2099,7 @@
                 <w:rFonts w:ascii="Aptos" w:hAnsi="Aptos" w:eastAsia="Microsoft YaHei"/>
                 <w:b w:val="0"/>
                 <w:color w:val="000000"/>
-                <w:sz w:val="19"/>
+                <w:sz w:val="18"/>
               </w:rPr>
               <w:t>文字左对齐  数字右对齐  日期状态序号居中</w:t>
             </w:r>
@@ -2121,9 +2121,9 @@
             </w:tcBorders>
             <w:tcMar>
               <w:top w:w="120" w:type="dxa"/>
-              <w:start w:w="180" w:type="dxa"/>
+              <w:left w:w="180" w:type="dxa"/>
               <w:bottom w:w="120" w:type="dxa"/>
-              <w:end w:w="180" w:type="dxa"/>
+              <w:right w:w="180" w:type="dxa"/>
             </w:tcMar>
           </w:tcPr>
           <w:p>
@@ -2136,7 +2136,7 @@
                 <w:rFonts w:ascii="Aptos" w:hAnsi="Aptos" w:eastAsia="Microsoft YaHei"/>
                 <w:b w:val="0"/>
                 <w:color w:val="000000"/>
-                <w:sz w:val="19"/>
+                <w:sz w:val="18"/>
               </w:rPr>
               <w:t>空值与日期</w:t>
             </w:r>
@@ -2156,9 +2156,9 @@
             </w:tcBorders>
             <w:tcMar>
               <w:top w:w="120" w:type="dxa"/>
-              <w:start w:w="180" w:type="dxa"/>
+              <w:left w:w="180" w:type="dxa"/>
               <w:bottom w:w="120" w:type="dxa"/>
-              <w:end w:w="180" w:type="dxa"/>
+              <w:right w:w="180" w:type="dxa"/>
             </w:tcMar>
           </w:tcPr>
           <w:p>
@@ -2171,7 +2171,7 @@
                 <w:rFonts w:ascii="Aptos" w:hAnsi="Aptos" w:eastAsia="Microsoft YaHei"/>
                 <w:b w:val="0"/>
                 <w:color w:val="000000"/>
-                <w:sz w:val="19"/>
+                <w:sz w:val="18"/>
               </w:rPr>
               <w:t>空值使用 —  日期使用 YYYY-MM-DD</w:t>
             </w:r>
@@ -2193,9 +2193,9 @@
             </w:tcBorders>
             <w:tcMar>
               <w:top w:w="120" w:type="dxa"/>
-              <w:start w:w="180" w:type="dxa"/>
+              <w:left w:w="180" w:type="dxa"/>
               <w:bottom w:w="120" w:type="dxa"/>
-              <w:end w:w="180" w:type="dxa"/>
+              <w:right w:w="180" w:type="dxa"/>
             </w:tcMar>
           </w:tcPr>
           <w:p>
@@ -2208,7 +2208,7 @@
                 <w:rFonts w:ascii="Aptos" w:hAnsi="Aptos" w:eastAsia="Microsoft YaHei"/>
                 <w:b w:val="0"/>
                 <w:color w:val="000000"/>
-                <w:sz w:val="19"/>
+                <w:sz w:val="18"/>
               </w:rPr>
               <w:t>内容表达</w:t>
             </w:r>
@@ -2228,9 +2228,9 @@
             </w:tcBorders>
             <w:tcMar>
               <w:top w:w="120" w:type="dxa"/>
-              <w:start w:w="180" w:type="dxa"/>
+              <w:left w:w="180" w:type="dxa"/>
               <w:bottom w:w="120" w:type="dxa"/>
-              <w:end w:w="180" w:type="dxa"/>
+              <w:right w:w="180" w:type="dxa"/>
             </w:tcMar>
           </w:tcPr>
           <w:p>
@@ -2243,7 +2243,7 @@
                 <w:rFonts w:ascii="Aptos" w:hAnsi="Aptos" w:eastAsia="Microsoft YaHei"/>
                 <w:b w:val="0"/>
                 <w:color w:val="000000"/>
-                <w:sz w:val="19"/>
+                <w:sz w:val="18"/>
               </w:rPr>
               <w:t>结论先行  事实可验证  链接真实可访问</w:t>
             </w:r>
@@ -2387,9 +2387,9 @@
             <w:shd w:fill="EEF5F8"/>
             <w:tcMar>
               <w:top w:w="100" w:type="dxa"/>
-              <w:start w:w="140" w:type="dxa"/>
+              <w:left w:w="140" w:type="dxa"/>
               <w:bottom w:w="100" w:type="dxa"/>
-              <w:end w:w="140" w:type="dxa"/>
+              <w:right w:w="140" w:type="dxa"/>
             </w:tcMar>
           </w:tcPr>
           <w:p>
@@ -2440,9 +2440,9 @@
             <w:shd w:fill="EEF5F8"/>
             <w:tcMar>
               <w:top w:w="100" w:type="dxa"/>
-              <w:start w:w="140" w:type="dxa"/>
+              <w:left w:w="140" w:type="dxa"/>
               <w:bottom w:w="100" w:type="dxa"/>
-              <w:end w:w="140" w:type="dxa"/>
+              <w:right w:w="140" w:type="dxa"/>
             </w:tcMar>
           </w:tcPr>
           <w:p>
@@ -2589,9 +2589,9 @@
             </w:tcBorders>
             <w:tcMar>
               <w:top w:w="120" w:type="dxa"/>
-              <w:start w:w="180" w:type="dxa"/>
+              <w:left w:w="180" w:type="dxa"/>
               <w:bottom w:w="120" w:type="dxa"/>
-              <w:end w:w="180" w:type="dxa"/>
+              <w:right w:w="180" w:type="dxa"/>
             </w:tcMar>
           </w:tcPr>
           <w:p>
@@ -2604,7 +2604,7 @@
                 <w:rFonts w:ascii="Aptos" w:hAnsi="Aptos" w:eastAsia="Microsoft YaHei"/>
                 <w:b/>
                 <w:color w:val="FFFFFF"/>
-                <w:sz w:val="19"/>
+                <w:sz w:val="18"/>
               </w:rPr>
               <w:t>问题</w:t>
             </w:r>
@@ -2625,9 +2625,9 @@
             </w:tcBorders>
             <w:tcMar>
               <w:top w:w="120" w:type="dxa"/>
-              <w:start w:w="180" w:type="dxa"/>
+              <w:left w:w="180" w:type="dxa"/>
               <w:bottom w:w="120" w:type="dxa"/>
-              <w:end w:w="180" w:type="dxa"/>
+              <w:right w:w="180" w:type="dxa"/>
             </w:tcMar>
           </w:tcPr>
           <w:p>
@@ -2640,7 +2640,7 @@
                 <w:rFonts w:ascii="Aptos" w:hAnsi="Aptos" w:eastAsia="Microsoft YaHei"/>
                 <w:b/>
                 <w:color w:val="FFFFFF"/>
-                <w:sz w:val="19"/>
+                <w:sz w:val="18"/>
               </w:rPr>
               <w:t>处理方法</w:t>
             </w:r>
@@ -2662,9 +2662,9 @@
             </w:tcBorders>
             <w:tcMar>
               <w:top w:w="120" w:type="dxa"/>
-              <w:start w:w="180" w:type="dxa"/>
+              <w:left w:w="180" w:type="dxa"/>
               <w:bottom w:w="120" w:type="dxa"/>
-              <w:end w:w="180" w:type="dxa"/>
+              <w:right w:w="180" w:type="dxa"/>
             </w:tcMar>
           </w:tcPr>
           <w:p>
@@ -2677,7 +2677,7 @@
                 <w:rFonts w:ascii="Aptos" w:hAnsi="Aptos" w:eastAsia="Microsoft YaHei"/>
                 <w:b w:val="0"/>
                 <w:color w:val="000000"/>
-                <w:sz w:val="19"/>
+                <w:sz w:val="18"/>
               </w:rPr>
               <w:t>Codex 找不到 Skill</w:t>
             </w:r>
@@ -2697,9 +2697,9 @@
             </w:tcBorders>
             <w:tcMar>
               <w:top w:w="120" w:type="dxa"/>
-              <w:start w:w="180" w:type="dxa"/>
+              <w:left w:w="180" w:type="dxa"/>
               <w:bottom w:w="120" w:type="dxa"/>
-              <w:end w:w="180" w:type="dxa"/>
+              <w:right w:w="180" w:type="dxa"/>
             </w:tcMar>
           </w:tcPr>
           <w:p>
@@ -2712,7 +2712,7 @@
                 <w:rFonts w:ascii="Aptos" w:hAnsi="Aptos" w:eastAsia="Microsoft YaHei"/>
                 <w:b w:val="0"/>
                 <w:color w:val="000000"/>
-                <w:sz w:val="19"/>
+                <w:sz w:val="18"/>
               </w:rPr>
               <w:t>检查安装路径和文件夹嵌套层级，然后重新开始一轮对话。</w:t>
             </w:r>
@@ -2734,9 +2734,9 @@
             </w:tcBorders>
             <w:tcMar>
               <w:top w:w="120" w:type="dxa"/>
-              <w:start w:w="180" w:type="dxa"/>
+              <w:left w:w="180" w:type="dxa"/>
               <w:bottom w:w="120" w:type="dxa"/>
-              <w:end w:w="180" w:type="dxa"/>
+              <w:right w:w="180" w:type="dxa"/>
             </w:tcMar>
           </w:tcPr>
           <w:p>
@@ -2749,7 +2749,7 @@
                 <w:rFonts w:ascii="Aptos" w:hAnsi="Aptos" w:eastAsia="Microsoft YaHei"/>
                 <w:b w:val="0"/>
                 <w:color w:val="000000"/>
-                <w:sz w:val="19"/>
+                <w:sz w:val="18"/>
               </w:rPr>
               <w:t>已有公司模板</w:t>
             </w:r>
@@ -2769,9 +2769,9 @@
             </w:tcBorders>
             <w:tcMar>
               <w:top w:w="120" w:type="dxa"/>
-              <w:start w:w="180" w:type="dxa"/>
+              <w:left w:w="180" w:type="dxa"/>
               <w:bottom w:w="120" w:type="dxa"/>
-              <w:end w:w="180" w:type="dxa"/>
+              <w:right w:w="180" w:type="dxa"/>
             </w:tcMar>
           </w:tcPr>
           <w:p>
@@ -2784,7 +2784,7 @@
                 <w:rFonts w:ascii="Aptos" w:hAnsi="Aptos" w:eastAsia="Microsoft YaHei"/>
                 <w:b w:val="0"/>
                 <w:color w:val="000000"/>
-                <w:sz w:val="19"/>
+                <w:sz w:val="18"/>
               </w:rPr>
               <w:t>继续使用公司模板；本 Skill 只补充模板未规定的细节。</w:t>
             </w:r>
@@ -2806,9 +2806,9 @@
             </w:tcBorders>
             <w:tcMar>
               <w:top w:w="120" w:type="dxa"/>
-              <w:start w:w="180" w:type="dxa"/>
+              <w:left w:w="180" w:type="dxa"/>
               <w:bottom w:w="120" w:type="dxa"/>
-              <w:end w:w="180" w:type="dxa"/>
+              <w:right w:w="180" w:type="dxa"/>
             </w:tcMar>
           </w:tcPr>
           <w:p>
@@ -2821,7 +2821,7 @@
                 <w:rFonts w:ascii="Aptos" w:hAnsi="Aptos" w:eastAsia="Microsoft YaHei"/>
                 <w:b w:val="0"/>
                 <w:color w:val="000000"/>
-                <w:sz w:val="19"/>
+                <w:sz w:val="18"/>
               </w:rPr>
               <w:t>只想修改一个表格</w:t>
             </w:r>
@@ -2841,9 +2841,9 @@
             </w:tcBorders>
             <w:tcMar>
               <w:top w:w="120" w:type="dxa"/>
-              <w:start w:w="180" w:type="dxa"/>
+              <w:left w:w="180" w:type="dxa"/>
               <w:bottom w:w="120" w:type="dxa"/>
-              <w:end w:w="180" w:type="dxa"/>
+              <w:right w:w="180" w:type="dxa"/>
             </w:tcMar>
           </w:tcPr>
           <w:p>
@@ -2856,7 +2856,7 @@
                 <w:rFonts w:ascii="Aptos" w:hAnsi="Aptos" w:eastAsia="Microsoft YaHei"/>
                 <w:b w:val="0"/>
                 <w:color w:val="000000"/>
-                <w:sz w:val="19"/>
+                <w:sz w:val="18"/>
               </w:rPr>
               <w:t>明确指定修改范围，Codex 必须保留其他内容和样式。</w:t>
             </w:r>
@@ -2878,9 +2878,9 @@
             </w:tcBorders>
             <w:tcMar>
               <w:top w:w="120" w:type="dxa"/>
-              <w:start w:w="180" w:type="dxa"/>
+              <w:left w:w="180" w:type="dxa"/>
               <w:bottom w:w="120" w:type="dxa"/>
-              <w:end w:w="180" w:type="dxa"/>
+              <w:right w:w="180" w:type="dxa"/>
             </w:tcMar>
           </w:tcPr>
           <w:p>
@@ -2893,7 +2893,7 @@
                 <w:rFonts w:ascii="Aptos" w:hAnsi="Aptos" w:eastAsia="Microsoft YaHei"/>
                 <w:b w:val="0"/>
                 <w:color w:val="000000"/>
-                <w:sz w:val="19"/>
+                <w:sz w:val="18"/>
               </w:rPr>
               <w:t>需要更换品牌色</w:t>
             </w:r>
@@ -2913,9 +2913,9 @@
             </w:tcBorders>
             <w:tcMar>
               <w:top w:w="120" w:type="dxa"/>
-              <w:start w:w="180" w:type="dxa"/>
+              <w:left w:w="180" w:type="dxa"/>
               <w:bottom w:w="120" w:type="dxa"/>
-              <w:end w:w="180" w:type="dxa"/>
+              <w:right w:w="180" w:type="dxa"/>
             </w:tcMar>
           </w:tcPr>
           <w:p>
@@ -2928,7 +2928,7 @@
                 <w:rFonts w:ascii="Aptos" w:hAnsi="Aptos" w:eastAsia="Microsoft YaHei"/>
                 <w:b w:val="0"/>
                 <w:color w:val="000000"/>
-                <w:sz w:val="19"/>
+                <w:sz w:val="18"/>
               </w:rPr>
               <w:t>修改 style-standard.md 中的颜色定义，并保持全篇一致。</w:t>
             </w:r>
@@ -2950,9 +2950,9 @@
             </w:tcBorders>
             <w:tcMar>
               <w:top w:w="120" w:type="dxa"/>
-              <w:start w:w="180" w:type="dxa"/>
+              <w:left w:w="180" w:type="dxa"/>
               <w:bottom w:w="120" w:type="dxa"/>
-              <w:end w:w="180" w:type="dxa"/>
+              <w:right w:w="180" w:type="dxa"/>
             </w:tcMar>
           </w:tcPr>
           <w:p>
@@ -2965,7 +2965,7 @@
                 <w:rFonts w:ascii="Aptos" w:hAnsi="Aptos" w:eastAsia="Microsoft YaHei"/>
                 <w:b w:val="0"/>
                 <w:color w:val="000000"/>
-                <w:sz w:val="19"/>
+                <w:sz w:val="18"/>
               </w:rPr>
               <w:t>Git 更新失败</w:t>
             </w:r>
@@ -2985,9 +2985,9 @@
             </w:tcBorders>
             <w:tcMar>
               <w:top w:w="120" w:type="dxa"/>
-              <w:start w:w="180" w:type="dxa"/>
+              <w:left w:w="180" w:type="dxa"/>
               <w:bottom w:w="120" w:type="dxa"/>
-              <w:end w:w="180" w:type="dxa"/>
+              <w:right w:w="180" w:type="dxa"/>
             </w:tcMar>
           </w:tcPr>
           <w:p>
@@ -3000,7 +3000,7 @@
                 <w:rFonts w:ascii="Aptos" w:hAnsi="Aptos" w:eastAsia="Microsoft YaHei"/>
                 <w:b w:val="0"/>
                 <w:color w:val="000000"/>
-                <w:sz w:val="19"/>
+                <w:sz w:val="18"/>
               </w:rPr>
               <w:t>检查网络、仓库地址和 GitHub 权限；不要把凭据写入 Skill。</w:t>
             </w:r>

</xml_diff>

<commit_message>
Align body and table typography
</commit_message>
<xml_diff>
--- a/docs/Codex-Document-Standard-使用教程.docx
+++ b/docs/Codex-Document-Standard-使用教程.docx
@@ -43,7 +43,7 @@
           <w:rFonts w:ascii="Aptos" w:hAnsi="Aptos" w:eastAsia="Microsoft YaHei"/>
           <w:b w:val="0"/>
           <w:color w:val="000000"/>
-          <w:sz w:val="21"/>
+          <w:sz w:val="18"/>
         </w:rPr>
         <w:t>这份教程帮助使用者安装并使用 Codex Document Standard。安装完成后，Codex 可以在创建报告、计划、复盘、会议纪要、方案和工作总结时，自动应用一致的标题、正文、说明块和表格规范。</w:t>
       </w:r>
@@ -119,7 +119,7 @@
           <w:rFonts w:ascii="Aptos" w:hAnsi="Aptos" w:eastAsia="Microsoft YaHei"/>
           <w:b w:val="0"/>
           <w:color w:val="000000"/>
-          <w:sz w:val="21"/>
+          <w:sz w:val="18"/>
         </w:rPr>
         <w:t>该 Skill 面向专业工作文档，重点解决不同任务之间标题、字体、颜色、间距和表格样式不一致的问题。</w:t>
       </w:r>
@@ -155,9 +155,9 @@
             </w:tcBorders>
             <w:tcMar>
               <w:top w:w="120" w:type="dxa"/>
-              <w:left w:w="180" w:type="dxa"/>
+              <w:left w:w="90" w:type="dxa"/>
               <w:bottom w:w="120" w:type="dxa"/>
-              <w:right w:w="180" w:type="dxa"/>
+              <w:right w:w="90" w:type="dxa"/>
             </w:tcMar>
           </w:tcPr>
           <w:p>
@@ -191,9 +191,9 @@
             </w:tcBorders>
             <w:tcMar>
               <w:top w:w="120" w:type="dxa"/>
-              <w:left w:w="180" w:type="dxa"/>
+              <w:left w:w="90" w:type="dxa"/>
               <w:bottom w:w="120" w:type="dxa"/>
-              <w:right w:w="180" w:type="dxa"/>
+              <w:right w:w="90" w:type="dxa"/>
             </w:tcMar>
           </w:tcPr>
           <w:p>
@@ -227,9 +227,9 @@
             </w:tcBorders>
             <w:tcMar>
               <w:top w:w="120" w:type="dxa"/>
-              <w:left w:w="180" w:type="dxa"/>
+              <w:left w:w="90" w:type="dxa"/>
               <w:bottom w:w="120" w:type="dxa"/>
-              <w:right w:w="180" w:type="dxa"/>
+              <w:right w:w="90" w:type="dxa"/>
             </w:tcMar>
           </w:tcPr>
           <w:p>
@@ -264,9 +264,9 @@
             </w:tcBorders>
             <w:tcMar>
               <w:top w:w="120" w:type="dxa"/>
-              <w:left w:w="180" w:type="dxa"/>
+              <w:left w:w="90" w:type="dxa"/>
               <w:bottom w:w="120" w:type="dxa"/>
-              <w:right w:w="180" w:type="dxa"/>
+              <w:right w:w="90" w:type="dxa"/>
             </w:tcMar>
           </w:tcPr>
           <w:p>
@@ -299,9 +299,9 @@
             </w:tcBorders>
             <w:tcMar>
               <w:top w:w="120" w:type="dxa"/>
-              <w:left w:w="180" w:type="dxa"/>
+              <w:left w:w="90" w:type="dxa"/>
               <w:bottom w:w="120" w:type="dxa"/>
-              <w:right w:w="180" w:type="dxa"/>
+              <w:right w:w="90" w:type="dxa"/>
             </w:tcMar>
           </w:tcPr>
           <w:p>
@@ -334,9 +334,9 @@
             </w:tcBorders>
             <w:tcMar>
               <w:top w:w="120" w:type="dxa"/>
-              <w:left w:w="180" w:type="dxa"/>
+              <w:left w:w="90" w:type="dxa"/>
               <w:bottom w:w="120" w:type="dxa"/>
-              <w:right w:w="180" w:type="dxa"/>
+              <w:right w:w="90" w:type="dxa"/>
             </w:tcMar>
           </w:tcPr>
           <w:p>
@@ -371,9 +371,9 @@
             </w:tcBorders>
             <w:tcMar>
               <w:top w:w="120" w:type="dxa"/>
-              <w:left w:w="180" w:type="dxa"/>
+              <w:left w:w="90" w:type="dxa"/>
               <w:bottom w:w="120" w:type="dxa"/>
-              <w:right w:w="180" w:type="dxa"/>
+              <w:right w:w="90" w:type="dxa"/>
             </w:tcMar>
           </w:tcPr>
           <w:p>
@@ -406,9 +406,9 @@
             </w:tcBorders>
             <w:tcMar>
               <w:top w:w="120" w:type="dxa"/>
-              <w:left w:w="180" w:type="dxa"/>
+              <w:left w:w="90" w:type="dxa"/>
               <w:bottom w:w="120" w:type="dxa"/>
-              <w:right w:w="180" w:type="dxa"/>
+              <w:right w:w="90" w:type="dxa"/>
             </w:tcMar>
           </w:tcPr>
           <w:p>
@@ -441,9 +441,9 @@
             </w:tcBorders>
             <w:tcMar>
               <w:top w:w="120" w:type="dxa"/>
-              <w:left w:w="180" w:type="dxa"/>
+              <w:left w:w="90" w:type="dxa"/>
               <w:bottom w:w="120" w:type="dxa"/>
-              <w:right w:w="180" w:type="dxa"/>
+              <w:right w:w="90" w:type="dxa"/>
             </w:tcMar>
           </w:tcPr>
           <w:p>
@@ -478,9 +478,9 @@
             </w:tcBorders>
             <w:tcMar>
               <w:top w:w="120" w:type="dxa"/>
-              <w:left w:w="180" w:type="dxa"/>
+              <w:left w:w="90" w:type="dxa"/>
               <w:bottom w:w="120" w:type="dxa"/>
-              <w:right w:w="180" w:type="dxa"/>
+              <w:right w:w="90" w:type="dxa"/>
             </w:tcMar>
           </w:tcPr>
           <w:p>
@@ -513,9 +513,9 @@
             </w:tcBorders>
             <w:tcMar>
               <w:top w:w="120" w:type="dxa"/>
-              <w:left w:w="180" w:type="dxa"/>
+              <w:left w:w="90" w:type="dxa"/>
               <w:bottom w:w="120" w:type="dxa"/>
-              <w:right w:w="180" w:type="dxa"/>
+              <w:right w:w="90" w:type="dxa"/>
             </w:tcMar>
           </w:tcPr>
           <w:p>
@@ -548,9 +548,9 @@
             </w:tcBorders>
             <w:tcMar>
               <w:top w:w="120" w:type="dxa"/>
-              <w:left w:w="180" w:type="dxa"/>
+              <w:left w:w="90" w:type="dxa"/>
               <w:bottom w:w="120" w:type="dxa"/>
-              <w:right w:w="180" w:type="dxa"/>
+              <w:right w:w="90" w:type="dxa"/>
             </w:tcMar>
           </w:tcPr>
           <w:p>
@@ -585,9 +585,9 @@
             </w:tcBorders>
             <w:tcMar>
               <w:top w:w="120" w:type="dxa"/>
-              <w:left w:w="180" w:type="dxa"/>
+              <w:left w:w="90" w:type="dxa"/>
               <w:bottom w:w="120" w:type="dxa"/>
-              <w:right w:w="180" w:type="dxa"/>
+              <w:right w:w="90" w:type="dxa"/>
             </w:tcMar>
           </w:tcPr>
           <w:p>
@@ -620,9 +620,9 @@
             </w:tcBorders>
             <w:tcMar>
               <w:top w:w="120" w:type="dxa"/>
-              <w:left w:w="180" w:type="dxa"/>
+              <w:left w:w="90" w:type="dxa"/>
               <w:bottom w:w="120" w:type="dxa"/>
-              <w:right w:w="180" w:type="dxa"/>
+              <w:right w:w="90" w:type="dxa"/>
             </w:tcMar>
           </w:tcPr>
           <w:p>
@@ -655,9 +655,9 @@
             </w:tcBorders>
             <w:tcMar>
               <w:top w:w="120" w:type="dxa"/>
-              <w:left w:w="180" w:type="dxa"/>
+              <w:left w:w="90" w:type="dxa"/>
               <w:bottom w:w="120" w:type="dxa"/>
-              <w:right w:w="180" w:type="dxa"/>
+              <w:right w:w="90" w:type="dxa"/>
             </w:tcMar>
           </w:tcPr>
           <w:p>
@@ -692,7 +692,7 @@
           <w:rFonts w:ascii="Aptos" w:hAnsi="Aptos" w:eastAsia="Microsoft YaHei"/>
           <w:b w:val="0"/>
           <w:color w:val="000000"/>
-          <w:sz w:val="21"/>
+          <w:sz w:val="18"/>
         </w:rPr>
         <w:t>README、源代码、PPT、Excel 和营销视觉稿默认不在适用范围内。用户明确要求沿用同一视觉语言时，可以例外使用。</w:t>
       </w:r>
@@ -716,7 +716,7 @@
           <w:rFonts w:ascii="Aptos" w:hAnsi="Aptos" w:eastAsia="Microsoft YaHei"/>
           <w:b w:val="0"/>
           <w:color w:val="000000"/>
-          <w:sz w:val="21"/>
+          <w:sz w:val="18"/>
         </w:rPr>
         <w:t>已安装并可以正常使用 Codex。</w:t>
       </w:r>
@@ -731,7 +731,7 @@
           <w:rFonts w:ascii="Aptos" w:hAnsi="Aptos" w:eastAsia="Microsoft YaHei"/>
           <w:b w:val="0"/>
           <w:color w:val="000000"/>
-          <w:sz w:val="21"/>
+          <w:sz w:val="18"/>
         </w:rPr>
         <w:t>可以访问 GitHub。</w:t>
       </w:r>
@@ -746,7 +746,7 @@
           <w:rFonts w:ascii="Aptos" w:hAnsi="Aptos" w:eastAsia="Microsoft YaHei"/>
           <w:b w:val="0"/>
           <w:color w:val="000000"/>
-          <w:sz w:val="21"/>
+          <w:sz w:val="18"/>
         </w:rPr>
         <w:t>目标目录中不存在同名的 codex-document-standard Skill。</w:t>
       </w:r>
@@ -761,7 +761,7 @@
           <w:rFonts w:ascii="Aptos" w:hAnsi="Aptos" w:eastAsia="Microsoft YaHei"/>
           <w:b w:val="0"/>
           <w:color w:val="000000"/>
-          <w:sz w:val="21"/>
+          <w:sz w:val="18"/>
         </w:rPr>
         <w:t>安装私人仓库时，需要提前配置相应的 GitHub 访问权限；公开仓库无需额外凭据。</w:t>
       </w:r>
@@ -784,7 +784,7 @@
           <w:rFonts w:ascii="Aptos" w:hAnsi="Aptos" w:eastAsia="Microsoft YaHei"/>
           <w:b w:val="0"/>
           <w:color w:val="000000"/>
-          <w:sz w:val="21"/>
+          <w:sz w:val="18"/>
         </w:rPr>
         <w:t>本仓库已公开发布。使用者无需登录 GitHub，可以直接查看仓库、下载 Word 教程或使用 Git 克隆。</w:t>
       </w:r>
@@ -798,7 +798,7 @@
           <w:rFonts w:ascii="Aptos" w:hAnsi="Aptos" w:eastAsia="Microsoft YaHei"/>
           <w:b/>
           <w:color w:val="2F75B5"/>
-          <w:sz w:val="21"/>
+          <w:sz w:val="18"/>
         </w:rPr>
         <w:t>仓库主页：</w:t>
       </w:r>
@@ -821,7 +821,7 @@
           <w:rFonts w:ascii="Aptos" w:hAnsi="Aptos" w:eastAsia="Microsoft YaHei"/>
           <w:b/>
           <w:color w:val="2F75B5"/>
-          <w:sz w:val="21"/>
+          <w:sz w:val="18"/>
         </w:rPr>
         <w:t>Word 使用教程：</w:t>
       </w:r>
@@ -915,7 +915,7 @@
           <w:rFonts w:ascii="Aptos" w:hAnsi="Aptos" w:eastAsia="Microsoft YaHei"/>
           <w:b w:val="0"/>
           <w:color w:val="000000"/>
-          <w:sz w:val="21"/>
+          <w:sz w:val="18"/>
         </w:rPr>
         <w:t>在 Codex 中发送下面的指令。Codex 会调用 skill-installer，将仓库根目录安装为 codex-document-standard。</w:t>
       </w:r>
@@ -997,7 +997,7 @@
           <w:rFonts w:ascii="Aptos" w:hAnsi="Aptos" w:eastAsia="Microsoft YaHei"/>
           <w:b w:val="0"/>
           <w:color w:val="000000"/>
-          <w:sz w:val="21"/>
+          <w:sz w:val="18"/>
         </w:rPr>
         <w:t>安装完成后重新开始一轮对话。Skill 会在下一轮被发现并参与任务判断。</w:t>
       </w:r>
@@ -1148,7 +1148,7 @@
           <w:rFonts w:ascii="Aptos" w:hAnsi="Aptos" w:eastAsia="Microsoft YaHei"/>
           <w:b w:val="0"/>
           <w:color w:val="000000"/>
-          <w:sz w:val="21"/>
+          <w:sz w:val="18"/>
         </w:rPr>
         <w:t>在 GitHub 仓库页面选择 Code 和 Download ZIP。</w:t>
       </w:r>
@@ -1163,7 +1163,7 @@
           <w:rFonts w:ascii="Aptos" w:hAnsi="Aptos" w:eastAsia="Microsoft YaHei"/>
           <w:b w:val="0"/>
           <w:color w:val="000000"/>
-          <w:sz w:val="21"/>
+          <w:sz w:val="18"/>
         </w:rPr>
         <w:t>解压后将文件夹重命名为 codex-document-standard。</w:t>
       </w:r>
@@ -1178,7 +1178,7 @@
           <w:rFonts w:ascii="Aptos" w:hAnsi="Aptos" w:eastAsia="Microsoft YaHei"/>
           <w:b w:val="0"/>
           <w:color w:val="000000"/>
-          <w:sz w:val="21"/>
+          <w:sz w:val="18"/>
         </w:rPr>
         <w:t>将文件夹放入用户目录下的 .codex/skills。</w:t>
       </w:r>
@@ -1193,7 +1193,7 @@
           <w:rFonts w:ascii="Aptos" w:hAnsi="Aptos" w:eastAsia="Microsoft YaHei"/>
           <w:b w:val="0"/>
           <w:color w:val="000000"/>
-          <w:sz w:val="21"/>
+          <w:sz w:val="18"/>
         </w:rPr>
         <w:t>确认 SKILL.md 直接位于 codex-document-standard 文件夹内，不要多嵌套一层目录。</w:t>
       </w:r>
@@ -1208,7 +1208,7 @@
           <w:rFonts w:ascii="Aptos" w:hAnsi="Aptos" w:eastAsia="Microsoft YaHei"/>
           <w:b w:val="0"/>
           <w:color w:val="000000"/>
-          <w:sz w:val="21"/>
+          <w:sz w:val="18"/>
         </w:rPr>
         <w:t>重新开始一轮 Codex 对话。</w:t>
       </w:r>
@@ -1231,7 +1231,7 @@
           <w:rFonts w:ascii="Aptos" w:hAnsi="Aptos" w:eastAsia="Microsoft YaHei"/>
           <w:b w:val="0"/>
           <w:color w:val="000000"/>
-          <w:sz w:val="21"/>
+          <w:sz w:val="18"/>
         </w:rPr>
         <w:t>首次使用建议显式调用 Skill，以便快速确认名称和加载路径正确。</w:t>
       </w:r>
@@ -1289,7 +1289,7 @@
           <w:rFonts w:ascii="Aptos" w:hAnsi="Aptos" w:eastAsia="Microsoft YaHei"/>
           <w:b w:val="0"/>
           <w:color w:val="000000"/>
-          <w:sz w:val="21"/>
+          <w:sz w:val="18"/>
         </w:rPr>
         <w:t>输出满足以下特征时，说明 Skill 已被正确应用：</w:t>
       </w:r>
@@ -1304,7 +1304,7 @@
           <w:rFonts w:ascii="Aptos" w:hAnsi="Aptos" w:eastAsia="Microsoft YaHei"/>
           <w:b w:val="0"/>
           <w:color w:val="000000"/>
-          <w:sz w:val="21"/>
+          <w:sz w:val="18"/>
         </w:rPr>
         <w:t>主色为 #2F75B5，深色表头为 #005D8D。</w:t>
       </w:r>
@@ -1319,7 +1319,7 @@
           <w:rFonts w:ascii="Aptos" w:hAnsi="Aptos" w:eastAsia="Microsoft YaHei"/>
           <w:b w:val="0"/>
           <w:color w:val="000000"/>
-          <w:sz w:val="21"/>
+          <w:sz w:val="18"/>
         </w:rPr>
         <w:t>标题使用连续的 H1 到 H4 层级。</w:t>
       </w:r>
@@ -1334,7 +1334,7 @@
           <w:rFonts w:ascii="Aptos" w:hAnsi="Aptos" w:eastAsia="Microsoft YaHei"/>
           <w:b w:val="0"/>
           <w:color w:val="000000"/>
-          <w:sz w:val="21"/>
+          <w:sz w:val="18"/>
         </w:rPr>
         <w:t>正文默认 10.5 pt，行距 1.2。</w:t>
       </w:r>
@@ -1349,7 +1349,7 @@
           <w:rFonts w:ascii="Aptos" w:hAnsi="Aptos" w:eastAsia="Microsoft YaHei"/>
           <w:b w:val="0"/>
           <w:color w:val="000000"/>
-          <w:sz w:val="21"/>
+          <w:sz w:val="18"/>
         </w:rPr>
         <w:t>文字左对齐，数字右对齐，日期和状态居中。</w:t>
       </w:r>
@@ -1364,7 +1364,7 @@
           <w:rFonts w:ascii="Aptos" w:hAnsi="Aptos" w:eastAsia="Microsoft YaHei"/>
           <w:b w:val="0"/>
           <w:color w:val="000000"/>
-          <w:sz w:val="21"/>
+          <w:sz w:val="18"/>
         </w:rPr>
         <w:t>空值使用 —，日期使用 YYYY-MM-DD。</w:t>
       </w:r>
@@ -1449,7 +1449,7 @@
           <w:rFonts w:ascii="Aptos" w:hAnsi="Aptos" w:eastAsia="Microsoft YaHei"/>
           <w:b w:val="0"/>
           <w:color w:val="000000"/>
-          <w:sz w:val="21"/>
+          <w:sz w:val="18"/>
         </w:rPr>
         <w:t>安装后，只要任务属于专业工作文档，Codex 会根据 Skill 描述自动判断是否加载。</w:t>
       </w:r>
@@ -1516,7 +1516,7 @@
           <w:rFonts w:ascii="Aptos" w:hAnsi="Aptos" w:eastAsia="Microsoft YaHei"/>
           <w:b w:val="0"/>
           <w:color w:val="000000"/>
-          <w:sz w:val="21"/>
+          <w:sz w:val="18"/>
         </w:rPr>
         <w:t>需要确保使用该规范时，在请求中直接写出 Skill 名称。</w:t>
       </w:r>
@@ -1616,9 +1616,9 @@
             </w:tcBorders>
             <w:tcMar>
               <w:top w:w="120" w:type="dxa"/>
-              <w:left w:w="180" w:type="dxa"/>
+              <w:left w:w="90" w:type="dxa"/>
               <w:bottom w:w="120" w:type="dxa"/>
-              <w:right w:w="180" w:type="dxa"/>
+              <w:right w:w="90" w:type="dxa"/>
             </w:tcMar>
           </w:tcPr>
           <w:p>
@@ -1652,9 +1652,9 @@
             </w:tcBorders>
             <w:tcMar>
               <w:top w:w="120" w:type="dxa"/>
-              <w:left w:w="180" w:type="dxa"/>
+              <w:left w:w="90" w:type="dxa"/>
               <w:bottom w:w="120" w:type="dxa"/>
-              <w:right w:w="180" w:type="dxa"/>
+              <w:right w:w="90" w:type="dxa"/>
             </w:tcMar>
           </w:tcPr>
           <w:p>
@@ -1689,9 +1689,9 @@
             </w:tcBorders>
             <w:tcMar>
               <w:top w:w="120" w:type="dxa"/>
-              <w:left w:w="180" w:type="dxa"/>
+              <w:left w:w="90" w:type="dxa"/>
               <w:bottom w:w="120" w:type="dxa"/>
-              <w:right w:w="180" w:type="dxa"/>
+              <w:right w:w="90" w:type="dxa"/>
             </w:tcMar>
           </w:tcPr>
           <w:p>
@@ -1724,9 +1724,9 @@
             </w:tcBorders>
             <w:tcMar>
               <w:top w:w="120" w:type="dxa"/>
-              <w:left w:w="180" w:type="dxa"/>
+              <w:left w:w="90" w:type="dxa"/>
               <w:bottom w:w="120" w:type="dxa"/>
-              <w:right w:w="180" w:type="dxa"/>
+              <w:right w:w="90" w:type="dxa"/>
             </w:tcMar>
           </w:tcPr>
           <w:p>
@@ -1761,9 +1761,9 @@
             </w:tcBorders>
             <w:tcMar>
               <w:top w:w="120" w:type="dxa"/>
-              <w:left w:w="180" w:type="dxa"/>
+              <w:left w:w="90" w:type="dxa"/>
               <w:bottom w:w="120" w:type="dxa"/>
-              <w:right w:w="180" w:type="dxa"/>
+              <w:right w:w="90" w:type="dxa"/>
             </w:tcMar>
           </w:tcPr>
           <w:p>
@@ -1796,9 +1796,9 @@
             </w:tcBorders>
             <w:tcMar>
               <w:top w:w="120" w:type="dxa"/>
-              <w:left w:w="180" w:type="dxa"/>
+              <w:left w:w="90" w:type="dxa"/>
               <w:bottom w:w="120" w:type="dxa"/>
-              <w:right w:w="180" w:type="dxa"/>
+              <w:right w:w="90" w:type="dxa"/>
             </w:tcMar>
           </w:tcPr>
           <w:p>
@@ -1833,9 +1833,9 @@
             </w:tcBorders>
             <w:tcMar>
               <w:top w:w="120" w:type="dxa"/>
-              <w:left w:w="180" w:type="dxa"/>
+              <w:left w:w="90" w:type="dxa"/>
               <w:bottom w:w="120" w:type="dxa"/>
-              <w:right w:w="180" w:type="dxa"/>
+              <w:right w:w="90" w:type="dxa"/>
             </w:tcMar>
           </w:tcPr>
           <w:p>
@@ -1868,9 +1868,9 @@
             </w:tcBorders>
             <w:tcMar>
               <w:top w:w="120" w:type="dxa"/>
-              <w:left w:w="180" w:type="dxa"/>
+              <w:left w:w="90" w:type="dxa"/>
               <w:bottom w:w="120" w:type="dxa"/>
-              <w:right w:w="180" w:type="dxa"/>
+              <w:right w:w="90" w:type="dxa"/>
             </w:tcMar>
           </w:tcPr>
           <w:p>
@@ -1905,9 +1905,9 @@
             </w:tcBorders>
             <w:tcMar>
               <w:top w:w="120" w:type="dxa"/>
-              <w:left w:w="180" w:type="dxa"/>
+              <w:left w:w="90" w:type="dxa"/>
               <w:bottom w:w="120" w:type="dxa"/>
-              <w:right w:w="180" w:type="dxa"/>
+              <w:right w:w="90" w:type="dxa"/>
             </w:tcMar>
           </w:tcPr>
           <w:p>
@@ -1940,9 +1940,9 @@
             </w:tcBorders>
             <w:tcMar>
               <w:top w:w="120" w:type="dxa"/>
-              <w:left w:w="180" w:type="dxa"/>
+              <w:left w:w="90" w:type="dxa"/>
               <w:bottom w:w="120" w:type="dxa"/>
-              <w:right w:w="180" w:type="dxa"/>
+              <w:right w:w="90" w:type="dxa"/>
             </w:tcMar>
           </w:tcPr>
           <w:p>
@@ -1957,7 +1957,7 @@
                 <w:color w:val="000000"/>
                 <w:sz w:val="18"/>
               </w:rPr>
-              <w:t>10.5 pt  左对齐  1.2 行距  段前 2  段后 4</w:t>
+              <w:t>9 pt  左对齐  1.2 行距  段前 2  段后 4</w:t>
             </w:r>
           </w:p>
         </w:tc>
@@ -1977,9 +1977,9 @@
             </w:tcBorders>
             <w:tcMar>
               <w:top w:w="120" w:type="dxa"/>
-              <w:left w:w="180" w:type="dxa"/>
+              <w:left w:w="90" w:type="dxa"/>
               <w:bottom w:w="120" w:type="dxa"/>
-              <w:right w:w="180" w:type="dxa"/>
+              <w:right w:w="90" w:type="dxa"/>
             </w:tcMar>
           </w:tcPr>
           <w:p>
@@ -2012,9 +2012,9 @@
             </w:tcBorders>
             <w:tcMar>
               <w:top w:w="120" w:type="dxa"/>
-              <w:left w:w="180" w:type="dxa"/>
+              <w:left w:w="90" w:type="dxa"/>
               <w:bottom w:w="120" w:type="dxa"/>
-              <w:right w:w="180" w:type="dxa"/>
+              <w:right w:w="90" w:type="dxa"/>
             </w:tcMar>
           </w:tcPr>
           <w:p>
@@ -2049,9 +2049,9 @@
             </w:tcBorders>
             <w:tcMar>
               <w:top w:w="120" w:type="dxa"/>
-              <w:left w:w="180" w:type="dxa"/>
+              <w:left w:w="90" w:type="dxa"/>
               <w:bottom w:w="120" w:type="dxa"/>
-              <w:right w:w="180" w:type="dxa"/>
+              <w:right w:w="90" w:type="dxa"/>
             </w:tcMar>
           </w:tcPr>
           <w:p>
@@ -2084,9 +2084,9 @@
             </w:tcBorders>
             <w:tcMar>
               <w:top w:w="120" w:type="dxa"/>
-              <w:left w:w="180" w:type="dxa"/>
+              <w:left w:w="90" w:type="dxa"/>
               <w:bottom w:w="120" w:type="dxa"/>
-              <w:right w:w="180" w:type="dxa"/>
+              <w:right w:w="90" w:type="dxa"/>
             </w:tcMar>
           </w:tcPr>
           <w:p>
@@ -2121,9 +2121,9 @@
             </w:tcBorders>
             <w:tcMar>
               <w:top w:w="120" w:type="dxa"/>
-              <w:left w:w="180" w:type="dxa"/>
+              <w:left w:w="90" w:type="dxa"/>
               <w:bottom w:w="120" w:type="dxa"/>
-              <w:right w:w="180" w:type="dxa"/>
+              <w:right w:w="90" w:type="dxa"/>
             </w:tcMar>
           </w:tcPr>
           <w:p>
@@ -2156,9 +2156,9 @@
             </w:tcBorders>
             <w:tcMar>
               <w:top w:w="120" w:type="dxa"/>
-              <w:left w:w="180" w:type="dxa"/>
+              <w:left w:w="90" w:type="dxa"/>
               <w:bottom w:w="120" w:type="dxa"/>
-              <w:right w:w="180" w:type="dxa"/>
+              <w:right w:w="90" w:type="dxa"/>
             </w:tcMar>
           </w:tcPr>
           <w:p>
@@ -2193,9 +2193,9 @@
             </w:tcBorders>
             <w:tcMar>
               <w:top w:w="120" w:type="dxa"/>
-              <w:left w:w="180" w:type="dxa"/>
+              <w:left w:w="90" w:type="dxa"/>
               <w:bottom w:w="120" w:type="dxa"/>
-              <w:right w:w="180" w:type="dxa"/>
+              <w:right w:w="90" w:type="dxa"/>
             </w:tcMar>
           </w:tcPr>
           <w:p>
@@ -2228,9 +2228,9 @@
             </w:tcBorders>
             <w:tcMar>
               <w:top w:w="120" w:type="dxa"/>
-              <w:left w:w="180" w:type="dxa"/>
+              <w:left w:w="90" w:type="dxa"/>
               <w:bottom w:w="120" w:type="dxa"/>
-              <w:right w:w="180" w:type="dxa"/>
+              <w:right w:w="90" w:type="dxa"/>
             </w:tcMar>
           </w:tcPr>
           <w:p>
@@ -2274,7 +2274,7 @@
           <w:rFonts w:ascii="Aptos" w:hAnsi="Aptos" w:eastAsia="Microsoft YaHei"/>
           <w:b w:val="0"/>
           <w:color w:val="000000"/>
-          <w:sz w:val="21"/>
+          <w:sz w:val="18"/>
         </w:rPr>
         <w:t>当不同规则发生冲突时，按以下顺序执行：</w:t>
       </w:r>
@@ -2289,7 +2289,7 @@
           <w:rFonts w:ascii="Aptos" w:hAnsi="Aptos" w:eastAsia="Microsoft YaHei"/>
           <w:b w:val="0"/>
           <w:color w:val="000000"/>
-          <w:sz w:val="21"/>
+          <w:sz w:val="18"/>
         </w:rPr>
         <w:t>用户本次明确要求。</w:t>
       </w:r>
@@ -2304,7 +2304,7 @@
           <w:rFonts w:ascii="Aptos" w:hAnsi="Aptos" w:eastAsia="Microsoft YaHei"/>
           <w:b w:val="0"/>
           <w:color w:val="000000"/>
-          <w:sz w:val="21"/>
+          <w:sz w:val="18"/>
         </w:rPr>
         <w:t>用户提供的原模板或公司模板。</w:t>
       </w:r>
@@ -2319,7 +2319,7 @@
           <w:rFonts w:ascii="Aptos" w:hAnsi="Aptos" w:eastAsia="Microsoft YaHei"/>
           <w:b w:val="0"/>
           <w:color w:val="000000"/>
-          <w:sz w:val="21"/>
+          <w:sz w:val="18"/>
         </w:rPr>
         <w:t>Codex Document Standard 默认规范。</w:t>
       </w:r>
@@ -2333,7 +2333,7 @@
           <w:rFonts w:ascii="Aptos" w:hAnsi="Aptos" w:eastAsia="Microsoft YaHei"/>
           <w:b w:val="0"/>
           <w:color w:val="000000"/>
-          <w:sz w:val="21"/>
+          <w:sz w:val="18"/>
         </w:rPr>
         <w:t>编辑现有文档时，只修改用户授权的范围。不得为了统一样式而覆盖全文、重建整张表，或改动未授权的标题、固定说明、表头、颜色、列宽和合并关系。</w:t>
       </w:r>
@@ -2356,7 +2356,7 @@
           <w:rFonts w:ascii="Aptos" w:hAnsi="Aptos" w:eastAsia="Microsoft YaHei"/>
           <w:b w:val="0"/>
           <w:color w:val="000000"/>
-          <w:sz w:val="21"/>
+          <w:sz w:val="18"/>
         </w:rPr>
         <w:t>使用 Git 安装时，可以拉取仓库最新版本。</w:t>
       </w:r>
@@ -2485,7 +2485,7 @@
           <w:rFonts w:ascii="Aptos" w:hAnsi="Aptos" w:eastAsia="Microsoft YaHei"/>
           <w:b w:val="0"/>
           <w:color w:val="000000"/>
-          <w:sz w:val="21"/>
+          <w:sz w:val="18"/>
         </w:rPr>
         <w:t>需要改变品牌色、字体或业务字段时，修改 references/style-standard.md。建议保留以下约束：</w:t>
       </w:r>
@@ -2500,7 +2500,7 @@
           <w:rFonts w:ascii="Aptos" w:hAnsi="Aptos" w:eastAsia="Microsoft YaHei"/>
           <w:b w:val="0"/>
           <w:color w:val="000000"/>
-          <w:sz w:val="21"/>
+          <w:sz w:val="18"/>
         </w:rPr>
         <w:t>用户要求和公司模板优先。</w:t>
       </w:r>
@@ -2515,7 +2515,7 @@
           <w:rFonts w:ascii="Aptos" w:hAnsi="Aptos" w:eastAsia="Microsoft YaHei"/>
           <w:b w:val="0"/>
           <w:color w:val="000000"/>
-          <w:sz w:val="21"/>
+          <w:sz w:val="18"/>
         </w:rPr>
         <w:t>编辑现有文档时只修改授权范围。</w:t>
       </w:r>
@@ -2530,7 +2530,7 @@
           <w:rFonts w:ascii="Aptos" w:hAnsi="Aptos" w:eastAsia="Microsoft YaHei"/>
           <w:b w:val="0"/>
           <w:color w:val="000000"/>
-          <w:sz w:val="21"/>
+          <w:sz w:val="18"/>
         </w:rPr>
         <w:t>不伪造事实、数据、日期、责任人和链接。</w:t>
       </w:r>
@@ -2545,7 +2545,7 @@
           <w:rFonts w:ascii="Aptos" w:hAnsi="Aptos" w:eastAsia="Microsoft YaHei"/>
           <w:b w:val="0"/>
           <w:color w:val="000000"/>
-          <w:sz w:val="21"/>
+          <w:sz w:val="18"/>
         </w:rPr>
         <w:t>交付前检查实际渲染结果。</w:t>
       </w:r>
@@ -2589,9 +2589,9 @@
             </w:tcBorders>
             <w:tcMar>
               <w:top w:w="120" w:type="dxa"/>
-              <w:left w:w="180" w:type="dxa"/>
+              <w:left w:w="90" w:type="dxa"/>
               <w:bottom w:w="120" w:type="dxa"/>
-              <w:right w:w="180" w:type="dxa"/>
+              <w:right w:w="90" w:type="dxa"/>
             </w:tcMar>
           </w:tcPr>
           <w:p>
@@ -2625,9 +2625,9 @@
             </w:tcBorders>
             <w:tcMar>
               <w:top w:w="120" w:type="dxa"/>
-              <w:left w:w="180" w:type="dxa"/>
+              <w:left w:w="90" w:type="dxa"/>
               <w:bottom w:w="120" w:type="dxa"/>
-              <w:right w:w="180" w:type="dxa"/>
+              <w:right w:w="90" w:type="dxa"/>
             </w:tcMar>
           </w:tcPr>
           <w:p>
@@ -2662,9 +2662,9 @@
             </w:tcBorders>
             <w:tcMar>
               <w:top w:w="120" w:type="dxa"/>
-              <w:left w:w="180" w:type="dxa"/>
+              <w:left w:w="90" w:type="dxa"/>
               <w:bottom w:w="120" w:type="dxa"/>
-              <w:right w:w="180" w:type="dxa"/>
+              <w:right w:w="90" w:type="dxa"/>
             </w:tcMar>
           </w:tcPr>
           <w:p>
@@ -2697,9 +2697,9 @@
             </w:tcBorders>
             <w:tcMar>
               <w:top w:w="120" w:type="dxa"/>
-              <w:left w:w="180" w:type="dxa"/>
+              <w:left w:w="90" w:type="dxa"/>
               <w:bottom w:w="120" w:type="dxa"/>
-              <w:right w:w="180" w:type="dxa"/>
+              <w:right w:w="90" w:type="dxa"/>
             </w:tcMar>
           </w:tcPr>
           <w:p>
@@ -2734,9 +2734,9 @@
             </w:tcBorders>
             <w:tcMar>
               <w:top w:w="120" w:type="dxa"/>
-              <w:left w:w="180" w:type="dxa"/>
+              <w:left w:w="90" w:type="dxa"/>
               <w:bottom w:w="120" w:type="dxa"/>
-              <w:right w:w="180" w:type="dxa"/>
+              <w:right w:w="90" w:type="dxa"/>
             </w:tcMar>
           </w:tcPr>
           <w:p>
@@ -2769,9 +2769,9 @@
             </w:tcBorders>
             <w:tcMar>
               <w:top w:w="120" w:type="dxa"/>
-              <w:left w:w="180" w:type="dxa"/>
+              <w:left w:w="90" w:type="dxa"/>
               <w:bottom w:w="120" w:type="dxa"/>
-              <w:right w:w="180" w:type="dxa"/>
+              <w:right w:w="90" w:type="dxa"/>
             </w:tcMar>
           </w:tcPr>
           <w:p>
@@ -2806,9 +2806,9 @@
             </w:tcBorders>
             <w:tcMar>
               <w:top w:w="120" w:type="dxa"/>
-              <w:left w:w="180" w:type="dxa"/>
+              <w:left w:w="90" w:type="dxa"/>
               <w:bottom w:w="120" w:type="dxa"/>
-              <w:right w:w="180" w:type="dxa"/>
+              <w:right w:w="90" w:type="dxa"/>
             </w:tcMar>
           </w:tcPr>
           <w:p>
@@ -2841,9 +2841,9 @@
             </w:tcBorders>
             <w:tcMar>
               <w:top w:w="120" w:type="dxa"/>
-              <w:left w:w="180" w:type="dxa"/>
+              <w:left w:w="90" w:type="dxa"/>
               <w:bottom w:w="120" w:type="dxa"/>
-              <w:right w:w="180" w:type="dxa"/>
+              <w:right w:w="90" w:type="dxa"/>
             </w:tcMar>
           </w:tcPr>
           <w:p>
@@ -2878,9 +2878,9 @@
             </w:tcBorders>
             <w:tcMar>
               <w:top w:w="120" w:type="dxa"/>
-              <w:left w:w="180" w:type="dxa"/>
+              <w:left w:w="90" w:type="dxa"/>
               <w:bottom w:w="120" w:type="dxa"/>
-              <w:right w:w="180" w:type="dxa"/>
+              <w:right w:w="90" w:type="dxa"/>
             </w:tcMar>
           </w:tcPr>
           <w:p>
@@ -2913,9 +2913,9 @@
             </w:tcBorders>
             <w:tcMar>
               <w:top w:w="120" w:type="dxa"/>
-              <w:left w:w="180" w:type="dxa"/>
+              <w:left w:w="90" w:type="dxa"/>
               <w:bottom w:w="120" w:type="dxa"/>
-              <w:right w:w="180" w:type="dxa"/>
+              <w:right w:w="90" w:type="dxa"/>
             </w:tcMar>
           </w:tcPr>
           <w:p>
@@ -2950,9 +2950,9 @@
             </w:tcBorders>
             <w:tcMar>
               <w:top w:w="120" w:type="dxa"/>
-              <w:left w:w="180" w:type="dxa"/>
+              <w:left w:w="90" w:type="dxa"/>
               <w:bottom w:w="120" w:type="dxa"/>
-              <w:right w:w="180" w:type="dxa"/>
+              <w:right w:w="90" w:type="dxa"/>
             </w:tcMar>
           </w:tcPr>
           <w:p>
@@ -2985,9 +2985,9 @@
             </w:tcBorders>
             <w:tcMar>
               <w:top w:w="120" w:type="dxa"/>
-              <w:left w:w="180" w:type="dxa"/>
+              <w:left w:w="90" w:type="dxa"/>
               <w:bottom w:w="120" w:type="dxa"/>
-              <w:right w:w="180" w:type="dxa"/>
+              <w:right w:w="90" w:type="dxa"/>
             </w:tcMar>
           </w:tcPr>
           <w:p>
@@ -3031,7 +3031,7 @@
           <w:rFonts w:ascii="Aptos" w:hAnsi="Aptos" w:eastAsia="Microsoft YaHei"/>
           <w:b/>
           <w:color w:val="2F75B5"/>
-          <w:sz w:val="21"/>
+          <w:sz w:val="18"/>
         </w:rPr>
         <w:t>仓库地址：</w:t>
       </w:r>
@@ -3054,7 +3054,7 @@
           <w:rFonts w:ascii="Aptos" w:hAnsi="Aptos" w:eastAsia="Microsoft YaHei"/>
           <w:b w:val="0"/>
           <w:color w:val="000000"/>
-          <w:sz w:val="21"/>
+          <w:sz w:val="18"/>
         </w:rPr>
         <w:t>许可方式：MIT License。允许使用、复制、修改、合并、发布和分发，但需保留版权和许可声明。</w:t>
       </w:r>
@@ -3437,7 +3437,7 @@
     </w:pPr>
     <w:rPr>
       <w:rFonts w:ascii="Aptos" w:hAnsi="Aptos" w:eastAsia="Microsoft YaHei"/>
-      <w:sz w:val="21"/>
+      <w:sz w:val="18"/>
     </w:rPr>
   </w:style>
   <w:style w:type="paragraph" w:styleId="Header">

</xml_diff>

<commit_message>
Unify all body text sizing
</commit_message>
<xml_diff>
--- a/docs/Codex-Document-Standard-使用教程.docx
+++ b/docs/Codex-Document-Standard-使用教程.docx
@@ -20,7 +20,7 @@
           <w:rFonts w:ascii="Aptos" w:hAnsi="Aptos" w:eastAsia="Microsoft YaHei"/>
           <w:b/>
           <w:color w:val="2F75B5"/>
-          <w:sz w:val="19"/>
+          <w:sz w:val="18"/>
         </w:rPr>
         <w:t>安装  使用  更新  自定义</w:t>
       </w:r>
@@ -29,7 +29,7 @@
           <w:rFonts w:ascii="Aptos" w:hAnsi="Aptos" w:eastAsia="Microsoft YaHei"/>
           <w:b w:val="0"/>
           <w:color w:val="666666"/>
-          <w:sz w:val="19"/>
+          <w:sz w:val="18"/>
         </w:rPr>
         <w:t xml:space="preserve">    版本 1.0    2026-09-04</w:t>
       </w:r>
@@ -79,7 +79,7 @@
                 <w:rFonts w:ascii="Aptos" w:hAnsi="Aptos" w:eastAsia="Microsoft YaHei"/>
                 <w:b/>
                 <w:color w:val="2F75B5"/>
-                <w:sz w:val="20"/>
+                <w:sz w:val="18"/>
               </w:rPr>
               <w:t>核心结论：</w:t>
             </w:r>
@@ -88,7 +88,7 @@
                 <w:rFonts w:ascii="Aptos" w:hAnsi="Aptos" w:eastAsia="Microsoft YaHei"/>
                 <w:b w:val="0"/>
                 <w:color w:val="000000"/>
-                <w:sz w:val="20"/>
+                <w:sz w:val="18"/>
               </w:rPr>
               <w:t>最简单的安装方式是让 Codex 使用 skill-installer 从 GitHub 仓库安装。安装后重新开始一轮对话，并用显式调用示例完成首次验证。</w:t>
             </w:r>
@@ -866,7 +866,7 @@
                 <w:rFonts w:ascii="Aptos" w:hAnsi="Aptos" w:eastAsia="Microsoft YaHei"/>
                 <w:b/>
                 <w:color w:val="2F75B5"/>
-                <w:sz w:val="20"/>
+                <w:sz w:val="18"/>
               </w:rPr>
               <w:t>分享方式：</w:t>
             </w:r>
@@ -875,7 +875,7 @@
                 <w:rFonts w:ascii="Aptos" w:hAnsi="Aptos" w:eastAsia="Microsoft YaHei"/>
                 <w:b w:val="0"/>
                 <w:color w:val="000000"/>
-                <w:sz w:val="20"/>
+                <w:sz w:val="18"/>
               </w:rPr>
               <w:t>将仓库主页链接发给其他使用者即可。公开仓库不需要 GitHub 账号或额外权限。</w:t>
             </w:r>
@@ -1400,7 +1400,7 @@
                 <w:rFonts w:ascii="Aptos" w:hAnsi="Aptos" w:eastAsia="Microsoft YaHei"/>
                 <w:b/>
                 <w:color w:val="2F75B5"/>
-                <w:sz w:val="20"/>
+                <w:sz w:val="18"/>
               </w:rPr>
               <w:t>排查提示：</w:t>
             </w:r>
@@ -1409,7 +1409,7 @@
                 <w:rFonts w:ascii="Aptos" w:hAnsi="Aptos" w:eastAsia="Microsoft YaHei"/>
                 <w:b w:val="0"/>
                 <w:color w:val="000000"/>
-                <w:sz w:val="20"/>
+                <w:sz w:val="18"/>
               </w:rPr>
               <w:t>如果 Codex 提示找不到 Skill，先检查最终路径是否为 ~/.codex/skills/codex-document-standard/SKILL.md，再重新开始一轮对话。</w:t>
             </w:r>

</xml_diff>

<commit_message>
Match table and body visual sizing
</commit_message>
<xml_diff>
--- a/docs/Codex-Document-Standard-使用教程.docx
+++ b/docs/Codex-Document-Standard-使用教程.docx
@@ -170,7 +170,7 @@
                 <w:rFonts w:ascii="Aptos" w:hAnsi="Aptos" w:eastAsia="Microsoft YaHei"/>
                 <w:b/>
                 <w:color w:val="FFFFFF"/>
-                <w:sz w:val="18"/>
+                <w:sz w:val="20"/>
               </w:rPr>
               <w:t>适用</w:t>
             </w:r>
@@ -206,7 +206,7 @@
                 <w:rFonts w:ascii="Aptos" w:hAnsi="Aptos" w:eastAsia="Microsoft YaHei"/>
                 <w:b/>
                 <w:color w:val="FFFFFF"/>
-                <w:sz w:val="18"/>
+                <w:sz w:val="20"/>
               </w:rPr>
               <w:t>典型内容</w:t>
             </w:r>
@@ -242,7 +242,7 @@
                 <w:rFonts w:ascii="Aptos" w:hAnsi="Aptos" w:eastAsia="Microsoft YaHei"/>
                 <w:b/>
                 <w:color w:val="FFFFFF"/>
-                <w:sz w:val="18"/>
+                <w:sz w:val="20"/>
               </w:rPr>
               <w:t>默认行为</w:t>
             </w:r>
@@ -279,7 +279,7 @@
                 <w:rFonts w:ascii="Aptos" w:hAnsi="Aptos" w:eastAsia="Microsoft YaHei"/>
                 <w:b w:val="0"/>
                 <w:color w:val="000000"/>
-                <w:sz w:val="18"/>
+                <w:sz w:val="20"/>
               </w:rPr>
               <w:t>工作报告</w:t>
             </w:r>
@@ -314,7 +314,7 @@
                 <w:rFonts w:ascii="Aptos" w:hAnsi="Aptos" w:eastAsia="Microsoft YaHei"/>
                 <w:b w:val="0"/>
                 <w:color w:val="000000"/>
-                <w:sz w:val="18"/>
+                <w:sz w:val="20"/>
               </w:rPr>
               <w:t>周报  月报  季度复盘  项目总结</w:t>
             </w:r>
@@ -349,7 +349,7 @@
                 <w:rFonts w:ascii="Aptos" w:hAnsi="Aptos" w:eastAsia="Microsoft YaHei"/>
                 <w:b w:val="0"/>
                 <w:color w:val="000000"/>
-                <w:sz w:val="18"/>
+                <w:sz w:val="20"/>
               </w:rPr>
               <w:t>统一标题层级和正文排版</w:t>
             </w:r>
@@ -386,7 +386,7 @@
                 <w:rFonts w:ascii="Aptos" w:hAnsi="Aptos" w:eastAsia="Microsoft YaHei"/>
                 <w:b w:val="0"/>
                 <w:color w:val="000000"/>
-                <w:sz w:val="18"/>
+                <w:sz w:val="20"/>
               </w:rPr>
               <w:t>计划与方案</w:t>
             </w:r>
@@ -421,7 +421,7 @@
                 <w:rFonts w:ascii="Aptos" w:hAnsi="Aptos" w:eastAsia="Microsoft YaHei"/>
                 <w:b w:val="0"/>
                 <w:color w:val="000000"/>
-                <w:sz w:val="18"/>
+                <w:sz w:val="20"/>
               </w:rPr>
               <w:t>项目计划  执行方案  制度说明</w:t>
             </w:r>
@@ -456,7 +456,7 @@
                 <w:rFonts w:ascii="Aptos" w:hAnsi="Aptos" w:eastAsia="Microsoft YaHei"/>
                 <w:b w:val="0"/>
                 <w:color w:val="000000"/>
-                <w:sz w:val="18"/>
+                <w:sz w:val="20"/>
               </w:rPr>
               <w:t>突出结论  范围  风险和动作</w:t>
             </w:r>
@@ -493,7 +493,7 @@
                 <w:rFonts w:ascii="Aptos" w:hAnsi="Aptos" w:eastAsia="Microsoft YaHei"/>
                 <w:b w:val="0"/>
                 <w:color w:val="000000"/>
-                <w:sz w:val="18"/>
+                <w:sz w:val="20"/>
               </w:rPr>
               <w:t>会议文档</w:t>
             </w:r>
@@ -528,7 +528,7 @@
                 <w:rFonts w:ascii="Aptos" w:hAnsi="Aptos" w:eastAsia="Microsoft YaHei"/>
                 <w:b w:val="0"/>
                 <w:color w:val="000000"/>
-                <w:sz w:val="18"/>
+                <w:sz w:val="20"/>
               </w:rPr>
               <w:t>会议纪要  评审记录  跟进清单</w:t>
             </w:r>
@@ -563,7 +563,7 @@
                 <w:rFonts w:ascii="Aptos" w:hAnsi="Aptos" w:eastAsia="Microsoft YaHei"/>
                 <w:b w:val="0"/>
                 <w:color w:val="000000"/>
-                <w:sz w:val="18"/>
+                <w:sz w:val="20"/>
               </w:rPr>
               <w:t>统一表格  日期  状态和责任信息</w:t>
             </w:r>
@@ -600,7 +600,7 @@
                 <w:rFonts w:ascii="Aptos" w:hAnsi="Aptos" w:eastAsia="Microsoft YaHei"/>
                 <w:b w:val="0"/>
                 <w:color w:val="000000"/>
-                <w:sz w:val="18"/>
+                <w:sz w:val="20"/>
               </w:rPr>
               <w:t>钉钉文档</w:t>
             </w:r>
@@ -635,7 +635,7 @@
                 <w:rFonts w:ascii="Aptos" w:hAnsi="Aptos" w:eastAsia="Microsoft YaHei"/>
                 <w:b w:val="0"/>
                 <w:color w:val="000000"/>
-                <w:sz w:val="18"/>
+                <w:sz w:val="20"/>
               </w:rPr>
               <w:t>工作文档和文档表格</w:t>
             </w:r>
@@ -670,7 +670,7 @@
                 <w:rFonts w:ascii="Aptos" w:hAnsi="Aptos" w:eastAsia="Microsoft YaHei"/>
                 <w:b w:val="0"/>
                 <w:color w:val="000000"/>
-                <w:sz w:val="18"/>
+                <w:sz w:val="20"/>
               </w:rPr>
               <w:t>按平台能力应用同一视觉语言</w:t>
             </w:r>
@@ -1631,7 +1631,7 @@
                 <w:rFonts w:ascii="Aptos" w:hAnsi="Aptos" w:eastAsia="Microsoft YaHei"/>
                 <w:b/>
                 <w:color w:val="FFFFFF"/>
-                <w:sz w:val="18"/>
+                <w:sz w:val="20"/>
               </w:rPr>
               <w:t>项目</w:t>
             </w:r>
@@ -1667,7 +1667,7 @@
                 <w:rFonts w:ascii="Aptos" w:hAnsi="Aptos" w:eastAsia="Microsoft YaHei"/>
                 <w:b/>
                 <w:color w:val="FFFFFF"/>
-                <w:sz w:val="18"/>
+                <w:sz w:val="20"/>
               </w:rPr>
               <w:t>默认规范</w:t>
             </w:r>
@@ -1704,7 +1704,7 @@
                 <w:rFonts w:ascii="Aptos" w:hAnsi="Aptos" w:eastAsia="Microsoft YaHei"/>
                 <w:b w:val="0"/>
                 <w:color w:val="000000"/>
-                <w:sz w:val="18"/>
+                <w:sz w:val="20"/>
               </w:rPr>
               <w:t>视觉基调</w:t>
             </w:r>
@@ -1739,7 +1739,7 @@
                 <w:rFonts w:ascii="Aptos" w:hAnsi="Aptos" w:eastAsia="Microsoft YaHei"/>
                 <w:b w:val="0"/>
                 <w:color w:val="000000"/>
-                <w:sz w:val="18"/>
+                <w:sz w:val="20"/>
               </w:rPr>
               <w:t>专业  克制  清晰  白色页面背景</w:t>
             </w:r>
@@ -1776,7 +1776,7 @@
                 <w:rFonts w:ascii="Aptos" w:hAnsi="Aptos" w:eastAsia="Microsoft YaHei"/>
                 <w:b w:val="0"/>
                 <w:color w:val="000000"/>
-                <w:sz w:val="18"/>
+                <w:sz w:val="20"/>
               </w:rPr>
               <w:t>主色</w:t>
             </w:r>
@@ -1811,7 +1811,7 @@
                 <w:rFonts w:ascii="Aptos" w:hAnsi="Aptos" w:eastAsia="Microsoft YaHei"/>
                 <w:b w:val="0"/>
                 <w:color w:val="000000"/>
-                <w:sz w:val="18"/>
+                <w:sz w:val="20"/>
               </w:rPr>
               <w:t>#2F75B5</w:t>
             </w:r>
@@ -1848,7 +1848,7 @@
                 <w:rFonts w:ascii="Aptos" w:hAnsi="Aptos" w:eastAsia="Microsoft YaHei"/>
                 <w:b w:val="0"/>
                 <w:color w:val="000000"/>
-                <w:sz w:val="18"/>
+                <w:sz w:val="20"/>
               </w:rPr>
               <w:t>表头</w:t>
             </w:r>
@@ -1883,9 +1883,9 @@
                 <w:rFonts w:ascii="Aptos" w:hAnsi="Aptos" w:eastAsia="Microsoft YaHei"/>
                 <w:b w:val="0"/>
                 <w:color w:val="000000"/>
-                <w:sz w:val="18"/>
+                <w:sz w:val="20"/>
               </w:rPr>
-              <w:t>#005D8D 背景  白色  9 pt  加粗</w:t>
+              <w:t>#005D8D 背景  白色  10 pt  加粗  视觉与 9 pt 正文一致</w:t>
             </w:r>
           </w:p>
         </w:tc>
@@ -1920,7 +1920,7 @@
                 <w:rFonts w:ascii="Aptos" w:hAnsi="Aptos" w:eastAsia="Microsoft YaHei"/>
                 <w:b w:val="0"/>
                 <w:color w:val="000000"/>
-                <w:sz w:val="18"/>
+                <w:sz w:val="20"/>
               </w:rPr>
               <w:t>正文</w:t>
             </w:r>
@@ -1955,7 +1955,7 @@
                 <w:rFonts w:ascii="Aptos" w:hAnsi="Aptos" w:eastAsia="Microsoft YaHei"/>
                 <w:b w:val="0"/>
                 <w:color w:val="000000"/>
-                <w:sz w:val="18"/>
+                <w:sz w:val="20"/>
               </w:rPr>
               <w:t>9 pt  左对齐  1.2 行距  段前 2  段后 4</w:t>
             </w:r>
@@ -1992,7 +1992,7 @@
                 <w:rFonts w:ascii="Aptos" w:hAnsi="Aptos" w:eastAsia="Microsoft YaHei"/>
                 <w:b w:val="0"/>
                 <w:color w:val="000000"/>
-                <w:sz w:val="18"/>
+                <w:sz w:val="20"/>
               </w:rPr>
               <w:t>说明块</w:t>
             </w:r>
@@ -2027,7 +2027,7 @@
                 <w:rFonts w:ascii="Aptos" w:hAnsi="Aptos" w:eastAsia="Microsoft YaHei"/>
                 <w:b w:val="0"/>
                 <w:color w:val="000000"/>
-                <w:sz w:val="18"/>
+                <w:sz w:val="20"/>
               </w:rPr>
               <w:t>#EEF5F8 背景  无外边框  10 pt</w:t>
             </w:r>
@@ -2064,7 +2064,7 @@
                 <w:rFonts w:ascii="Aptos" w:hAnsi="Aptos" w:eastAsia="Microsoft YaHei"/>
                 <w:b w:val="0"/>
                 <w:color w:val="000000"/>
-                <w:sz w:val="18"/>
+                <w:sz w:val="20"/>
               </w:rPr>
               <w:t>表格对齐</w:t>
             </w:r>
@@ -2099,7 +2099,7 @@
                 <w:rFonts w:ascii="Aptos" w:hAnsi="Aptos" w:eastAsia="Microsoft YaHei"/>
                 <w:b w:val="0"/>
                 <w:color w:val="000000"/>
-                <w:sz w:val="18"/>
+                <w:sz w:val="20"/>
               </w:rPr>
               <w:t>文字左对齐  数字右对齐  日期状态序号居中</w:t>
             </w:r>
@@ -2136,7 +2136,7 @@
                 <w:rFonts w:ascii="Aptos" w:hAnsi="Aptos" w:eastAsia="Microsoft YaHei"/>
                 <w:b w:val="0"/>
                 <w:color w:val="000000"/>
-                <w:sz w:val="18"/>
+                <w:sz w:val="20"/>
               </w:rPr>
               <w:t>空值与日期</w:t>
             </w:r>
@@ -2171,7 +2171,7 @@
                 <w:rFonts w:ascii="Aptos" w:hAnsi="Aptos" w:eastAsia="Microsoft YaHei"/>
                 <w:b w:val="0"/>
                 <w:color w:val="000000"/>
-                <w:sz w:val="18"/>
+                <w:sz w:val="20"/>
               </w:rPr>
               <w:t>空值使用 —  日期使用 YYYY-MM-DD</w:t>
             </w:r>
@@ -2208,7 +2208,7 @@
                 <w:rFonts w:ascii="Aptos" w:hAnsi="Aptos" w:eastAsia="Microsoft YaHei"/>
                 <w:b w:val="0"/>
                 <w:color w:val="000000"/>
-                <w:sz w:val="18"/>
+                <w:sz w:val="20"/>
               </w:rPr>
               <w:t>内容表达</w:t>
             </w:r>
@@ -2243,7 +2243,7 @@
                 <w:rFonts w:ascii="Aptos" w:hAnsi="Aptos" w:eastAsia="Microsoft YaHei"/>
                 <w:b w:val="0"/>
                 <w:color w:val="000000"/>
-                <w:sz w:val="18"/>
+                <w:sz w:val="20"/>
               </w:rPr>
               <w:t>结论先行  事实可验证  链接真实可访问</w:t>
             </w:r>
@@ -2604,7 +2604,7 @@
                 <w:rFonts w:ascii="Aptos" w:hAnsi="Aptos" w:eastAsia="Microsoft YaHei"/>
                 <w:b/>
                 <w:color w:val="FFFFFF"/>
-                <w:sz w:val="18"/>
+                <w:sz w:val="20"/>
               </w:rPr>
               <w:t>问题</w:t>
             </w:r>
@@ -2640,7 +2640,7 @@
                 <w:rFonts w:ascii="Aptos" w:hAnsi="Aptos" w:eastAsia="Microsoft YaHei"/>
                 <w:b/>
                 <w:color w:val="FFFFFF"/>
-                <w:sz w:val="18"/>
+                <w:sz w:val="20"/>
               </w:rPr>
               <w:t>处理方法</w:t>
             </w:r>
@@ -2677,7 +2677,7 @@
                 <w:rFonts w:ascii="Aptos" w:hAnsi="Aptos" w:eastAsia="Microsoft YaHei"/>
                 <w:b w:val="0"/>
                 <w:color w:val="000000"/>
-                <w:sz w:val="18"/>
+                <w:sz w:val="20"/>
               </w:rPr>
               <w:t>Codex 找不到 Skill</w:t>
             </w:r>
@@ -2712,7 +2712,7 @@
                 <w:rFonts w:ascii="Aptos" w:hAnsi="Aptos" w:eastAsia="Microsoft YaHei"/>
                 <w:b w:val="0"/>
                 <w:color w:val="000000"/>
-                <w:sz w:val="18"/>
+                <w:sz w:val="20"/>
               </w:rPr>
               <w:t>检查安装路径和文件夹嵌套层级，然后重新开始一轮对话。</w:t>
             </w:r>
@@ -2749,7 +2749,7 @@
                 <w:rFonts w:ascii="Aptos" w:hAnsi="Aptos" w:eastAsia="Microsoft YaHei"/>
                 <w:b w:val="0"/>
                 <w:color w:val="000000"/>
-                <w:sz w:val="18"/>
+                <w:sz w:val="20"/>
               </w:rPr>
               <w:t>已有公司模板</w:t>
             </w:r>
@@ -2784,7 +2784,7 @@
                 <w:rFonts w:ascii="Aptos" w:hAnsi="Aptos" w:eastAsia="Microsoft YaHei"/>
                 <w:b w:val="0"/>
                 <w:color w:val="000000"/>
-                <w:sz w:val="18"/>
+                <w:sz w:val="20"/>
               </w:rPr>
               <w:t>继续使用公司模板；本 Skill 只补充模板未规定的细节。</w:t>
             </w:r>
@@ -2821,7 +2821,7 @@
                 <w:rFonts w:ascii="Aptos" w:hAnsi="Aptos" w:eastAsia="Microsoft YaHei"/>
                 <w:b w:val="0"/>
                 <w:color w:val="000000"/>
-                <w:sz w:val="18"/>
+                <w:sz w:val="20"/>
               </w:rPr>
               <w:t>只想修改一个表格</w:t>
             </w:r>
@@ -2856,7 +2856,7 @@
                 <w:rFonts w:ascii="Aptos" w:hAnsi="Aptos" w:eastAsia="Microsoft YaHei"/>
                 <w:b w:val="0"/>
                 <w:color w:val="000000"/>
-                <w:sz w:val="18"/>
+                <w:sz w:val="20"/>
               </w:rPr>
               <w:t>明确指定修改范围，Codex 必须保留其他内容和样式。</w:t>
             </w:r>
@@ -2893,7 +2893,7 @@
                 <w:rFonts w:ascii="Aptos" w:hAnsi="Aptos" w:eastAsia="Microsoft YaHei"/>
                 <w:b w:val="0"/>
                 <w:color w:val="000000"/>
-                <w:sz w:val="18"/>
+                <w:sz w:val="20"/>
               </w:rPr>
               <w:t>需要更换品牌色</w:t>
             </w:r>
@@ -2928,7 +2928,7 @@
                 <w:rFonts w:ascii="Aptos" w:hAnsi="Aptos" w:eastAsia="Microsoft YaHei"/>
                 <w:b w:val="0"/>
                 <w:color w:val="000000"/>
-                <w:sz w:val="18"/>
+                <w:sz w:val="20"/>
               </w:rPr>
               <w:t>修改 style-standard.md 中的颜色定义，并保持全篇一致。</w:t>
             </w:r>
@@ -2965,7 +2965,7 @@
                 <w:rFonts w:ascii="Aptos" w:hAnsi="Aptos" w:eastAsia="Microsoft YaHei"/>
                 <w:b w:val="0"/>
                 <w:color w:val="000000"/>
-                <w:sz w:val="18"/>
+                <w:sz w:val="20"/>
               </w:rPr>
               <w:t>Git 更新失败</w:t>
             </w:r>
@@ -3000,7 +3000,7 @@
                 <w:rFonts w:ascii="Aptos" w:hAnsi="Aptos" w:eastAsia="Microsoft YaHei"/>
                 <w:b w:val="0"/>
                 <w:color w:val="000000"/>
-                <w:sz w:val="18"/>
+                <w:sz w:val="20"/>
               </w:rPr>
               <w:t>检查网络、仓库地址和 GitHub 权限；不要把凭据写入 Skill。</w:t>
             </w:r>

</xml_diff>

<commit_message>
Match table body font size to document body
</commit_message>
<xml_diff>
--- a/docs/Codex-Document-Standard-使用教程.docx
+++ b/docs/Codex-Document-Standard-使用教程.docx
@@ -279,7 +279,7 @@
                 <w:rFonts w:ascii="Aptos" w:hAnsi="Aptos" w:eastAsia="Microsoft YaHei"/>
                 <w:b w:val="0"/>
                 <w:color w:val="000000"/>
-                <w:sz w:val="20"/>
+                <w:sz w:val="18"/>
               </w:rPr>
               <w:t>工作报告</w:t>
             </w:r>
@@ -314,7 +314,7 @@
                 <w:rFonts w:ascii="Aptos" w:hAnsi="Aptos" w:eastAsia="Microsoft YaHei"/>
                 <w:b w:val="0"/>
                 <w:color w:val="000000"/>
-                <w:sz w:val="20"/>
+                <w:sz w:val="18"/>
               </w:rPr>
               <w:t>周报  月报  季度复盘  项目总结</w:t>
             </w:r>
@@ -349,7 +349,7 @@
                 <w:rFonts w:ascii="Aptos" w:hAnsi="Aptos" w:eastAsia="Microsoft YaHei"/>
                 <w:b w:val="0"/>
                 <w:color w:val="000000"/>
-                <w:sz w:val="20"/>
+                <w:sz w:val="18"/>
               </w:rPr>
               <w:t>统一标题层级和正文排版</w:t>
             </w:r>
@@ -386,7 +386,7 @@
                 <w:rFonts w:ascii="Aptos" w:hAnsi="Aptos" w:eastAsia="Microsoft YaHei"/>
                 <w:b w:val="0"/>
                 <w:color w:val="000000"/>
-                <w:sz w:val="20"/>
+                <w:sz w:val="18"/>
               </w:rPr>
               <w:t>计划与方案</w:t>
             </w:r>
@@ -421,7 +421,7 @@
                 <w:rFonts w:ascii="Aptos" w:hAnsi="Aptos" w:eastAsia="Microsoft YaHei"/>
                 <w:b w:val="0"/>
                 <w:color w:val="000000"/>
-                <w:sz w:val="20"/>
+                <w:sz w:val="18"/>
               </w:rPr>
               <w:t>项目计划  执行方案  制度说明</w:t>
             </w:r>
@@ -456,7 +456,7 @@
                 <w:rFonts w:ascii="Aptos" w:hAnsi="Aptos" w:eastAsia="Microsoft YaHei"/>
                 <w:b w:val="0"/>
                 <w:color w:val="000000"/>
-                <w:sz w:val="20"/>
+                <w:sz w:val="18"/>
               </w:rPr>
               <w:t>突出结论  范围  风险和动作</w:t>
             </w:r>
@@ -493,7 +493,7 @@
                 <w:rFonts w:ascii="Aptos" w:hAnsi="Aptos" w:eastAsia="Microsoft YaHei"/>
                 <w:b w:val="0"/>
                 <w:color w:val="000000"/>
-                <w:sz w:val="20"/>
+                <w:sz w:val="18"/>
               </w:rPr>
               <w:t>会议文档</w:t>
             </w:r>
@@ -528,7 +528,7 @@
                 <w:rFonts w:ascii="Aptos" w:hAnsi="Aptos" w:eastAsia="Microsoft YaHei"/>
                 <w:b w:val="0"/>
                 <w:color w:val="000000"/>
-                <w:sz w:val="20"/>
+                <w:sz w:val="18"/>
               </w:rPr>
               <w:t>会议纪要  评审记录  跟进清单</w:t>
             </w:r>
@@ -563,7 +563,7 @@
                 <w:rFonts w:ascii="Aptos" w:hAnsi="Aptos" w:eastAsia="Microsoft YaHei"/>
                 <w:b w:val="0"/>
                 <w:color w:val="000000"/>
-                <w:sz w:val="20"/>
+                <w:sz w:val="18"/>
               </w:rPr>
               <w:t>统一表格  日期  状态和责任信息</w:t>
             </w:r>
@@ -600,7 +600,7 @@
                 <w:rFonts w:ascii="Aptos" w:hAnsi="Aptos" w:eastAsia="Microsoft YaHei"/>
                 <w:b w:val="0"/>
                 <w:color w:val="000000"/>
-                <w:sz w:val="20"/>
+                <w:sz w:val="18"/>
               </w:rPr>
               <w:t>钉钉文档</w:t>
             </w:r>
@@ -635,7 +635,7 @@
                 <w:rFonts w:ascii="Aptos" w:hAnsi="Aptos" w:eastAsia="Microsoft YaHei"/>
                 <w:b w:val="0"/>
                 <w:color w:val="000000"/>
-                <w:sz w:val="20"/>
+                <w:sz w:val="18"/>
               </w:rPr>
               <w:t>工作文档和文档表格</w:t>
             </w:r>
@@ -670,7 +670,7 @@
                 <w:rFonts w:ascii="Aptos" w:hAnsi="Aptos" w:eastAsia="Microsoft YaHei"/>
                 <w:b w:val="0"/>
                 <w:color w:val="000000"/>
-                <w:sz w:val="20"/>
+                <w:sz w:val="18"/>
               </w:rPr>
               <w:t>按平台能力应用同一视觉语言</w:t>
             </w:r>
@@ -1704,7 +1704,7 @@
                 <w:rFonts w:ascii="Aptos" w:hAnsi="Aptos" w:eastAsia="Microsoft YaHei"/>
                 <w:b w:val="0"/>
                 <w:color w:val="000000"/>
-                <w:sz w:val="20"/>
+                <w:sz w:val="18"/>
               </w:rPr>
               <w:t>视觉基调</w:t>
             </w:r>
@@ -1739,7 +1739,7 @@
                 <w:rFonts w:ascii="Aptos" w:hAnsi="Aptos" w:eastAsia="Microsoft YaHei"/>
                 <w:b w:val="0"/>
                 <w:color w:val="000000"/>
-                <w:sz w:val="20"/>
+                <w:sz w:val="18"/>
               </w:rPr>
               <w:t>专业  克制  清晰  白色页面背景</w:t>
             </w:r>
@@ -1776,7 +1776,7 @@
                 <w:rFonts w:ascii="Aptos" w:hAnsi="Aptos" w:eastAsia="Microsoft YaHei"/>
                 <w:b w:val="0"/>
                 <w:color w:val="000000"/>
-                <w:sz w:val="20"/>
+                <w:sz w:val="18"/>
               </w:rPr>
               <w:t>主色</w:t>
             </w:r>
@@ -1811,7 +1811,7 @@
                 <w:rFonts w:ascii="Aptos" w:hAnsi="Aptos" w:eastAsia="Microsoft YaHei"/>
                 <w:b w:val="0"/>
                 <w:color w:val="000000"/>
-                <w:sz w:val="20"/>
+                <w:sz w:val="18"/>
               </w:rPr>
               <w:t>#2F75B5</w:t>
             </w:r>
@@ -1848,7 +1848,7 @@
                 <w:rFonts w:ascii="Aptos" w:hAnsi="Aptos" w:eastAsia="Microsoft YaHei"/>
                 <w:b w:val="0"/>
                 <w:color w:val="000000"/>
-                <w:sz w:val="20"/>
+                <w:sz w:val="18"/>
               </w:rPr>
               <w:t>表头</w:t>
             </w:r>
@@ -1883,7 +1883,7 @@
                 <w:rFonts w:ascii="Aptos" w:hAnsi="Aptos" w:eastAsia="Microsoft YaHei"/>
                 <w:b w:val="0"/>
                 <w:color w:val="000000"/>
-                <w:sz w:val="20"/>
+                <w:sz w:val="18"/>
               </w:rPr>
               <w:t>#005D8D 背景  白色  10 pt  加粗  视觉与 9 pt 正文一致</w:t>
             </w:r>
@@ -1920,7 +1920,7 @@
                 <w:rFonts w:ascii="Aptos" w:hAnsi="Aptos" w:eastAsia="Microsoft YaHei"/>
                 <w:b w:val="0"/>
                 <w:color w:val="000000"/>
-                <w:sz w:val="20"/>
+                <w:sz w:val="18"/>
               </w:rPr>
               <w:t>正文</w:t>
             </w:r>
@@ -1955,7 +1955,7 @@
                 <w:rFonts w:ascii="Aptos" w:hAnsi="Aptos" w:eastAsia="Microsoft YaHei"/>
                 <w:b w:val="0"/>
                 <w:color w:val="000000"/>
-                <w:sz w:val="20"/>
+                <w:sz w:val="18"/>
               </w:rPr>
               <w:t>9 pt  左对齐  1.2 行距  段前 2  段后 4</w:t>
             </w:r>
@@ -1992,7 +1992,7 @@
                 <w:rFonts w:ascii="Aptos" w:hAnsi="Aptos" w:eastAsia="Microsoft YaHei"/>
                 <w:b w:val="0"/>
                 <w:color w:val="000000"/>
-                <w:sz w:val="20"/>
+                <w:sz w:val="18"/>
               </w:rPr>
               <w:t>说明块</w:t>
             </w:r>
@@ -2027,7 +2027,7 @@
                 <w:rFonts w:ascii="Aptos" w:hAnsi="Aptos" w:eastAsia="Microsoft YaHei"/>
                 <w:b w:val="0"/>
                 <w:color w:val="000000"/>
-                <w:sz w:val="20"/>
+                <w:sz w:val="18"/>
               </w:rPr>
               <w:t>#EEF5F8 背景  无外边框  10 pt</w:t>
             </w:r>
@@ -2064,7 +2064,7 @@
                 <w:rFonts w:ascii="Aptos" w:hAnsi="Aptos" w:eastAsia="Microsoft YaHei"/>
                 <w:b w:val="0"/>
                 <w:color w:val="000000"/>
-                <w:sz w:val="20"/>
+                <w:sz w:val="18"/>
               </w:rPr>
               <w:t>表格对齐</w:t>
             </w:r>
@@ -2099,7 +2099,7 @@
                 <w:rFonts w:ascii="Aptos" w:hAnsi="Aptos" w:eastAsia="Microsoft YaHei"/>
                 <w:b w:val="0"/>
                 <w:color w:val="000000"/>
-                <w:sz w:val="20"/>
+                <w:sz w:val="18"/>
               </w:rPr>
               <w:t>文字左对齐  数字右对齐  日期状态序号居中</w:t>
             </w:r>
@@ -2136,7 +2136,7 @@
                 <w:rFonts w:ascii="Aptos" w:hAnsi="Aptos" w:eastAsia="Microsoft YaHei"/>
                 <w:b w:val="0"/>
                 <w:color w:val="000000"/>
-                <w:sz w:val="20"/>
+                <w:sz w:val="18"/>
               </w:rPr>
               <w:t>空值与日期</w:t>
             </w:r>
@@ -2171,7 +2171,7 @@
                 <w:rFonts w:ascii="Aptos" w:hAnsi="Aptos" w:eastAsia="Microsoft YaHei"/>
                 <w:b w:val="0"/>
                 <w:color w:val="000000"/>
-                <w:sz w:val="20"/>
+                <w:sz w:val="18"/>
               </w:rPr>
               <w:t>空值使用 —  日期使用 YYYY-MM-DD</w:t>
             </w:r>
@@ -2208,7 +2208,7 @@
                 <w:rFonts w:ascii="Aptos" w:hAnsi="Aptos" w:eastAsia="Microsoft YaHei"/>
                 <w:b w:val="0"/>
                 <w:color w:val="000000"/>
-                <w:sz w:val="20"/>
+                <w:sz w:val="18"/>
               </w:rPr>
               <w:t>内容表达</w:t>
             </w:r>
@@ -2243,7 +2243,7 @@
                 <w:rFonts w:ascii="Aptos" w:hAnsi="Aptos" w:eastAsia="Microsoft YaHei"/>
                 <w:b w:val="0"/>
                 <w:color w:val="000000"/>
-                <w:sz w:val="20"/>
+                <w:sz w:val="18"/>
               </w:rPr>
               <w:t>结论先行  事实可验证  链接真实可访问</w:t>
             </w:r>
@@ -2677,7 +2677,7 @@
                 <w:rFonts w:ascii="Aptos" w:hAnsi="Aptos" w:eastAsia="Microsoft YaHei"/>
                 <w:b w:val="0"/>
                 <w:color w:val="000000"/>
-                <w:sz w:val="20"/>
+                <w:sz w:val="18"/>
               </w:rPr>
               <w:t>Codex 找不到 Skill</w:t>
             </w:r>
@@ -2712,7 +2712,7 @@
                 <w:rFonts w:ascii="Aptos" w:hAnsi="Aptos" w:eastAsia="Microsoft YaHei"/>
                 <w:b w:val="0"/>
                 <w:color w:val="000000"/>
-                <w:sz w:val="20"/>
+                <w:sz w:val="18"/>
               </w:rPr>
               <w:t>检查安装路径和文件夹嵌套层级，然后重新开始一轮对话。</w:t>
             </w:r>
@@ -2749,7 +2749,7 @@
                 <w:rFonts w:ascii="Aptos" w:hAnsi="Aptos" w:eastAsia="Microsoft YaHei"/>
                 <w:b w:val="0"/>
                 <w:color w:val="000000"/>
-                <w:sz w:val="20"/>
+                <w:sz w:val="18"/>
               </w:rPr>
               <w:t>已有公司模板</w:t>
             </w:r>
@@ -2784,7 +2784,7 @@
                 <w:rFonts w:ascii="Aptos" w:hAnsi="Aptos" w:eastAsia="Microsoft YaHei"/>
                 <w:b w:val="0"/>
                 <w:color w:val="000000"/>
-                <w:sz w:val="20"/>
+                <w:sz w:val="18"/>
               </w:rPr>
               <w:t>继续使用公司模板；本 Skill 只补充模板未规定的细节。</w:t>
             </w:r>
@@ -2821,7 +2821,7 @@
                 <w:rFonts w:ascii="Aptos" w:hAnsi="Aptos" w:eastAsia="Microsoft YaHei"/>
                 <w:b w:val="0"/>
                 <w:color w:val="000000"/>
-                <w:sz w:val="20"/>
+                <w:sz w:val="18"/>
               </w:rPr>
               <w:t>只想修改一个表格</w:t>
             </w:r>
@@ -2856,7 +2856,7 @@
                 <w:rFonts w:ascii="Aptos" w:hAnsi="Aptos" w:eastAsia="Microsoft YaHei"/>
                 <w:b w:val="0"/>
                 <w:color w:val="000000"/>
-                <w:sz w:val="20"/>
+                <w:sz w:val="18"/>
               </w:rPr>
               <w:t>明确指定修改范围，Codex 必须保留其他内容和样式。</w:t>
             </w:r>
@@ -2893,7 +2893,7 @@
                 <w:rFonts w:ascii="Aptos" w:hAnsi="Aptos" w:eastAsia="Microsoft YaHei"/>
                 <w:b w:val="0"/>
                 <w:color w:val="000000"/>
-                <w:sz w:val="20"/>
+                <w:sz w:val="18"/>
               </w:rPr>
               <w:t>需要更换品牌色</w:t>
             </w:r>
@@ -2928,7 +2928,7 @@
                 <w:rFonts w:ascii="Aptos" w:hAnsi="Aptos" w:eastAsia="Microsoft YaHei"/>
                 <w:b w:val="0"/>
                 <w:color w:val="000000"/>
-                <w:sz w:val="20"/>
+                <w:sz w:val="18"/>
               </w:rPr>
               <w:t>修改 style-standard.md 中的颜色定义，并保持全篇一致。</w:t>
             </w:r>
@@ -2965,7 +2965,7 @@
                 <w:rFonts w:ascii="Aptos" w:hAnsi="Aptos" w:eastAsia="Microsoft YaHei"/>
                 <w:b w:val="0"/>
                 <w:color w:val="000000"/>
-                <w:sz w:val="20"/>
+                <w:sz w:val="18"/>
               </w:rPr>
               <w:t>Git 更新失败</w:t>
             </w:r>
@@ -3000,7 +3000,7 @@
                 <w:rFonts w:ascii="Aptos" w:hAnsi="Aptos" w:eastAsia="Microsoft YaHei"/>
                 <w:b w:val="0"/>
                 <w:color w:val="000000"/>
-                <w:sz w:val="20"/>
+                <w:sz w:val="18"/>
               </w:rPr>
               <w:t>检查网络、仓库地址和 GitHub 权限；不要把凭据写入 Skill。</w:t>
             </w:r>

</xml_diff>

<commit_message>
Tune table body text for visual consistency
</commit_message>
<xml_diff>
--- a/docs/Codex-Document-Standard-使用教程.docx
+++ b/docs/Codex-Document-Standard-使用教程.docx
@@ -279,7 +279,7 @@
                 <w:rFonts w:ascii="Aptos" w:hAnsi="Aptos" w:eastAsia="Microsoft YaHei"/>
                 <w:b w:val="0"/>
                 <w:color w:val="000000"/>
-                <w:sz w:val="18"/>
+                <w:sz w:val="17"/>
               </w:rPr>
               <w:t>工作报告</w:t>
             </w:r>
@@ -314,7 +314,7 @@
                 <w:rFonts w:ascii="Aptos" w:hAnsi="Aptos" w:eastAsia="Microsoft YaHei"/>
                 <w:b w:val="0"/>
                 <w:color w:val="000000"/>
-                <w:sz w:val="18"/>
+                <w:sz w:val="17"/>
               </w:rPr>
               <w:t>周报  月报  季度复盘  项目总结</w:t>
             </w:r>
@@ -349,7 +349,7 @@
                 <w:rFonts w:ascii="Aptos" w:hAnsi="Aptos" w:eastAsia="Microsoft YaHei"/>
                 <w:b w:val="0"/>
                 <w:color w:val="000000"/>
-                <w:sz w:val="18"/>
+                <w:sz w:val="17"/>
               </w:rPr>
               <w:t>统一标题层级和正文排版</w:t>
             </w:r>
@@ -386,7 +386,7 @@
                 <w:rFonts w:ascii="Aptos" w:hAnsi="Aptos" w:eastAsia="Microsoft YaHei"/>
                 <w:b w:val="0"/>
                 <w:color w:val="000000"/>
-                <w:sz w:val="18"/>
+                <w:sz w:val="17"/>
               </w:rPr>
               <w:t>计划与方案</w:t>
             </w:r>
@@ -421,7 +421,7 @@
                 <w:rFonts w:ascii="Aptos" w:hAnsi="Aptos" w:eastAsia="Microsoft YaHei"/>
                 <w:b w:val="0"/>
                 <w:color w:val="000000"/>
-                <w:sz w:val="18"/>
+                <w:sz w:val="17"/>
               </w:rPr>
               <w:t>项目计划  执行方案  制度说明</w:t>
             </w:r>
@@ -456,7 +456,7 @@
                 <w:rFonts w:ascii="Aptos" w:hAnsi="Aptos" w:eastAsia="Microsoft YaHei"/>
                 <w:b w:val="0"/>
                 <w:color w:val="000000"/>
-                <w:sz w:val="18"/>
+                <w:sz w:val="17"/>
               </w:rPr>
               <w:t>突出结论  范围  风险和动作</w:t>
             </w:r>
@@ -493,7 +493,7 @@
                 <w:rFonts w:ascii="Aptos" w:hAnsi="Aptos" w:eastAsia="Microsoft YaHei"/>
                 <w:b w:val="0"/>
                 <w:color w:val="000000"/>
-                <w:sz w:val="18"/>
+                <w:sz w:val="17"/>
               </w:rPr>
               <w:t>会议文档</w:t>
             </w:r>
@@ -528,7 +528,7 @@
                 <w:rFonts w:ascii="Aptos" w:hAnsi="Aptos" w:eastAsia="Microsoft YaHei"/>
                 <w:b w:val="0"/>
                 <w:color w:val="000000"/>
-                <w:sz w:val="18"/>
+                <w:sz w:val="17"/>
               </w:rPr>
               <w:t>会议纪要  评审记录  跟进清单</w:t>
             </w:r>
@@ -563,7 +563,7 @@
                 <w:rFonts w:ascii="Aptos" w:hAnsi="Aptos" w:eastAsia="Microsoft YaHei"/>
                 <w:b w:val="0"/>
                 <w:color w:val="000000"/>
-                <w:sz w:val="18"/>
+                <w:sz w:val="17"/>
               </w:rPr>
               <w:t>统一表格  日期  状态和责任信息</w:t>
             </w:r>
@@ -600,7 +600,7 @@
                 <w:rFonts w:ascii="Aptos" w:hAnsi="Aptos" w:eastAsia="Microsoft YaHei"/>
                 <w:b w:val="0"/>
                 <w:color w:val="000000"/>
-                <w:sz w:val="18"/>
+                <w:sz w:val="17"/>
               </w:rPr>
               <w:t>钉钉文档</w:t>
             </w:r>
@@ -635,7 +635,7 @@
                 <w:rFonts w:ascii="Aptos" w:hAnsi="Aptos" w:eastAsia="Microsoft YaHei"/>
                 <w:b w:val="0"/>
                 <w:color w:val="000000"/>
-                <w:sz w:val="18"/>
+                <w:sz w:val="17"/>
               </w:rPr>
               <w:t>工作文档和文档表格</w:t>
             </w:r>
@@ -670,7 +670,7 @@
                 <w:rFonts w:ascii="Aptos" w:hAnsi="Aptos" w:eastAsia="Microsoft YaHei"/>
                 <w:b w:val="0"/>
                 <w:color w:val="000000"/>
-                <w:sz w:val="18"/>
+                <w:sz w:val="17"/>
               </w:rPr>
               <w:t>按平台能力应用同一视觉语言</w:t>
             </w:r>
@@ -1704,7 +1704,7 @@
                 <w:rFonts w:ascii="Aptos" w:hAnsi="Aptos" w:eastAsia="Microsoft YaHei"/>
                 <w:b w:val="0"/>
                 <w:color w:val="000000"/>
-                <w:sz w:val="18"/>
+                <w:sz w:val="17"/>
               </w:rPr>
               <w:t>视觉基调</w:t>
             </w:r>
@@ -1739,7 +1739,7 @@
                 <w:rFonts w:ascii="Aptos" w:hAnsi="Aptos" w:eastAsia="Microsoft YaHei"/>
                 <w:b w:val="0"/>
                 <w:color w:val="000000"/>
-                <w:sz w:val="18"/>
+                <w:sz w:val="17"/>
               </w:rPr>
               <w:t>专业  克制  清晰  白色页面背景</w:t>
             </w:r>
@@ -1776,7 +1776,7 @@
                 <w:rFonts w:ascii="Aptos" w:hAnsi="Aptos" w:eastAsia="Microsoft YaHei"/>
                 <w:b w:val="0"/>
                 <w:color w:val="000000"/>
-                <w:sz w:val="18"/>
+                <w:sz w:val="17"/>
               </w:rPr>
               <w:t>主色</w:t>
             </w:r>
@@ -1811,7 +1811,7 @@
                 <w:rFonts w:ascii="Aptos" w:hAnsi="Aptos" w:eastAsia="Microsoft YaHei"/>
                 <w:b w:val="0"/>
                 <w:color w:val="000000"/>
-                <w:sz w:val="18"/>
+                <w:sz w:val="17"/>
               </w:rPr>
               <w:t>#2F75B5</w:t>
             </w:r>
@@ -1848,7 +1848,7 @@
                 <w:rFonts w:ascii="Aptos" w:hAnsi="Aptos" w:eastAsia="Microsoft YaHei"/>
                 <w:b w:val="0"/>
                 <w:color w:val="000000"/>
-                <w:sz w:val="18"/>
+                <w:sz w:val="17"/>
               </w:rPr>
               <w:t>表头</w:t>
             </w:r>
@@ -1883,7 +1883,7 @@
                 <w:rFonts w:ascii="Aptos" w:hAnsi="Aptos" w:eastAsia="Microsoft YaHei"/>
                 <w:b w:val="0"/>
                 <w:color w:val="000000"/>
-                <w:sz w:val="18"/>
+                <w:sz w:val="17"/>
               </w:rPr>
               <w:t>#005D8D 背景  白色  10 pt  加粗  视觉与 9 pt 正文一致</w:t>
             </w:r>
@@ -1920,7 +1920,7 @@
                 <w:rFonts w:ascii="Aptos" w:hAnsi="Aptos" w:eastAsia="Microsoft YaHei"/>
                 <w:b w:val="0"/>
                 <w:color w:val="000000"/>
-                <w:sz w:val="18"/>
+                <w:sz w:val="17"/>
               </w:rPr>
               <w:t>正文</w:t>
             </w:r>
@@ -1955,7 +1955,7 @@
                 <w:rFonts w:ascii="Aptos" w:hAnsi="Aptos" w:eastAsia="Microsoft YaHei"/>
                 <w:b w:val="0"/>
                 <w:color w:val="000000"/>
-                <w:sz w:val="18"/>
+                <w:sz w:val="17"/>
               </w:rPr>
               <w:t>9 pt  左对齐  1.2 行距  段前 2  段后 4</w:t>
             </w:r>
@@ -1992,7 +1992,7 @@
                 <w:rFonts w:ascii="Aptos" w:hAnsi="Aptos" w:eastAsia="Microsoft YaHei"/>
                 <w:b w:val="0"/>
                 <w:color w:val="000000"/>
-                <w:sz w:val="18"/>
+                <w:sz w:val="17"/>
               </w:rPr>
               <w:t>说明块</w:t>
             </w:r>
@@ -2027,7 +2027,7 @@
                 <w:rFonts w:ascii="Aptos" w:hAnsi="Aptos" w:eastAsia="Microsoft YaHei"/>
                 <w:b w:val="0"/>
                 <w:color w:val="000000"/>
-                <w:sz w:val="18"/>
+                <w:sz w:val="17"/>
               </w:rPr>
               <w:t>#EEF5F8 背景  无外边框  10 pt</w:t>
             </w:r>
@@ -2064,7 +2064,7 @@
                 <w:rFonts w:ascii="Aptos" w:hAnsi="Aptos" w:eastAsia="Microsoft YaHei"/>
                 <w:b w:val="0"/>
                 <w:color w:val="000000"/>
-                <w:sz w:val="18"/>
+                <w:sz w:val="17"/>
               </w:rPr>
               <w:t>表格对齐</w:t>
             </w:r>
@@ -2099,7 +2099,7 @@
                 <w:rFonts w:ascii="Aptos" w:hAnsi="Aptos" w:eastAsia="Microsoft YaHei"/>
                 <w:b w:val="0"/>
                 <w:color w:val="000000"/>
-                <w:sz w:val="18"/>
+                <w:sz w:val="17"/>
               </w:rPr>
               <w:t>文字左对齐  数字右对齐  日期状态序号居中</w:t>
             </w:r>
@@ -2136,7 +2136,7 @@
                 <w:rFonts w:ascii="Aptos" w:hAnsi="Aptos" w:eastAsia="Microsoft YaHei"/>
                 <w:b w:val="0"/>
                 <w:color w:val="000000"/>
-                <w:sz w:val="18"/>
+                <w:sz w:val="17"/>
               </w:rPr>
               <w:t>空值与日期</w:t>
             </w:r>
@@ -2171,7 +2171,7 @@
                 <w:rFonts w:ascii="Aptos" w:hAnsi="Aptos" w:eastAsia="Microsoft YaHei"/>
                 <w:b w:val="0"/>
                 <w:color w:val="000000"/>
-                <w:sz w:val="18"/>
+                <w:sz w:val="17"/>
               </w:rPr>
               <w:t>空值使用 —  日期使用 YYYY-MM-DD</w:t>
             </w:r>
@@ -2208,7 +2208,7 @@
                 <w:rFonts w:ascii="Aptos" w:hAnsi="Aptos" w:eastAsia="Microsoft YaHei"/>
                 <w:b w:val="0"/>
                 <w:color w:val="000000"/>
-                <w:sz w:val="18"/>
+                <w:sz w:val="17"/>
               </w:rPr>
               <w:t>内容表达</w:t>
             </w:r>
@@ -2243,7 +2243,7 @@
                 <w:rFonts w:ascii="Aptos" w:hAnsi="Aptos" w:eastAsia="Microsoft YaHei"/>
                 <w:b w:val="0"/>
                 <w:color w:val="000000"/>
-                <w:sz w:val="18"/>
+                <w:sz w:val="17"/>
               </w:rPr>
               <w:t>结论先行  事实可验证  链接真实可访问</w:t>
             </w:r>
@@ -2677,7 +2677,7 @@
                 <w:rFonts w:ascii="Aptos" w:hAnsi="Aptos" w:eastAsia="Microsoft YaHei"/>
                 <w:b w:val="0"/>
                 <w:color w:val="000000"/>
-                <w:sz w:val="18"/>
+                <w:sz w:val="17"/>
               </w:rPr>
               <w:t>Codex 找不到 Skill</w:t>
             </w:r>
@@ -2712,7 +2712,7 @@
                 <w:rFonts w:ascii="Aptos" w:hAnsi="Aptos" w:eastAsia="Microsoft YaHei"/>
                 <w:b w:val="0"/>
                 <w:color w:val="000000"/>
-                <w:sz w:val="18"/>
+                <w:sz w:val="17"/>
               </w:rPr>
               <w:t>检查安装路径和文件夹嵌套层级，然后重新开始一轮对话。</w:t>
             </w:r>
@@ -2749,7 +2749,7 @@
                 <w:rFonts w:ascii="Aptos" w:hAnsi="Aptos" w:eastAsia="Microsoft YaHei"/>
                 <w:b w:val="0"/>
                 <w:color w:val="000000"/>
-                <w:sz w:val="18"/>
+                <w:sz w:val="17"/>
               </w:rPr>
               <w:t>已有公司模板</w:t>
             </w:r>
@@ -2784,7 +2784,7 @@
                 <w:rFonts w:ascii="Aptos" w:hAnsi="Aptos" w:eastAsia="Microsoft YaHei"/>
                 <w:b w:val="0"/>
                 <w:color w:val="000000"/>
-                <w:sz w:val="18"/>
+                <w:sz w:val="17"/>
               </w:rPr>
               <w:t>继续使用公司模板；本 Skill 只补充模板未规定的细节。</w:t>
             </w:r>
@@ -2821,7 +2821,7 @@
                 <w:rFonts w:ascii="Aptos" w:hAnsi="Aptos" w:eastAsia="Microsoft YaHei"/>
                 <w:b w:val="0"/>
                 <w:color w:val="000000"/>
-                <w:sz w:val="18"/>
+                <w:sz w:val="17"/>
               </w:rPr>
               <w:t>只想修改一个表格</w:t>
             </w:r>
@@ -2856,7 +2856,7 @@
                 <w:rFonts w:ascii="Aptos" w:hAnsi="Aptos" w:eastAsia="Microsoft YaHei"/>
                 <w:b w:val="0"/>
                 <w:color w:val="000000"/>
-                <w:sz w:val="18"/>
+                <w:sz w:val="17"/>
               </w:rPr>
               <w:t>明确指定修改范围，Codex 必须保留其他内容和样式。</w:t>
             </w:r>
@@ -2893,7 +2893,7 @@
                 <w:rFonts w:ascii="Aptos" w:hAnsi="Aptos" w:eastAsia="Microsoft YaHei"/>
                 <w:b w:val="0"/>
                 <w:color w:val="000000"/>
-                <w:sz w:val="18"/>
+                <w:sz w:val="17"/>
               </w:rPr>
               <w:t>需要更换品牌色</w:t>
             </w:r>
@@ -2928,7 +2928,7 @@
                 <w:rFonts w:ascii="Aptos" w:hAnsi="Aptos" w:eastAsia="Microsoft YaHei"/>
                 <w:b w:val="0"/>
                 <w:color w:val="000000"/>
-                <w:sz w:val="18"/>
+                <w:sz w:val="17"/>
               </w:rPr>
               <w:t>修改 style-standard.md 中的颜色定义，并保持全篇一致。</w:t>
             </w:r>
@@ -2965,7 +2965,7 @@
                 <w:rFonts w:ascii="Aptos" w:hAnsi="Aptos" w:eastAsia="Microsoft YaHei"/>
                 <w:b w:val="0"/>
                 <w:color w:val="000000"/>
-                <w:sz w:val="18"/>
+                <w:sz w:val="17"/>
               </w:rPr>
               <w:t>Git 更新失败</w:t>
             </w:r>
@@ -3000,7 +3000,7 @@
                 <w:rFonts w:ascii="Aptos" w:hAnsi="Aptos" w:eastAsia="Microsoft YaHei"/>
                 <w:b w:val="0"/>
                 <w:color w:val="000000"/>
-                <w:sz w:val="18"/>
+                <w:sz w:val="17"/>
               </w:rPr>
               <w:t>检查网络、仓库地址和 GitHub 权限；不要把凭据写入 Skill。</w:t>
             </w:r>

</xml_diff>

<commit_message>
Restore original DingTalk typography baseline
</commit_message>
<xml_diff>
--- a/docs/Codex-Document-Standard-使用教程.docx
+++ b/docs/Codex-Document-Standard-使用教程.docx
@@ -43,7 +43,7 @@
           <w:rFonts w:ascii="Aptos" w:hAnsi="Aptos" w:eastAsia="Microsoft YaHei"/>
           <w:b w:val="0"/>
           <w:color w:val="000000"/>
-          <w:sz w:val="18"/>
+          <w:sz w:val="21"/>
         </w:rPr>
         <w:t>这份教程帮助使用者安装并使用 Codex Document Standard。安装完成后，Codex 可以在创建报告、计划、复盘、会议纪要、方案和工作总结时，自动应用一致的标题、正文、说明块和表格规范。</w:t>
       </w:r>
@@ -79,7 +79,7 @@
                 <w:rFonts w:ascii="Aptos" w:hAnsi="Aptos" w:eastAsia="Microsoft YaHei"/>
                 <w:b/>
                 <w:color w:val="2F75B5"/>
-                <w:sz w:val="18"/>
+                <w:sz w:val="20"/>
               </w:rPr>
               <w:t>核心结论：</w:t>
             </w:r>
@@ -88,7 +88,7 @@
                 <w:rFonts w:ascii="Aptos" w:hAnsi="Aptos" w:eastAsia="Microsoft YaHei"/>
                 <w:b w:val="0"/>
                 <w:color w:val="000000"/>
-                <w:sz w:val="18"/>
+                <w:sz w:val="20"/>
               </w:rPr>
               <w:t>最简单的安装方式是让 Codex 使用 skill-installer 从 GitHub 仓库安装。安装后重新开始一轮对话，并用显式调用示例完成首次验证。</w:t>
             </w:r>
@@ -119,7 +119,7 @@
           <w:rFonts w:ascii="Aptos" w:hAnsi="Aptos" w:eastAsia="Microsoft YaHei"/>
           <w:b w:val="0"/>
           <w:color w:val="000000"/>
-          <w:sz w:val="18"/>
+          <w:sz w:val="21"/>
         </w:rPr>
         <w:t>该 Skill 面向专业工作文档，重点解决不同任务之间标题、字体、颜色、间距和表格样式不一致的问题。</w:t>
       </w:r>
@@ -279,7 +279,7 @@
                 <w:rFonts w:ascii="Aptos" w:hAnsi="Aptos" w:eastAsia="Microsoft YaHei"/>
                 <w:b w:val="0"/>
                 <w:color w:val="000000"/>
-                <w:sz w:val="17"/>
+                <w:sz w:val="20"/>
               </w:rPr>
               <w:t>工作报告</w:t>
             </w:r>
@@ -314,7 +314,7 @@
                 <w:rFonts w:ascii="Aptos" w:hAnsi="Aptos" w:eastAsia="Microsoft YaHei"/>
                 <w:b w:val="0"/>
                 <w:color w:val="000000"/>
-                <w:sz w:val="17"/>
+                <w:sz w:val="20"/>
               </w:rPr>
               <w:t>周报  月报  季度复盘  项目总结</w:t>
             </w:r>
@@ -349,7 +349,7 @@
                 <w:rFonts w:ascii="Aptos" w:hAnsi="Aptos" w:eastAsia="Microsoft YaHei"/>
                 <w:b w:val="0"/>
                 <w:color w:val="000000"/>
-                <w:sz w:val="17"/>
+                <w:sz w:val="20"/>
               </w:rPr>
               <w:t>统一标题层级和正文排版</w:t>
             </w:r>
@@ -386,7 +386,7 @@
                 <w:rFonts w:ascii="Aptos" w:hAnsi="Aptos" w:eastAsia="Microsoft YaHei"/>
                 <w:b w:val="0"/>
                 <w:color w:val="000000"/>
-                <w:sz w:val="17"/>
+                <w:sz w:val="20"/>
               </w:rPr>
               <w:t>计划与方案</w:t>
             </w:r>
@@ -421,7 +421,7 @@
                 <w:rFonts w:ascii="Aptos" w:hAnsi="Aptos" w:eastAsia="Microsoft YaHei"/>
                 <w:b w:val="0"/>
                 <w:color w:val="000000"/>
-                <w:sz w:val="17"/>
+                <w:sz w:val="20"/>
               </w:rPr>
               <w:t>项目计划  执行方案  制度说明</w:t>
             </w:r>
@@ -456,7 +456,7 @@
                 <w:rFonts w:ascii="Aptos" w:hAnsi="Aptos" w:eastAsia="Microsoft YaHei"/>
                 <w:b w:val="0"/>
                 <w:color w:val="000000"/>
-                <w:sz w:val="17"/>
+                <w:sz w:val="20"/>
               </w:rPr>
               <w:t>突出结论  范围  风险和动作</w:t>
             </w:r>
@@ -493,7 +493,7 @@
                 <w:rFonts w:ascii="Aptos" w:hAnsi="Aptos" w:eastAsia="Microsoft YaHei"/>
                 <w:b w:val="0"/>
                 <w:color w:val="000000"/>
-                <w:sz w:val="17"/>
+                <w:sz w:val="20"/>
               </w:rPr>
               <w:t>会议文档</w:t>
             </w:r>
@@ -528,7 +528,7 @@
                 <w:rFonts w:ascii="Aptos" w:hAnsi="Aptos" w:eastAsia="Microsoft YaHei"/>
                 <w:b w:val="0"/>
                 <w:color w:val="000000"/>
-                <w:sz w:val="17"/>
+                <w:sz w:val="20"/>
               </w:rPr>
               <w:t>会议纪要  评审记录  跟进清单</w:t>
             </w:r>
@@ -563,7 +563,7 @@
                 <w:rFonts w:ascii="Aptos" w:hAnsi="Aptos" w:eastAsia="Microsoft YaHei"/>
                 <w:b w:val="0"/>
                 <w:color w:val="000000"/>
-                <w:sz w:val="17"/>
+                <w:sz w:val="20"/>
               </w:rPr>
               <w:t>统一表格  日期  状态和责任信息</w:t>
             </w:r>
@@ -600,7 +600,7 @@
                 <w:rFonts w:ascii="Aptos" w:hAnsi="Aptos" w:eastAsia="Microsoft YaHei"/>
                 <w:b w:val="0"/>
                 <w:color w:val="000000"/>
-                <w:sz w:val="17"/>
+                <w:sz w:val="20"/>
               </w:rPr>
               <w:t>钉钉文档</w:t>
             </w:r>
@@ -635,7 +635,7 @@
                 <w:rFonts w:ascii="Aptos" w:hAnsi="Aptos" w:eastAsia="Microsoft YaHei"/>
                 <w:b w:val="0"/>
                 <w:color w:val="000000"/>
-                <w:sz w:val="17"/>
+                <w:sz w:val="20"/>
               </w:rPr>
               <w:t>工作文档和文档表格</w:t>
             </w:r>
@@ -670,7 +670,7 @@
                 <w:rFonts w:ascii="Aptos" w:hAnsi="Aptos" w:eastAsia="Microsoft YaHei"/>
                 <w:b w:val="0"/>
                 <w:color w:val="000000"/>
-                <w:sz w:val="17"/>
+                <w:sz w:val="20"/>
               </w:rPr>
               <w:t>按平台能力应用同一视觉语言</w:t>
             </w:r>
@@ -692,7 +692,7 @@
           <w:rFonts w:ascii="Aptos" w:hAnsi="Aptos" w:eastAsia="Microsoft YaHei"/>
           <w:b w:val="0"/>
           <w:color w:val="000000"/>
-          <w:sz w:val="18"/>
+          <w:sz w:val="21"/>
         </w:rPr>
         <w:t>README、源代码、PPT、Excel 和营销视觉稿默认不在适用范围内。用户明确要求沿用同一视觉语言时，可以例外使用。</w:t>
       </w:r>
@@ -716,7 +716,7 @@
           <w:rFonts w:ascii="Aptos" w:hAnsi="Aptos" w:eastAsia="Microsoft YaHei"/>
           <w:b w:val="0"/>
           <w:color w:val="000000"/>
-          <w:sz w:val="18"/>
+          <w:sz w:val="21"/>
         </w:rPr>
         <w:t>已安装并可以正常使用 Codex。</w:t>
       </w:r>
@@ -731,7 +731,7 @@
           <w:rFonts w:ascii="Aptos" w:hAnsi="Aptos" w:eastAsia="Microsoft YaHei"/>
           <w:b w:val="0"/>
           <w:color w:val="000000"/>
-          <w:sz w:val="18"/>
+          <w:sz w:val="21"/>
         </w:rPr>
         <w:t>可以访问 GitHub。</w:t>
       </w:r>
@@ -746,7 +746,7 @@
           <w:rFonts w:ascii="Aptos" w:hAnsi="Aptos" w:eastAsia="Microsoft YaHei"/>
           <w:b w:val="0"/>
           <w:color w:val="000000"/>
-          <w:sz w:val="18"/>
+          <w:sz w:val="21"/>
         </w:rPr>
         <w:t>目标目录中不存在同名的 codex-document-standard Skill。</w:t>
       </w:r>
@@ -761,7 +761,7 @@
           <w:rFonts w:ascii="Aptos" w:hAnsi="Aptos" w:eastAsia="Microsoft YaHei"/>
           <w:b w:val="0"/>
           <w:color w:val="000000"/>
-          <w:sz w:val="18"/>
+          <w:sz w:val="21"/>
         </w:rPr>
         <w:t>安装私人仓库时，需要提前配置相应的 GitHub 访问权限；公开仓库无需额外凭据。</w:t>
       </w:r>
@@ -784,7 +784,7 @@
           <w:rFonts w:ascii="Aptos" w:hAnsi="Aptos" w:eastAsia="Microsoft YaHei"/>
           <w:b w:val="0"/>
           <w:color w:val="000000"/>
-          <w:sz w:val="18"/>
+          <w:sz w:val="21"/>
         </w:rPr>
         <w:t>本仓库已公开发布。使用者无需登录 GitHub，可以直接查看仓库、下载 Word 教程或使用 Git 克隆。</w:t>
       </w:r>
@@ -798,7 +798,7 @@
           <w:rFonts w:ascii="Aptos" w:hAnsi="Aptos" w:eastAsia="Microsoft YaHei"/>
           <w:b/>
           <w:color w:val="2F75B5"/>
-          <w:sz w:val="18"/>
+          <w:sz w:val="21"/>
         </w:rPr>
         <w:t>仓库主页：</w:t>
       </w:r>
@@ -821,7 +821,7 @@
           <w:rFonts w:ascii="Aptos" w:hAnsi="Aptos" w:eastAsia="Microsoft YaHei"/>
           <w:b/>
           <w:color w:val="2F75B5"/>
-          <w:sz w:val="18"/>
+          <w:sz w:val="21"/>
         </w:rPr>
         <w:t>Word 使用教程：</w:t>
       </w:r>
@@ -866,7 +866,7 @@
                 <w:rFonts w:ascii="Aptos" w:hAnsi="Aptos" w:eastAsia="Microsoft YaHei"/>
                 <w:b/>
                 <w:color w:val="2F75B5"/>
-                <w:sz w:val="18"/>
+                <w:sz w:val="20"/>
               </w:rPr>
               <w:t>分享方式：</w:t>
             </w:r>
@@ -875,7 +875,7 @@
                 <w:rFonts w:ascii="Aptos" w:hAnsi="Aptos" w:eastAsia="Microsoft YaHei"/>
                 <w:b w:val="0"/>
                 <w:color w:val="000000"/>
-                <w:sz w:val="18"/>
+                <w:sz w:val="20"/>
               </w:rPr>
               <w:t>将仓库主页链接发给其他使用者即可。公开仓库不需要 GitHub 账号或额外权限。</w:t>
             </w:r>
@@ -915,7 +915,7 @@
           <w:rFonts w:ascii="Aptos" w:hAnsi="Aptos" w:eastAsia="Microsoft YaHei"/>
           <w:b w:val="0"/>
           <w:color w:val="000000"/>
-          <w:sz w:val="18"/>
+          <w:sz w:val="21"/>
         </w:rPr>
         <w:t>在 Codex 中发送下面的指令。Codex 会调用 skill-installer，将仓库根目录安装为 codex-document-standard。</w:t>
       </w:r>
@@ -951,7 +951,7 @@
                 <w:rFonts w:ascii="Consolas" w:hAnsi="Consolas" w:eastAsia="Microsoft YaHei"/>
                 <w:b w:val="0"/>
                 <w:color w:val="000000"/>
-                <w:sz w:val="18"/>
+                <w:sz w:val="20"/>
               </w:rPr>
               <w:t>使用 $skill-installer 安装 GitHub 仓库</w:t>
             </w:r>
@@ -963,7 +963,7 @@
                 <w:rFonts w:ascii="Consolas" w:hAnsi="Consolas" w:eastAsia="Microsoft YaHei"/>
                 <w:b w:val="0"/>
                 <w:color w:val="000000"/>
-                <w:sz w:val="18"/>
+                <w:sz w:val="20"/>
               </w:rPr>
               <w:t>xiehao9991-cpu/codex-document-standard 根目录的 Skill；</w:t>
             </w:r>
@@ -975,7 +975,7 @@
                 <w:rFonts w:ascii="Consolas" w:hAnsi="Consolas" w:eastAsia="Microsoft YaHei"/>
                 <w:b w:val="0"/>
                 <w:color w:val="000000"/>
-                <w:sz w:val="18"/>
+                <w:sz w:val="20"/>
               </w:rPr>
               <w:t>path 使用 .，安装名称使用 codex-document-standard。</w:t>
             </w:r>
@@ -997,7 +997,7 @@
           <w:rFonts w:ascii="Aptos" w:hAnsi="Aptos" w:eastAsia="Microsoft YaHei"/>
           <w:b w:val="0"/>
           <w:color w:val="000000"/>
-          <w:sz w:val="18"/>
+          <w:sz w:val="21"/>
         </w:rPr>
         <w:t>安装完成后重新开始一轮对话。Skill 会在下一轮被发现并参与任务判断。</w:t>
       </w:r>
@@ -1051,7 +1051,7 @@
                 <w:rFonts w:ascii="Consolas" w:hAnsi="Consolas" w:eastAsia="Microsoft YaHei"/>
                 <w:b w:val="0"/>
                 <w:color w:val="000000"/>
-                <w:sz w:val="18"/>
+                <w:sz w:val="20"/>
               </w:rPr>
               <w:t>git clone https://github.com/xiehao9991-cpu/codex-document-standard.git ~/.codex/skills/codex-document-standard</w:t>
             </w:r>
@@ -1104,7 +1104,7 @@
                 <w:rFonts w:ascii="Consolas" w:hAnsi="Consolas" w:eastAsia="Microsoft YaHei"/>
                 <w:b w:val="0"/>
                 <w:color w:val="000000"/>
-                <w:sz w:val="18"/>
+                <w:sz w:val="20"/>
               </w:rPr>
               <w:t>git clone https://github.com/xiehao9991-cpu/codex-document-standard.git `</w:t>
             </w:r>
@@ -1116,7 +1116,7 @@
                 <w:rFonts w:ascii="Consolas" w:hAnsi="Consolas" w:eastAsia="Microsoft YaHei"/>
                 <w:b w:val="0"/>
                 <w:color w:val="000000"/>
-                <w:sz w:val="18"/>
+                <w:sz w:val="20"/>
               </w:rPr>
               <w:t xml:space="preserve">  "$env:USERPROFILE\.codex\skills\codex-document-standard"</w:t>
             </w:r>
@@ -1148,7 +1148,7 @@
           <w:rFonts w:ascii="Aptos" w:hAnsi="Aptos" w:eastAsia="Microsoft YaHei"/>
           <w:b w:val="0"/>
           <w:color w:val="000000"/>
-          <w:sz w:val="18"/>
+          <w:sz w:val="21"/>
         </w:rPr>
         <w:t>在 GitHub 仓库页面选择 Code 和 Download ZIP。</w:t>
       </w:r>
@@ -1163,7 +1163,7 @@
           <w:rFonts w:ascii="Aptos" w:hAnsi="Aptos" w:eastAsia="Microsoft YaHei"/>
           <w:b w:val="0"/>
           <w:color w:val="000000"/>
-          <w:sz w:val="18"/>
+          <w:sz w:val="21"/>
         </w:rPr>
         <w:t>解压后将文件夹重命名为 codex-document-standard。</w:t>
       </w:r>
@@ -1178,7 +1178,7 @@
           <w:rFonts w:ascii="Aptos" w:hAnsi="Aptos" w:eastAsia="Microsoft YaHei"/>
           <w:b w:val="0"/>
           <w:color w:val="000000"/>
-          <w:sz w:val="18"/>
+          <w:sz w:val="21"/>
         </w:rPr>
         <w:t>将文件夹放入用户目录下的 .codex/skills。</w:t>
       </w:r>
@@ -1193,7 +1193,7 @@
           <w:rFonts w:ascii="Aptos" w:hAnsi="Aptos" w:eastAsia="Microsoft YaHei"/>
           <w:b w:val="0"/>
           <w:color w:val="000000"/>
-          <w:sz w:val="18"/>
+          <w:sz w:val="21"/>
         </w:rPr>
         <w:t>确认 SKILL.md 直接位于 codex-document-standard 文件夹内，不要多嵌套一层目录。</w:t>
       </w:r>
@@ -1208,7 +1208,7 @@
           <w:rFonts w:ascii="Aptos" w:hAnsi="Aptos" w:eastAsia="Microsoft YaHei"/>
           <w:b w:val="0"/>
           <w:color w:val="000000"/>
-          <w:sz w:val="18"/>
+          <w:sz w:val="21"/>
         </w:rPr>
         <w:t>重新开始一轮 Codex 对话。</w:t>
       </w:r>
@@ -1231,7 +1231,7 @@
           <w:rFonts w:ascii="Aptos" w:hAnsi="Aptos" w:eastAsia="Microsoft YaHei"/>
           <w:b w:val="0"/>
           <w:color w:val="000000"/>
-          <w:sz w:val="18"/>
+          <w:sz w:val="21"/>
         </w:rPr>
         <w:t>首次使用建议显式调用 Skill，以便快速确认名称和加载路径正确。</w:t>
       </w:r>
@@ -1267,7 +1267,7 @@
                 <w:rFonts w:ascii="Consolas" w:hAnsi="Consolas" w:eastAsia="Microsoft YaHei"/>
                 <w:b w:val="0"/>
                 <w:color w:val="000000"/>
-                <w:sz w:val="18"/>
+                <w:sz w:val="20"/>
               </w:rPr>
               <w:t>使用 $codex-document-standard 创建一份项目周报。</w:t>
             </w:r>
@@ -1289,7 +1289,7 @@
           <w:rFonts w:ascii="Aptos" w:hAnsi="Aptos" w:eastAsia="Microsoft YaHei"/>
           <w:b w:val="0"/>
           <w:color w:val="000000"/>
-          <w:sz w:val="18"/>
+          <w:sz w:val="21"/>
         </w:rPr>
         <w:t>输出满足以下特征时，说明 Skill 已被正确应用：</w:t>
       </w:r>
@@ -1304,7 +1304,7 @@
           <w:rFonts w:ascii="Aptos" w:hAnsi="Aptos" w:eastAsia="Microsoft YaHei"/>
           <w:b w:val="0"/>
           <w:color w:val="000000"/>
-          <w:sz w:val="18"/>
+          <w:sz w:val="21"/>
         </w:rPr>
         <w:t>主色为 #2F75B5，深色表头为 #005D8D。</w:t>
       </w:r>
@@ -1319,7 +1319,7 @@
           <w:rFonts w:ascii="Aptos" w:hAnsi="Aptos" w:eastAsia="Microsoft YaHei"/>
           <w:b w:val="0"/>
           <w:color w:val="000000"/>
-          <w:sz w:val="18"/>
+          <w:sz w:val="21"/>
         </w:rPr>
         <w:t>标题使用连续的 H1 到 H4 层级。</w:t>
       </w:r>
@@ -1334,7 +1334,7 @@
           <w:rFonts w:ascii="Aptos" w:hAnsi="Aptos" w:eastAsia="Microsoft YaHei"/>
           <w:b w:val="0"/>
           <w:color w:val="000000"/>
-          <w:sz w:val="18"/>
+          <w:sz w:val="21"/>
         </w:rPr>
         <w:t>正文默认 10.5 pt，行距 1.2。</w:t>
       </w:r>
@@ -1349,7 +1349,7 @@
           <w:rFonts w:ascii="Aptos" w:hAnsi="Aptos" w:eastAsia="Microsoft YaHei"/>
           <w:b w:val="0"/>
           <w:color w:val="000000"/>
-          <w:sz w:val="18"/>
+          <w:sz w:val="21"/>
         </w:rPr>
         <w:t>文字左对齐，数字右对齐，日期和状态居中。</w:t>
       </w:r>
@@ -1364,7 +1364,7 @@
           <w:rFonts w:ascii="Aptos" w:hAnsi="Aptos" w:eastAsia="Microsoft YaHei"/>
           <w:b w:val="0"/>
           <w:color w:val="000000"/>
-          <w:sz w:val="18"/>
+          <w:sz w:val="21"/>
         </w:rPr>
         <w:t>空值使用 —，日期使用 YYYY-MM-DD。</w:t>
       </w:r>
@@ -1400,7 +1400,7 @@
                 <w:rFonts w:ascii="Aptos" w:hAnsi="Aptos" w:eastAsia="Microsoft YaHei"/>
                 <w:b/>
                 <w:color w:val="2F75B5"/>
-                <w:sz w:val="18"/>
+                <w:sz w:val="20"/>
               </w:rPr>
               <w:t>排查提示：</w:t>
             </w:r>
@@ -1409,7 +1409,7 @@
                 <w:rFonts w:ascii="Aptos" w:hAnsi="Aptos" w:eastAsia="Microsoft YaHei"/>
                 <w:b w:val="0"/>
                 <w:color w:val="000000"/>
-                <w:sz w:val="18"/>
+                <w:sz w:val="20"/>
               </w:rPr>
               <w:t>如果 Codex 提示找不到 Skill，先检查最终路径是否为 ~/.codex/skills/codex-document-standard/SKILL.md，再重新开始一轮对话。</w:t>
             </w:r>
@@ -1449,7 +1449,7 @@
           <w:rFonts w:ascii="Aptos" w:hAnsi="Aptos" w:eastAsia="Microsoft YaHei"/>
           <w:b w:val="0"/>
           <w:color w:val="000000"/>
-          <w:sz w:val="18"/>
+          <w:sz w:val="21"/>
         </w:rPr>
         <w:t>安装后，只要任务属于专业工作文档，Codex 会根据 Skill 描述自动判断是否加载。</w:t>
       </w:r>
@@ -1485,7 +1485,7 @@
                 <w:rFonts w:ascii="Consolas" w:hAnsi="Consolas" w:eastAsia="Microsoft YaHei"/>
                 <w:b w:val="0"/>
                 <w:color w:val="000000"/>
-                <w:sz w:val="18"/>
+                <w:sz w:val="20"/>
               </w:rPr>
               <w:t>把这份季度复盘整理成正式工作文档，保留现有数据和链接。</w:t>
             </w:r>
@@ -1516,7 +1516,7 @@
           <w:rFonts w:ascii="Aptos" w:hAnsi="Aptos" w:eastAsia="Microsoft YaHei"/>
           <w:b w:val="0"/>
           <w:color w:val="000000"/>
-          <w:sz w:val="18"/>
+          <w:sz w:val="21"/>
         </w:rPr>
         <w:t>需要确保使用该规范时，在请求中直接写出 Skill 名称。</w:t>
       </w:r>
@@ -1552,7 +1552,7 @@
                 <w:rFonts w:ascii="Consolas" w:hAnsi="Consolas" w:eastAsia="Microsoft YaHei"/>
                 <w:b w:val="0"/>
                 <w:color w:val="000000"/>
-                <w:sz w:val="18"/>
+                <w:sz w:val="20"/>
               </w:rPr>
               <w:t>使用 $codex-document-standard 统一这份会议纪要的标题、正文和表格样式，</w:t>
             </w:r>
@@ -1564,7 +1564,7 @@
                 <w:rFonts w:ascii="Consolas" w:hAnsi="Consolas" w:eastAsia="Microsoft YaHei"/>
                 <w:b w:val="0"/>
                 <w:color w:val="000000"/>
-                <w:sz w:val="18"/>
+                <w:sz w:val="20"/>
               </w:rPr>
               <w:t>不改动原文事实。</w:t>
             </w:r>
@@ -1704,7 +1704,7 @@
                 <w:rFonts w:ascii="Aptos" w:hAnsi="Aptos" w:eastAsia="Microsoft YaHei"/>
                 <w:b w:val="0"/>
                 <w:color w:val="000000"/>
-                <w:sz w:val="17"/>
+                <w:sz w:val="20"/>
               </w:rPr>
               <w:t>视觉基调</w:t>
             </w:r>
@@ -1739,7 +1739,7 @@
                 <w:rFonts w:ascii="Aptos" w:hAnsi="Aptos" w:eastAsia="Microsoft YaHei"/>
                 <w:b w:val="0"/>
                 <w:color w:val="000000"/>
-                <w:sz w:val="17"/>
+                <w:sz w:val="20"/>
               </w:rPr>
               <w:t>专业  克制  清晰  白色页面背景</w:t>
             </w:r>
@@ -1776,7 +1776,7 @@
                 <w:rFonts w:ascii="Aptos" w:hAnsi="Aptos" w:eastAsia="Microsoft YaHei"/>
                 <w:b w:val="0"/>
                 <w:color w:val="000000"/>
-                <w:sz w:val="17"/>
+                <w:sz w:val="20"/>
               </w:rPr>
               <w:t>主色</w:t>
             </w:r>
@@ -1811,7 +1811,7 @@
                 <w:rFonts w:ascii="Aptos" w:hAnsi="Aptos" w:eastAsia="Microsoft YaHei"/>
                 <w:b w:val="0"/>
                 <w:color w:val="000000"/>
-                <w:sz w:val="17"/>
+                <w:sz w:val="20"/>
               </w:rPr>
               <w:t>#2F75B5</w:t>
             </w:r>
@@ -1848,7 +1848,7 @@
                 <w:rFonts w:ascii="Aptos" w:hAnsi="Aptos" w:eastAsia="Microsoft YaHei"/>
                 <w:b w:val="0"/>
                 <w:color w:val="000000"/>
-                <w:sz w:val="17"/>
+                <w:sz w:val="20"/>
               </w:rPr>
               <w:t>表头</w:t>
             </w:r>
@@ -1883,9 +1883,9 @@
                 <w:rFonts w:ascii="Aptos" w:hAnsi="Aptos" w:eastAsia="Microsoft YaHei"/>
                 <w:b w:val="0"/>
                 <w:color w:val="000000"/>
-                <w:sz w:val="17"/>
+                <w:sz w:val="20"/>
               </w:rPr>
-              <w:t>#005D8D 背景  白色  10 pt  加粗  视觉与 9 pt 正文一致</w:t>
+              <w:t>#005D8D 背景  白色  10 pt  加粗</w:t>
             </w:r>
           </w:p>
         </w:tc>
@@ -1920,7 +1920,7 @@
                 <w:rFonts w:ascii="Aptos" w:hAnsi="Aptos" w:eastAsia="Microsoft YaHei"/>
                 <w:b w:val="0"/>
                 <w:color w:val="000000"/>
-                <w:sz w:val="17"/>
+                <w:sz w:val="20"/>
               </w:rPr>
               <w:t>正文</w:t>
             </w:r>
@@ -1955,9 +1955,9 @@
                 <w:rFonts w:ascii="Aptos" w:hAnsi="Aptos" w:eastAsia="Microsoft YaHei"/>
                 <w:b w:val="0"/>
                 <w:color w:val="000000"/>
-                <w:sz w:val="17"/>
+                <w:sz w:val="20"/>
               </w:rPr>
-              <w:t>9 pt  左对齐  1.2 行距  段前 2  段后 4</w:t>
+              <w:t>10.5 pt  左对齐  1.2 行距  段前 2  段后 4</w:t>
             </w:r>
           </w:p>
         </w:tc>
@@ -1992,7 +1992,7 @@
                 <w:rFonts w:ascii="Aptos" w:hAnsi="Aptos" w:eastAsia="Microsoft YaHei"/>
                 <w:b w:val="0"/>
                 <w:color w:val="000000"/>
-                <w:sz w:val="17"/>
+                <w:sz w:val="20"/>
               </w:rPr>
               <w:t>说明块</w:t>
             </w:r>
@@ -2027,7 +2027,7 @@
                 <w:rFonts w:ascii="Aptos" w:hAnsi="Aptos" w:eastAsia="Microsoft YaHei"/>
                 <w:b w:val="0"/>
                 <w:color w:val="000000"/>
-                <w:sz w:val="17"/>
+                <w:sz w:val="20"/>
               </w:rPr>
               <w:t>#EEF5F8 背景  无外边框  10 pt</w:t>
             </w:r>
@@ -2064,7 +2064,7 @@
                 <w:rFonts w:ascii="Aptos" w:hAnsi="Aptos" w:eastAsia="Microsoft YaHei"/>
                 <w:b w:val="0"/>
                 <w:color w:val="000000"/>
-                <w:sz w:val="17"/>
+                <w:sz w:val="20"/>
               </w:rPr>
               <w:t>表格对齐</w:t>
             </w:r>
@@ -2099,7 +2099,7 @@
                 <w:rFonts w:ascii="Aptos" w:hAnsi="Aptos" w:eastAsia="Microsoft YaHei"/>
                 <w:b w:val="0"/>
                 <w:color w:val="000000"/>
-                <w:sz w:val="17"/>
+                <w:sz w:val="20"/>
               </w:rPr>
               <w:t>文字左对齐  数字右对齐  日期状态序号居中</w:t>
             </w:r>
@@ -2136,7 +2136,7 @@
                 <w:rFonts w:ascii="Aptos" w:hAnsi="Aptos" w:eastAsia="Microsoft YaHei"/>
                 <w:b w:val="0"/>
                 <w:color w:val="000000"/>
-                <w:sz w:val="17"/>
+                <w:sz w:val="20"/>
               </w:rPr>
               <w:t>空值与日期</w:t>
             </w:r>
@@ -2171,7 +2171,7 @@
                 <w:rFonts w:ascii="Aptos" w:hAnsi="Aptos" w:eastAsia="Microsoft YaHei"/>
                 <w:b w:val="0"/>
                 <w:color w:val="000000"/>
-                <w:sz w:val="17"/>
+                <w:sz w:val="20"/>
               </w:rPr>
               <w:t>空值使用 —  日期使用 YYYY-MM-DD</w:t>
             </w:r>
@@ -2208,7 +2208,7 @@
                 <w:rFonts w:ascii="Aptos" w:hAnsi="Aptos" w:eastAsia="Microsoft YaHei"/>
                 <w:b w:val="0"/>
                 <w:color w:val="000000"/>
-                <w:sz w:val="17"/>
+                <w:sz w:val="20"/>
               </w:rPr>
               <w:t>内容表达</w:t>
             </w:r>
@@ -2243,7 +2243,7 @@
                 <w:rFonts w:ascii="Aptos" w:hAnsi="Aptos" w:eastAsia="Microsoft YaHei"/>
                 <w:b w:val="0"/>
                 <w:color w:val="000000"/>
-                <w:sz w:val="17"/>
+                <w:sz w:val="20"/>
               </w:rPr>
               <w:t>结论先行  事实可验证  链接真实可访问</w:t>
             </w:r>
@@ -2274,7 +2274,7 @@
           <w:rFonts w:ascii="Aptos" w:hAnsi="Aptos" w:eastAsia="Microsoft YaHei"/>
           <w:b w:val="0"/>
           <w:color w:val="000000"/>
-          <w:sz w:val="18"/>
+          <w:sz w:val="21"/>
         </w:rPr>
         <w:t>当不同规则发生冲突时，按以下顺序执行：</w:t>
       </w:r>
@@ -2289,7 +2289,7 @@
           <w:rFonts w:ascii="Aptos" w:hAnsi="Aptos" w:eastAsia="Microsoft YaHei"/>
           <w:b w:val="0"/>
           <w:color w:val="000000"/>
-          <w:sz w:val="18"/>
+          <w:sz w:val="21"/>
         </w:rPr>
         <w:t>用户本次明确要求。</w:t>
       </w:r>
@@ -2304,7 +2304,7 @@
           <w:rFonts w:ascii="Aptos" w:hAnsi="Aptos" w:eastAsia="Microsoft YaHei"/>
           <w:b w:val="0"/>
           <w:color w:val="000000"/>
-          <w:sz w:val="18"/>
+          <w:sz w:val="21"/>
         </w:rPr>
         <w:t>用户提供的原模板或公司模板。</w:t>
       </w:r>
@@ -2319,7 +2319,7 @@
           <w:rFonts w:ascii="Aptos" w:hAnsi="Aptos" w:eastAsia="Microsoft YaHei"/>
           <w:b w:val="0"/>
           <w:color w:val="000000"/>
-          <w:sz w:val="18"/>
+          <w:sz w:val="21"/>
         </w:rPr>
         <w:t>Codex Document Standard 默认规范。</w:t>
       </w:r>
@@ -2333,7 +2333,7 @@
           <w:rFonts w:ascii="Aptos" w:hAnsi="Aptos" w:eastAsia="Microsoft YaHei"/>
           <w:b w:val="0"/>
           <w:color w:val="000000"/>
-          <w:sz w:val="18"/>
+          <w:sz w:val="21"/>
         </w:rPr>
         <w:t>编辑现有文档时，只修改用户授权的范围。不得为了统一样式而覆盖全文、重建整张表，或改动未授权的标题、固定说明、表头、颜色、列宽和合并关系。</w:t>
       </w:r>
@@ -2356,7 +2356,7 @@
           <w:rFonts w:ascii="Aptos" w:hAnsi="Aptos" w:eastAsia="Microsoft YaHei"/>
           <w:b w:val="0"/>
           <w:color w:val="000000"/>
-          <w:sz w:val="18"/>
+          <w:sz w:val="21"/>
         </w:rPr>
         <w:t>使用 Git 安装时，可以拉取仓库最新版本。</w:t>
       </w:r>
@@ -2401,7 +2401,7 @@
                 <w:rFonts w:ascii="Consolas" w:hAnsi="Consolas" w:eastAsia="Microsoft YaHei"/>
                 <w:b w:val="0"/>
                 <w:color w:val="000000"/>
-                <w:sz w:val="18"/>
+                <w:sz w:val="20"/>
               </w:rPr>
               <w:t>git -C ~/.codex/skills/codex-document-standard pull</w:t>
             </w:r>
@@ -2454,7 +2454,7 @@
                 <w:rFonts w:ascii="Consolas" w:hAnsi="Consolas" w:eastAsia="Microsoft YaHei"/>
                 <w:b w:val="0"/>
                 <w:color w:val="000000"/>
-                <w:sz w:val="18"/>
+                <w:sz w:val="20"/>
               </w:rPr>
               <w:t>git -C "$env:USERPROFILE\.codex\skills\codex-document-standard" pull</w:t>
             </w:r>
@@ -2485,7 +2485,7 @@
           <w:rFonts w:ascii="Aptos" w:hAnsi="Aptos" w:eastAsia="Microsoft YaHei"/>
           <w:b w:val="0"/>
           <w:color w:val="000000"/>
-          <w:sz w:val="18"/>
+          <w:sz w:val="21"/>
         </w:rPr>
         <w:t>需要改变品牌色、字体或业务字段时，修改 references/style-standard.md。建议保留以下约束：</w:t>
       </w:r>
@@ -2500,7 +2500,7 @@
           <w:rFonts w:ascii="Aptos" w:hAnsi="Aptos" w:eastAsia="Microsoft YaHei"/>
           <w:b w:val="0"/>
           <w:color w:val="000000"/>
-          <w:sz w:val="18"/>
+          <w:sz w:val="21"/>
         </w:rPr>
         <w:t>用户要求和公司模板优先。</w:t>
       </w:r>
@@ -2515,7 +2515,7 @@
           <w:rFonts w:ascii="Aptos" w:hAnsi="Aptos" w:eastAsia="Microsoft YaHei"/>
           <w:b w:val="0"/>
           <w:color w:val="000000"/>
-          <w:sz w:val="18"/>
+          <w:sz w:val="21"/>
         </w:rPr>
         <w:t>编辑现有文档时只修改授权范围。</w:t>
       </w:r>
@@ -2530,7 +2530,7 @@
           <w:rFonts w:ascii="Aptos" w:hAnsi="Aptos" w:eastAsia="Microsoft YaHei"/>
           <w:b w:val="0"/>
           <w:color w:val="000000"/>
-          <w:sz w:val="18"/>
+          <w:sz w:val="21"/>
         </w:rPr>
         <w:t>不伪造事实、数据、日期、责任人和链接。</w:t>
       </w:r>
@@ -2545,7 +2545,7 @@
           <w:rFonts w:ascii="Aptos" w:hAnsi="Aptos" w:eastAsia="Microsoft YaHei"/>
           <w:b w:val="0"/>
           <w:color w:val="000000"/>
-          <w:sz w:val="18"/>
+          <w:sz w:val="21"/>
         </w:rPr>
         <w:t>交付前检查实际渲染结果。</w:t>
       </w:r>
@@ -2677,7 +2677,7 @@
                 <w:rFonts w:ascii="Aptos" w:hAnsi="Aptos" w:eastAsia="Microsoft YaHei"/>
                 <w:b w:val="0"/>
                 <w:color w:val="000000"/>
-                <w:sz w:val="17"/>
+                <w:sz w:val="20"/>
               </w:rPr>
               <w:t>Codex 找不到 Skill</w:t>
             </w:r>
@@ -2712,7 +2712,7 @@
                 <w:rFonts w:ascii="Aptos" w:hAnsi="Aptos" w:eastAsia="Microsoft YaHei"/>
                 <w:b w:val="0"/>
                 <w:color w:val="000000"/>
-                <w:sz w:val="17"/>
+                <w:sz w:val="20"/>
               </w:rPr>
               <w:t>检查安装路径和文件夹嵌套层级，然后重新开始一轮对话。</w:t>
             </w:r>
@@ -2749,7 +2749,7 @@
                 <w:rFonts w:ascii="Aptos" w:hAnsi="Aptos" w:eastAsia="Microsoft YaHei"/>
                 <w:b w:val="0"/>
                 <w:color w:val="000000"/>
-                <w:sz w:val="17"/>
+                <w:sz w:val="20"/>
               </w:rPr>
               <w:t>已有公司模板</w:t>
             </w:r>
@@ -2784,7 +2784,7 @@
                 <w:rFonts w:ascii="Aptos" w:hAnsi="Aptos" w:eastAsia="Microsoft YaHei"/>
                 <w:b w:val="0"/>
                 <w:color w:val="000000"/>
-                <w:sz w:val="17"/>
+                <w:sz w:val="20"/>
               </w:rPr>
               <w:t>继续使用公司模板；本 Skill 只补充模板未规定的细节。</w:t>
             </w:r>
@@ -2821,7 +2821,7 @@
                 <w:rFonts w:ascii="Aptos" w:hAnsi="Aptos" w:eastAsia="Microsoft YaHei"/>
                 <w:b w:val="0"/>
                 <w:color w:val="000000"/>
-                <w:sz w:val="17"/>
+                <w:sz w:val="20"/>
               </w:rPr>
               <w:t>只想修改一个表格</w:t>
             </w:r>
@@ -2856,7 +2856,7 @@
                 <w:rFonts w:ascii="Aptos" w:hAnsi="Aptos" w:eastAsia="Microsoft YaHei"/>
                 <w:b w:val="0"/>
                 <w:color w:val="000000"/>
-                <w:sz w:val="17"/>
+                <w:sz w:val="20"/>
               </w:rPr>
               <w:t>明确指定修改范围，Codex 必须保留其他内容和样式。</w:t>
             </w:r>
@@ -2893,7 +2893,7 @@
                 <w:rFonts w:ascii="Aptos" w:hAnsi="Aptos" w:eastAsia="Microsoft YaHei"/>
                 <w:b w:val="0"/>
                 <w:color w:val="000000"/>
-                <w:sz w:val="17"/>
+                <w:sz w:val="20"/>
               </w:rPr>
               <w:t>需要更换品牌色</w:t>
             </w:r>
@@ -2928,7 +2928,7 @@
                 <w:rFonts w:ascii="Aptos" w:hAnsi="Aptos" w:eastAsia="Microsoft YaHei"/>
                 <w:b w:val="0"/>
                 <w:color w:val="000000"/>
-                <w:sz w:val="17"/>
+                <w:sz w:val="20"/>
               </w:rPr>
               <w:t>修改 style-standard.md 中的颜色定义，并保持全篇一致。</w:t>
             </w:r>
@@ -2965,7 +2965,7 @@
                 <w:rFonts w:ascii="Aptos" w:hAnsi="Aptos" w:eastAsia="Microsoft YaHei"/>
                 <w:b w:val="0"/>
                 <w:color w:val="000000"/>
-                <w:sz w:val="17"/>
+                <w:sz w:val="20"/>
               </w:rPr>
               <w:t>Git 更新失败</w:t>
             </w:r>
@@ -3000,7 +3000,7 @@
                 <w:rFonts w:ascii="Aptos" w:hAnsi="Aptos" w:eastAsia="Microsoft YaHei"/>
                 <w:b w:val="0"/>
                 <w:color w:val="000000"/>
-                <w:sz w:val="17"/>
+                <w:sz w:val="20"/>
               </w:rPr>
               <w:t>检查网络、仓库地址和 GitHub 权限；不要把凭据写入 Skill。</w:t>
             </w:r>
@@ -3031,7 +3031,7 @@
           <w:rFonts w:ascii="Aptos" w:hAnsi="Aptos" w:eastAsia="Microsoft YaHei"/>
           <w:b/>
           <w:color w:val="2F75B5"/>
-          <w:sz w:val="18"/>
+          <w:sz w:val="21"/>
         </w:rPr>
         <w:t>仓库地址：</w:t>
       </w:r>
@@ -3054,7 +3054,7 @@
           <w:rFonts w:ascii="Aptos" w:hAnsi="Aptos" w:eastAsia="Microsoft YaHei"/>
           <w:b w:val="0"/>
           <w:color w:val="000000"/>
-          <w:sz w:val="18"/>
+          <w:sz w:val="21"/>
         </w:rPr>
         <w:t>许可方式：MIT License。允许使用、复制、修改、合并、发布和分发，但需保留版权和许可声明。</w:t>
       </w:r>
@@ -3437,7 +3437,7 @@
     </w:pPr>
     <w:rPr>
       <w:rFonts w:ascii="Aptos" w:hAnsi="Aptos" w:eastAsia="Microsoft YaHei"/>
-      <w:sz w:val="18"/>
+      <w:sz w:val="21"/>
     </w:rPr>
   </w:style>
   <w:style w:type="paragraph" w:styleId="Header">

</xml_diff>

<commit_message>
Match heading colors to DingTalk
</commit_message>
<xml_diff>
--- a/docs/Codex-Document-Standard-使用教程.docx
+++ b/docs/Codex-Document-Standard-使用教程.docx
@@ -3502,7 +3502,7 @@
       <w:rFonts w:asciiTheme="majorHAnsi" w:eastAsiaTheme="majorEastAsia" w:hAnsiTheme="majorHAnsi" w:cstheme="majorBidi" w:ascii="Aptos Display" w:hAnsi="Aptos Display" w:eastAsia="Microsoft YaHei"/>
       <w:b/>
       <w:bCs/>
-      <w:color w:val="2F75B5"/>
+      <w:color w:val="000000"/>
       <w:sz w:val="28"/>
       <w:szCs w:val="28"/>
     </w:rPr>
@@ -3526,7 +3526,7 @@
       <w:rFonts w:asciiTheme="majorHAnsi" w:eastAsiaTheme="majorEastAsia" w:hAnsiTheme="majorHAnsi" w:cstheme="majorBidi" w:ascii="Aptos Display" w:hAnsi="Aptos Display" w:eastAsia="Microsoft YaHei"/>
       <w:b/>
       <w:bCs/>
-      <w:color w:val="2F75B5"/>
+      <w:color w:val="000000"/>
       <w:sz w:val="25"/>
       <w:szCs w:val="26"/>
     </w:rPr>
@@ -3550,7 +3550,7 @@
       <w:rFonts w:asciiTheme="majorHAnsi" w:eastAsiaTheme="majorEastAsia" w:hAnsiTheme="majorHAnsi" w:cstheme="majorBidi" w:ascii="Aptos Display" w:hAnsi="Aptos Display" w:eastAsia="Microsoft YaHei"/>
       <w:b/>
       <w:bCs/>
-      <w:color w:val="2F75B5"/>
+      <w:color w:val="000000"/>
       <w:sz w:val="23"/>
     </w:rPr>
   </w:style>
@@ -3791,7 +3791,7 @@
     <w:rPr>
       <w:rFonts w:asciiTheme="majorHAnsi" w:eastAsiaTheme="majorEastAsia" w:hAnsiTheme="majorHAnsi" w:cstheme="majorBidi" w:ascii="Aptos Display" w:hAnsi="Aptos Display" w:eastAsia="Microsoft YaHei"/>
       <w:b/>
-      <w:color w:val="2F75B5"/>
+      <w:color w:val="000000"/>
       <w:spacing w:val="5"/>
       <w:kern w:val="28"/>
       <w:sz w:val="36"/>

</xml_diff>

<commit_message>
Use reference purple for section headings
</commit_message>
<xml_diff>
--- a/docs/Codex-Document-Standard-使用教程.docx
+++ b/docs/Codex-Document-Standard-使用教程.docx
@@ -3502,7 +3502,7 @@
       <w:rFonts w:asciiTheme="majorHAnsi" w:eastAsiaTheme="majorEastAsia" w:hAnsiTheme="majorHAnsi" w:cstheme="majorBidi" w:ascii="Aptos Display" w:hAnsi="Aptos Display" w:eastAsia="Microsoft YaHei"/>
       <w:b/>
       <w:bCs/>
-      <w:color w:val="000000"/>
+      <w:color w:val="9655D8"/>
       <w:sz w:val="28"/>
       <w:szCs w:val="28"/>
     </w:rPr>
@@ -3526,7 +3526,7 @@
       <w:rFonts w:asciiTheme="majorHAnsi" w:eastAsiaTheme="majorEastAsia" w:hAnsiTheme="majorHAnsi" w:cstheme="majorBidi" w:ascii="Aptos Display" w:hAnsi="Aptos Display" w:eastAsia="Microsoft YaHei"/>
       <w:b/>
       <w:bCs/>
-      <w:color w:val="000000"/>
+      <w:color w:val="9655D8"/>
       <w:sz w:val="25"/>
       <w:szCs w:val="26"/>
     </w:rPr>
@@ -3550,7 +3550,7 @@
       <w:rFonts w:asciiTheme="majorHAnsi" w:eastAsiaTheme="majorEastAsia" w:hAnsiTheme="majorHAnsi" w:cstheme="majorBidi" w:ascii="Aptos Display" w:hAnsi="Aptos Display" w:eastAsia="Microsoft YaHei"/>
       <w:b/>
       <w:bCs/>
-      <w:color w:val="000000"/>
+      <w:color w:val="9655D8"/>
       <w:sz w:val="23"/>
     </w:rPr>
   </w:style>
@@ -3791,7 +3791,7 @@
     <w:rPr>
       <w:rFonts w:asciiTheme="majorHAnsi" w:eastAsiaTheme="majorEastAsia" w:hAnsiTheme="majorHAnsi" w:cstheme="majorBidi" w:ascii="Aptos Display" w:hAnsi="Aptos Display" w:eastAsia="Microsoft YaHei"/>
       <w:b/>
-      <w:color w:val="000000"/>
+      <w:color w:val="2F75B5"/>
       <w:spacing w:val="5"/>
       <w:kern w:val="28"/>
       <w:sz w:val="36"/>

</xml_diff>

<commit_message>
Preserve heading styles in DingTalk
</commit_message>
<xml_diff>
--- a/docs/Codex-Document-Standard-使用教程.docx
+++ b/docs/Codex-Document-Standard-使用教程.docx
@@ -3502,7 +3502,7 @@
       <w:rFonts w:asciiTheme="majorHAnsi" w:eastAsiaTheme="majorEastAsia" w:hAnsiTheme="majorHAnsi" w:cstheme="majorBidi" w:ascii="Aptos Display" w:hAnsi="Aptos Display" w:eastAsia="Microsoft YaHei"/>
       <w:b/>
       <w:bCs/>
-      <w:color w:val="9655D8"/>
+      <w:color w:val="2F75B5"/>
       <w:sz w:val="28"/>
       <w:szCs w:val="28"/>
     </w:rPr>
@@ -3526,7 +3526,7 @@
       <w:rFonts w:asciiTheme="majorHAnsi" w:eastAsiaTheme="majorEastAsia" w:hAnsiTheme="majorHAnsi" w:cstheme="majorBidi" w:ascii="Aptos Display" w:hAnsi="Aptos Display" w:eastAsia="Microsoft YaHei"/>
       <w:b/>
       <w:bCs/>
-      <w:color w:val="9655D8"/>
+      <w:color w:val="2F75B5"/>
       <w:sz w:val="25"/>
       <w:szCs w:val="26"/>
     </w:rPr>
@@ -3550,7 +3550,7 @@
       <w:rFonts w:asciiTheme="majorHAnsi" w:eastAsiaTheme="majorEastAsia" w:hAnsiTheme="majorHAnsi" w:cstheme="majorBidi" w:ascii="Aptos Display" w:hAnsi="Aptos Display" w:eastAsia="Microsoft YaHei"/>
       <w:b/>
       <w:bCs/>
-      <w:color w:val="9655D8"/>
+      <w:color w:val="2F75B5"/>
       <w:sz w:val="23"/>
     </w:rPr>
   </w:style>

</xml_diff>

<commit_message>
Normalize DingTalk spacing and blank blocks
</commit_message>
<xml_diff>
--- a/docs/Codex-Document-Standard-使用教程.docx
+++ b/docs/Codex-Document-Standard-使用教程.docx
@@ -96,11 +96,6 @@
         </w:tc>
       </w:tr>
     </w:tbl>
-    <w:p>
-      <w:pPr>
-        <w:spacing w:after="0"/>
-      </w:pPr>
-    </w:p>
     <w:p>
       <w:pPr>
         <w:pStyle w:val="Heading1"/>
@@ -680,11 +675,6 @@
     </w:tbl>
     <w:p>
       <w:pPr>
-        <w:spacing w:after="0"/>
-      </w:pPr>
-    </w:p>
-    <w:p>
-      <w:pPr>
         <w:spacing w:line="288" w:lineRule="auto" w:before="40" w:after="80"/>
       </w:pPr>
       <w:r>
@@ -885,11 +875,6 @@
     </w:tbl>
     <w:p>
       <w:pPr>
-        <w:spacing w:after="0"/>
-      </w:pPr>
-    </w:p>
-    <w:p>
-      <w:pPr>
         <w:pStyle w:val="Heading1"/>
         <w:keepNext/>
       </w:pPr>
@@ -985,11 +970,6 @@
     </w:tbl>
     <w:p>
       <w:pPr>
-        <w:spacing w:after="0"/>
-      </w:pPr>
-    </w:p>
-    <w:p>
-      <w:pPr>
         <w:spacing w:line="288" w:lineRule="auto" w:before="40" w:after="80"/>
       </w:pPr>
       <w:r>
@@ -1061,11 +1041,6 @@
     </w:tbl>
     <w:p>
       <w:pPr>
-        <w:spacing w:after="0"/>
-      </w:pPr>
-    </w:p>
-    <w:p>
-      <w:pPr>
         <w:pStyle w:val="Heading3"/>
         <w:keepNext/>
       </w:pPr>
@@ -1124,11 +1099,6 @@
         </w:tc>
       </w:tr>
     </w:tbl>
-    <w:p>
-      <w:pPr>
-        <w:spacing w:after="0"/>
-      </w:pPr>
-    </w:p>
     <w:p>
       <w:pPr>
         <w:pStyle w:val="Heading2"/>
@@ -1277,11 +1247,6 @@
     </w:tbl>
     <w:p>
       <w:pPr>
-        <w:spacing w:after="0"/>
-      </w:pPr>
-    </w:p>
-    <w:p>
-      <w:pPr>
         <w:spacing w:line="288" w:lineRule="auto" w:before="40" w:after="80"/>
       </w:pPr>
       <w:r>
@@ -1419,11 +1384,6 @@
     </w:tbl>
     <w:p>
       <w:pPr>
-        <w:spacing w:after="0"/>
-      </w:pPr>
-    </w:p>
-    <w:p>
-      <w:pPr>
         <w:pStyle w:val="Heading1"/>
         <w:keepNext/>
       </w:pPr>
@@ -1493,11 +1453,6 @@
         </w:tc>
       </w:tr>
     </w:tbl>
-    <w:p>
-      <w:pPr>
-        <w:spacing w:after="0"/>
-      </w:pPr>
-    </w:p>
     <w:p>
       <w:pPr>
         <w:pStyle w:val="Heading2"/>
@@ -1572,11 +1527,6 @@
         </w:tc>
       </w:tr>
     </w:tbl>
-    <w:p>
-      <w:pPr>
-        <w:spacing w:after="0"/>
-      </w:pPr>
-    </w:p>
     <w:p>
       <w:pPr>
         <w:pStyle w:val="Heading1"/>
@@ -2253,11 +2203,6 @@
     </w:tbl>
     <w:p>
       <w:pPr>
-        <w:spacing w:after="0"/>
-      </w:pPr>
-    </w:p>
-    <w:p>
-      <w:pPr>
         <w:pStyle w:val="Heading1"/>
         <w:keepNext/>
       </w:pPr>
@@ -2411,11 +2356,6 @@
     </w:tbl>
     <w:p>
       <w:pPr>
-        <w:spacing w:after="0"/>
-      </w:pPr>
-    </w:p>
-    <w:p>
-      <w:pPr>
         <w:pStyle w:val="Heading2"/>
         <w:keepNext/>
       </w:pPr>
@@ -2462,11 +2402,6 @@
         </w:tc>
       </w:tr>
     </w:tbl>
-    <w:p>
-      <w:pPr>
-        <w:spacing w:after="0"/>
-      </w:pPr>
-    </w:p>
     <w:p>
       <w:pPr>
         <w:pStyle w:val="Heading1"/>
@@ -3010,11 +2945,6 @@
     </w:tbl>
     <w:p>
       <w:pPr>
-        <w:spacing w:after="0"/>
-      </w:pPr>
-    </w:p>
-    <w:p>
-      <w:pPr>
         <w:pStyle w:val="Heading1"/>
         <w:keepNext/>
       </w:pPr>

</xml_diff>

<commit_message>
Match local table text to body size
</commit_message>
<xml_diff>
--- a/docs/Codex-Document-Standard-使用教程.docx
+++ b/docs/Codex-Document-Standard-使用教程.docx
@@ -165,7 +165,7 @@
                 <w:rFonts w:ascii="Aptos" w:hAnsi="Aptos" w:eastAsia="Microsoft YaHei"/>
                 <w:b/>
                 <w:color w:val="FFFFFF"/>
-                <w:sz w:val="20"/>
+                <w:sz w:val="21"/>
               </w:rPr>
               <w:t>适用</w:t>
             </w:r>
@@ -201,7 +201,7 @@
                 <w:rFonts w:ascii="Aptos" w:hAnsi="Aptos" w:eastAsia="Microsoft YaHei"/>
                 <w:b/>
                 <w:color w:val="FFFFFF"/>
-                <w:sz w:val="20"/>
+                <w:sz w:val="21"/>
               </w:rPr>
               <w:t>典型内容</w:t>
             </w:r>
@@ -237,7 +237,7 @@
                 <w:rFonts w:ascii="Aptos" w:hAnsi="Aptos" w:eastAsia="Microsoft YaHei"/>
                 <w:b/>
                 <w:color w:val="FFFFFF"/>
-                <w:sz w:val="20"/>
+                <w:sz w:val="21"/>
               </w:rPr>
               <w:t>默认行为</w:t>
             </w:r>
@@ -274,7 +274,7 @@
                 <w:rFonts w:ascii="Aptos" w:hAnsi="Aptos" w:eastAsia="Microsoft YaHei"/>
                 <w:b w:val="0"/>
                 <w:color w:val="000000"/>
-                <w:sz w:val="20"/>
+                <w:sz w:val="21"/>
               </w:rPr>
               <w:t>工作报告</w:t>
             </w:r>
@@ -309,7 +309,7 @@
                 <w:rFonts w:ascii="Aptos" w:hAnsi="Aptos" w:eastAsia="Microsoft YaHei"/>
                 <w:b w:val="0"/>
                 <w:color w:val="000000"/>
-                <w:sz w:val="20"/>
+                <w:sz w:val="21"/>
               </w:rPr>
               <w:t>周报  月报  季度复盘  项目总结</w:t>
             </w:r>
@@ -344,7 +344,7 @@
                 <w:rFonts w:ascii="Aptos" w:hAnsi="Aptos" w:eastAsia="Microsoft YaHei"/>
                 <w:b w:val="0"/>
                 <w:color w:val="000000"/>
-                <w:sz w:val="20"/>
+                <w:sz w:val="21"/>
               </w:rPr>
               <w:t>统一标题层级和正文排版</w:t>
             </w:r>
@@ -381,7 +381,7 @@
                 <w:rFonts w:ascii="Aptos" w:hAnsi="Aptos" w:eastAsia="Microsoft YaHei"/>
                 <w:b w:val="0"/>
                 <w:color w:val="000000"/>
-                <w:sz w:val="20"/>
+                <w:sz w:val="21"/>
               </w:rPr>
               <w:t>计划与方案</w:t>
             </w:r>
@@ -416,7 +416,7 @@
                 <w:rFonts w:ascii="Aptos" w:hAnsi="Aptos" w:eastAsia="Microsoft YaHei"/>
                 <w:b w:val="0"/>
                 <w:color w:val="000000"/>
-                <w:sz w:val="20"/>
+                <w:sz w:val="21"/>
               </w:rPr>
               <w:t>项目计划  执行方案  制度说明</w:t>
             </w:r>
@@ -451,7 +451,7 @@
                 <w:rFonts w:ascii="Aptos" w:hAnsi="Aptos" w:eastAsia="Microsoft YaHei"/>
                 <w:b w:val="0"/>
                 <w:color w:val="000000"/>
-                <w:sz w:val="20"/>
+                <w:sz w:val="21"/>
               </w:rPr>
               <w:t>突出结论  范围  风险和动作</w:t>
             </w:r>
@@ -488,7 +488,7 @@
                 <w:rFonts w:ascii="Aptos" w:hAnsi="Aptos" w:eastAsia="Microsoft YaHei"/>
                 <w:b w:val="0"/>
                 <w:color w:val="000000"/>
-                <w:sz w:val="20"/>
+                <w:sz w:val="21"/>
               </w:rPr>
               <w:t>会议文档</w:t>
             </w:r>
@@ -523,7 +523,7 @@
                 <w:rFonts w:ascii="Aptos" w:hAnsi="Aptos" w:eastAsia="Microsoft YaHei"/>
                 <w:b w:val="0"/>
                 <w:color w:val="000000"/>
-                <w:sz w:val="20"/>
+                <w:sz w:val="21"/>
               </w:rPr>
               <w:t>会议纪要  评审记录  跟进清单</w:t>
             </w:r>
@@ -558,7 +558,7 @@
                 <w:rFonts w:ascii="Aptos" w:hAnsi="Aptos" w:eastAsia="Microsoft YaHei"/>
                 <w:b w:val="0"/>
                 <w:color w:val="000000"/>
-                <w:sz w:val="20"/>
+                <w:sz w:val="21"/>
               </w:rPr>
               <w:t>统一表格  日期  状态和责任信息</w:t>
             </w:r>
@@ -595,7 +595,7 @@
                 <w:rFonts w:ascii="Aptos" w:hAnsi="Aptos" w:eastAsia="Microsoft YaHei"/>
                 <w:b w:val="0"/>
                 <w:color w:val="000000"/>
-                <w:sz w:val="20"/>
+                <w:sz w:val="21"/>
               </w:rPr>
               <w:t>钉钉文档</w:t>
             </w:r>
@@ -630,7 +630,7 @@
                 <w:rFonts w:ascii="Aptos" w:hAnsi="Aptos" w:eastAsia="Microsoft YaHei"/>
                 <w:b w:val="0"/>
                 <w:color w:val="000000"/>
-                <w:sz w:val="20"/>
+                <w:sz w:val="21"/>
               </w:rPr>
               <w:t>工作文档和文档表格</w:t>
             </w:r>
@@ -665,7 +665,7 @@
                 <w:rFonts w:ascii="Aptos" w:hAnsi="Aptos" w:eastAsia="Microsoft YaHei"/>
                 <w:b w:val="0"/>
                 <w:color w:val="000000"/>
-                <w:sz w:val="20"/>
+                <w:sz w:val="21"/>
               </w:rPr>
               <w:t>按平台能力应用同一视觉语言</w:t>
             </w:r>
@@ -1581,7 +1581,7 @@
                 <w:rFonts w:ascii="Aptos" w:hAnsi="Aptos" w:eastAsia="Microsoft YaHei"/>
                 <w:b/>
                 <w:color w:val="FFFFFF"/>
-                <w:sz w:val="20"/>
+                <w:sz w:val="21"/>
               </w:rPr>
               <w:t>项目</w:t>
             </w:r>
@@ -1617,7 +1617,7 @@
                 <w:rFonts w:ascii="Aptos" w:hAnsi="Aptos" w:eastAsia="Microsoft YaHei"/>
                 <w:b/>
                 <w:color w:val="FFFFFF"/>
-                <w:sz w:val="20"/>
+                <w:sz w:val="21"/>
               </w:rPr>
               <w:t>默认规范</w:t>
             </w:r>
@@ -1654,7 +1654,7 @@
                 <w:rFonts w:ascii="Aptos" w:hAnsi="Aptos" w:eastAsia="Microsoft YaHei"/>
                 <w:b w:val="0"/>
                 <w:color w:val="000000"/>
-                <w:sz w:val="20"/>
+                <w:sz w:val="21"/>
               </w:rPr>
               <w:t>视觉基调</w:t>
             </w:r>
@@ -1689,7 +1689,7 @@
                 <w:rFonts w:ascii="Aptos" w:hAnsi="Aptos" w:eastAsia="Microsoft YaHei"/>
                 <w:b w:val="0"/>
                 <w:color w:val="000000"/>
-                <w:sz w:val="20"/>
+                <w:sz w:val="21"/>
               </w:rPr>
               <w:t>专业  克制  清晰  白色页面背景</w:t>
             </w:r>
@@ -1726,7 +1726,7 @@
                 <w:rFonts w:ascii="Aptos" w:hAnsi="Aptos" w:eastAsia="Microsoft YaHei"/>
                 <w:b w:val="0"/>
                 <w:color w:val="000000"/>
-                <w:sz w:val="20"/>
+                <w:sz w:val="21"/>
               </w:rPr>
               <w:t>主色</w:t>
             </w:r>
@@ -1761,7 +1761,7 @@
                 <w:rFonts w:ascii="Aptos" w:hAnsi="Aptos" w:eastAsia="Microsoft YaHei"/>
                 <w:b w:val="0"/>
                 <w:color w:val="000000"/>
-                <w:sz w:val="20"/>
+                <w:sz w:val="21"/>
               </w:rPr>
               <w:t>#2F75B5</w:t>
             </w:r>
@@ -1798,7 +1798,7 @@
                 <w:rFonts w:ascii="Aptos" w:hAnsi="Aptos" w:eastAsia="Microsoft YaHei"/>
                 <w:b w:val="0"/>
                 <w:color w:val="000000"/>
-                <w:sz w:val="20"/>
+                <w:sz w:val="21"/>
               </w:rPr>
               <w:t>表头</w:t>
             </w:r>
@@ -1833,9 +1833,9 @@
                 <w:rFonts w:ascii="Aptos" w:hAnsi="Aptos" w:eastAsia="Microsoft YaHei"/>
                 <w:b w:val="0"/>
                 <w:color w:val="000000"/>
-                <w:sz w:val="20"/>
+                <w:sz w:val="21"/>
               </w:rPr>
-              <w:t>#005D8D 背景  白色  10 pt  加粗</w:t>
+              <w:t>#005D8D 背景  白色  本地 10.5 pt  钉钉 10 pt  加粗</w:t>
             </w:r>
           </w:p>
         </w:tc>
@@ -1870,7 +1870,7 @@
                 <w:rFonts w:ascii="Aptos" w:hAnsi="Aptos" w:eastAsia="Microsoft YaHei"/>
                 <w:b w:val="0"/>
                 <w:color w:val="000000"/>
-                <w:sz w:val="20"/>
+                <w:sz w:val="21"/>
               </w:rPr>
               <w:t>正文</w:t>
             </w:r>
@@ -1905,7 +1905,7 @@
                 <w:rFonts w:ascii="Aptos" w:hAnsi="Aptos" w:eastAsia="Microsoft YaHei"/>
                 <w:b w:val="0"/>
                 <w:color w:val="000000"/>
-                <w:sz w:val="20"/>
+                <w:sz w:val="21"/>
               </w:rPr>
               <w:t>10.5 pt  左对齐  1.2 行距  段前 2  段后 4</w:t>
             </w:r>
@@ -1942,7 +1942,7 @@
                 <w:rFonts w:ascii="Aptos" w:hAnsi="Aptos" w:eastAsia="Microsoft YaHei"/>
                 <w:b w:val="0"/>
                 <w:color w:val="000000"/>
-                <w:sz w:val="20"/>
+                <w:sz w:val="21"/>
               </w:rPr>
               <w:t>说明块</w:t>
             </w:r>
@@ -1977,7 +1977,7 @@
                 <w:rFonts w:ascii="Aptos" w:hAnsi="Aptos" w:eastAsia="Microsoft YaHei"/>
                 <w:b w:val="0"/>
                 <w:color w:val="000000"/>
-                <w:sz w:val="20"/>
+                <w:sz w:val="21"/>
               </w:rPr>
               <w:t>#EEF5F8 背景  无外边框  10 pt</w:t>
             </w:r>
@@ -2014,7 +2014,7 @@
                 <w:rFonts w:ascii="Aptos" w:hAnsi="Aptos" w:eastAsia="Microsoft YaHei"/>
                 <w:b w:val="0"/>
                 <w:color w:val="000000"/>
-                <w:sz w:val="20"/>
+                <w:sz w:val="21"/>
               </w:rPr>
               <w:t>表格对齐</w:t>
             </w:r>
@@ -2049,7 +2049,7 @@
                 <w:rFonts w:ascii="Aptos" w:hAnsi="Aptos" w:eastAsia="Microsoft YaHei"/>
                 <w:b w:val="0"/>
                 <w:color w:val="000000"/>
-                <w:sz w:val="20"/>
+                <w:sz w:val="21"/>
               </w:rPr>
               <w:t>文字左对齐  数字右对齐  日期状态序号居中</w:t>
             </w:r>
@@ -2086,7 +2086,7 @@
                 <w:rFonts w:ascii="Aptos" w:hAnsi="Aptos" w:eastAsia="Microsoft YaHei"/>
                 <w:b w:val="0"/>
                 <w:color w:val="000000"/>
-                <w:sz w:val="20"/>
+                <w:sz w:val="21"/>
               </w:rPr>
               <w:t>空值与日期</w:t>
             </w:r>
@@ -2121,7 +2121,7 @@
                 <w:rFonts w:ascii="Aptos" w:hAnsi="Aptos" w:eastAsia="Microsoft YaHei"/>
                 <w:b w:val="0"/>
                 <w:color w:val="000000"/>
-                <w:sz w:val="20"/>
+                <w:sz w:val="21"/>
               </w:rPr>
               <w:t>空值使用 —  日期使用 YYYY-MM-DD</w:t>
             </w:r>
@@ -2158,7 +2158,7 @@
                 <w:rFonts w:ascii="Aptos" w:hAnsi="Aptos" w:eastAsia="Microsoft YaHei"/>
                 <w:b w:val="0"/>
                 <w:color w:val="000000"/>
-                <w:sz w:val="20"/>
+                <w:sz w:val="21"/>
               </w:rPr>
               <w:t>内容表达</w:t>
             </w:r>
@@ -2193,7 +2193,7 @@
                 <w:rFonts w:ascii="Aptos" w:hAnsi="Aptos" w:eastAsia="Microsoft YaHei"/>
                 <w:b w:val="0"/>
                 <w:color w:val="000000"/>
-                <w:sz w:val="20"/>
+                <w:sz w:val="21"/>
               </w:rPr>
               <w:t>结论先行  事实可验证  链接真实可访问</w:t>
             </w:r>
@@ -2539,7 +2539,7 @@
                 <w:rFonts w:ascii="Aptos" w:hAnsi="Aptos" w:eastAsia="Microsoft YaHei"/>
                 <w:b/>
                 <w:color w:val="FFFFFF"/>
-                <w:sz w:val="20"/>
+                <w:sz w:val="21"/>
               </w:rPr>
               <w:t>问题</w:t>
             </w:r>
@@ -2575,7 +2575,7 @@
                 <w:rFonts w:ascii="Aptos" w:hAnsi="Aptos" w:eastAsia="Microsoft YaHei"/>
                 <w:b/>
                 <w:color w:val="FFFFFF"/>
-                <w:sz w:val="20"/>
+                <w:sz w:val="21"/>
               </w:rPr>
               <w:t>处理方法</w:t>
             </w:r>
@@ -2612,7 +2612,7 @@
                 <w:rFonts w:ascii="Aptos" w:hAnsi="Aptos" w:eastAsia="Microsoft YaHei"/>
                 <w:b w:val="0"/>
                 <w:color w:val="000000"/>
-                <w:sz w:val="20"/>
+                <w:sz w:val="21"/>
               </w:rPr>
               <w:t>Codex 找不到 Skill</w:t>
             </w:r>
@@ -2647,7 +2647,7 @@
                 <w:rFonts w:ascii="Aptos" w:hAnsi="Aptos" w:eastAsia="Microsoft YaHei"/>
                 <w:b w:val="0"/>
                 <w:color w:val="000000"/>
-                <w:sz w:val="20"/>
+                <w:sz w:val="21"/>
               </w:rPr>
               <w:t>检查安装路径和文件夹嵌套层级，然后重新开始一轮对话。</w:t>
             </w:r>
@@ -2684,7 +2684,7 @@
                 <w:rFonts w:ascii="Aptos" w:hAnsi="Aptos" w:eastAsia="Microsoft YaHei"/>
                 <w:b w:val="0"/>
                 <w:color w:val="000000"/>
-                <w:sz w:val="20"/>
+                <w:sz w:val="21"/>
               </w:rPr>
               <w:t>已有公司模板</w:t>
             </w:r>
@@ -2719,7 +2719,7 @@
                 <w:rFonts w:ascii="Aptos" w:hAnsi="Aptos" w:eastAsia="Microsoft YaHei"/>
                 <w:b w:val="0"/>
                 <w:color w:val="000000"/>
-                <w:sz w:val="20"/>
+                <w:sz w:val="21"/>
               </w:rPr>
               <w:t>继续使用公司模板；本 Skill 只补充模板未规定的细节。</w:t>
             </w:r>
@@ -2756,7 +2756,7 @@
                 <w:rFonts w:ascii="Aptos" w:hAnsi="Aptos" w:eastAsia="Microsoft YaHei"/>
                 <w:b w:val="0"/>
                 <w:color w:val="000000"/>
-                <w:sz w:val="20"/>
+                <w:sz w:val="21"/>
               </w:rPr>
               <w:t>只想修改一个表格</w:t>
             </w:r>
@@ -2791,7 +2791,7 @@
                 <w:rFonts w:ascii="Aptos" w:hAnsi="Aptos" w:eastAsia="Microsoft YaHei"/>
                 <w:b w:val="0"/>
                 <w:color w:val="000000"/>
-                <w:sz w:val="20"/>
+                <w:sz w:val="21"/>
               </w:rPr>
               <w:t>明确指定修改范围，Codex 必须保留其他内容和样式。</w:t>
             </w:r>
@@ -2828,7 +2828,7 @@
                 <w:rFonts w:ascii="Aptos" w:hAnsi="Aptos" w:eastAsia="Microsoft YaHei"/>
                 <w:b w:val="0"/>
                 <w:color w:val="000000"/>
-                <w:sz w:val="20"/>
+                <w:sz w:val="21"/>
               </w:rPr>
               <w:t>需要更换品牌色</w:t>
             </w:r>
@@ -2863,7 +2863,7 @@
                 <w:rFonts w:ascii="Aptos" w:hAnsi="Aptos" w:eastAsia="Microsoft YaHei"/>
                 <w:b w:val="0"/>
                 <w:color w:val="000000"/>
-                <w:sz w:val="20"/>
+                <w:sz w:val="21"/>
               </w:rPr>
               <w:t>修改 style-standard.md 中的颜色定义，并保持全篇一致。</w:t>
             </w:r>
@@ -2900,7 +2900,7 @@
                 <w:rFonts w:ascii="Aptos" w:hAnsi="Aptos" w:eastAsia="Microsoft YaHei"/>
                 <w:b w:val="0"/>
                 <w:color w:val="000000"/>
-                <w:sz w:val="20"/>
+                <w:sz w:val="21"/>
               </w:rPr>
               <w:t>Git 更新失败</w:t>
             </w:r>
@@ -2935,7 +2935,7 @@
                 <w:rFonts w:ascii="Aptos" w:hAnsi="Aptos" w:eastAsia="Microsoft YaHei"/>
                 <w:b w:val="0"/>
                 <w:color w:val="000000"/>
-                <w:sz w:val="20"/>
+                <w:sz w:val="21"/>
               </w:rPr>
               <w:t>检查网络、仓库地址和 GitHub 权限；不要把凭据写入 Skill。</w:t>
             </w:r>

</xml_diff>